<commit_message>
docs(user-guide): §6.8 case study + §6.6 KPI selection discipline
§6.8 Case Study — 5AxisGlueSpraying.fbx 完整 baseline
* 6.8.1 原檔病理 (diagnose 報告解讀)
  - 22552 islands vs 75327 face = avg 3.3 face/island
  - 115935 boundary edges ≈ unique edges 總數
  - vert/face = 1.52 vs watertight 預期 ~0.5 (重複頂點)
  - DIAMesh stage 對應病理映射表
* 6.8.2 三檔 LOD 後 diagnose 對比 (含 ratio 達不到目標的設計取捨解讀)
* 6.8.3 三檔 LOD vs 原檔 deviation 對比
* 6.8.4 五個 quantitative insight
* 6.8.5 從直覺到證據的方法論 — 9 組視覺實驗 → 量化 baseline

§6.6 加 KPI 選用紀律段落
* Hausdorff (max) — 反映 cull, NOT LOD quality
* Chamfer — 對 fill 補多少敏感, 不單調
* Volume — non-watertight 是 NaN
* Mean normal deviation — 唯一可信 KPI, 完美線性

PDF/DOCX 三格式同步。所有數字來自 5AxisGlueSpraying.fbx 的真實
diamesh diagnose + diamesh diff 輸出，可重現。

Co-Authored-By: Claude Opus 4.7 (1M context) <noreply@anthropic.com>
</commit_message>
<xml_diff>
--- a/docs/USER_GUIDE.docx
+++ b/docs/USER_GUIDE.docx
@@ -7030,6 +7030,481 @@
     </w:p>
     <w:p>
       <w:pPr>
+        <w:pStyle w:val="Heading3"/>
+      </w:pPr>
+      <w:r>
+        <w:t>KPI 選用紀律 — 衡量 LOD 質量該看哪個指標</w:t>
+      </w:r>
+    </w:p>
+    <w:p>
+      <w:r>
+        <w:rPr>
+          <w:rFonts w:ascii="Consolas" w:hAnsi="Consolas"/>
+          <w:color w:val="C7254E"/>
+          <w:sz w:val="20"/>
+        </w:rPr>
+        <w:t>diamesh diff</w:t>
+      </w:r>
+      <w:r>
+        <w:t xml:space="preserve"> 報告四個距離指標：Hausdorff (max + 雙向)、Chamfer、Volume diff、Mean normal deviation。</w:t>
+      </w:r>
+      <w:r>
+        <w:rPr>
+          <w:b/>
+        </w:rPr>
+        <w:t>並非每個都適合用來比 LOD 質量</w:t>
+      </w:r>
+      <w:r>
+        <w:t>：</w:t>
+      </w:r>
+    </w:p>
+    <w:tbl>
+      <w:tblPr>
+        <w:tblStyle w:val="TableGrid"/>
+        <w:tblW w:type="auto" w:w="0"/>
+        <w:jc w:val="left"/>
+        <w:tblLook w:firstColumn="1" w:firstRow="1" w:lastColumn="0" w:lastRow="0" w:noHBand="0" w:noVBand="1" w:val="04A0"/>
+      </w:tblPr>
+      <w:tblGrid>
+        <w:gridCol w:w="3213"/>
+        <w:gridCol w:w="3213"/>
+        <w:gridCol w:w="3213"/>
+      </w:tblGrid>
+      <w:tr>
+        <w:tc>
+          <w:tcPr>
+            <w:tcW w:type="dxa" w:w="3213"/>
+            <w:tcBorders>
+              <w:top w:val="single" w:sz="4" w:color="BFBFBF"/>
+              <w:left w:val="single" w:sz="4" w:color="BFBFBF"/>
+              <w:bottom w:val="single" w:sz="4" w:color="BFBFBF"/>
+              <w:right w:val="single" w:sz="4" w:color="BFBFBF"/>
+              <w:insideH w:val="single" w:sz="4" w:color="BFBFBF"/>
+              <w:insideV w:val="single" w:sz="4" w:color="BFBFBF"/>
+            </w:tcBorders>
+            <w:shd w:val="clear" w:color="auto" w:fill="F6F8FA"/>
+          </w:tcPr>
+          <w:p>
+            <w:r>
+              <w:rPr>
+                <w:b/>
+              </w:rPr>
+            </w:r>
+            <w:r>
+              <w:rPr>
+                <w:b/>
+              </w:rPr>
+              <w:t>指標</w:t>
+            </w:r>
+          </w:p>
+        </w:tc>
+        <w:tc>
+          <w:tcPr>
+            <w:tcW w:type="dxa" w:w="3213"/>
+            <w:tcBorders>
+              <w:top w:val="single" w:sz="4" w:color="BFBFBF"/>
+              <w:left w:val="single" w:sz="4" w:color="BFBFBF"/>
+              <w:bottom w:val="single" w:sz="4" w:color="BFBFBF"/>
+              <w:right w:val="single" w:sz="4" w:color="BFBFBF"/>
+              <w:insideH w:val="single" w:sz="4" w:color="BFBFBF"/>
+              <w:insideV w:val="single" w:sz="4" w:color="BFBFBF"/>
+            </w:tcBorders>
+            <w:shd w:val="clear" w:color="auto" w:fill="F6F8FA"/>
+          </w:tcPr>
+          <w:p>
+            <w:r>
+              <w:rPr>
+                <w:b/>
+              </w:rPr>
+            </w:r>
+            <w:r>
+              <w:rPr>
+                <w:b/>
+              </w:rPr>
+              <w:t>反映什麼</w:t>
+            </w:r>
+          </w:p>
+        </w:tc>
+        <w:tc>
+          <w:tcPr>
+            <w:tcW w:type="dxa" w:w="3213"/>
+            <w:tcBorders>
+              <w:top w:val="single" w:sz="4" w:color="BFBFBF"/>
+              <w:left w:val="single" w:sz="4" w:color="BFBFBF"/>
+              <w:bottom w:val="single" w:sz="4" w:color="BFBFBF"/>
+              <w:right w:val="single" w:sz="4" w:color="BFBFBF"/>
+              <w:insideH w:val="single" w:sz="4" w:color="BFBFBF"/>
+              <w:insideV w:val="single" w:sz="4" w:color="BFBFBF"/>
+            </w:tcBorders>
+            <w:shd w:val="clear" w:color="auto" w:fill="F6F8FA"/>
+          </w:tcPr>
+          <w:p>
+            <w:r>
+              <w:rPr>
+                <w:b/>
+              </w:rPr>
+            </w:r>
+            <w:r>
+              <w:rPr>
+                <w:b/>
+              </w:rPr>
+              <w:t>用來比 LOD 質量？</w:t>
+            </w:r>
+          </w:p>
+        </w:tc>
+      </w:tr>
+      <w:tr>
+        <w:tc>
+          <w:tcPr>
+            <w:tcW w:type="dxa" w:w="3213"/>
+            <w:tcBorders>
+              <w:top w:val="single" w:sz="4" w:color="BFBFBF"/>
+              <w:left w:val="single" w:sz="4" w:color="BFBFBF"/>
+              <w:bottom w:val="single" w:sz="4" w:color="BFBFBF"/>
+              <w:right w:val="single" w:sz="4" w:color="BFBFBF"/>
+              <w:insideH w:val="single" w:sz="4" w:color="BFBFBF"/>
+              <w:insideV w:val="single" w:sz="4" w:color="BFBFBF"/>
+            </w:tcBorders>
+          </w:tcPr>
+          <w:p>
+            <w:r/>
+            <w:r>
+              <w:rPr>
+                <w:b/>
+              </w:rPr>
+              <w:t>Hausdorff (max)</w:t>
+            </w:r>
+          </w:p>
+        </w:tc>
+        <w:tc>
+          <w:tcPr>
+            <w:tcW w:type="dxa" w:w="3213"/>
+            <w:tcBorders>
+              <w:top w:val="single" w:sz="4" w:color="BFBFBF"/>
+              <w:left w:val="single" w:sz="4" w:color="BFBFBF"/>
+              <w:bottom w:val="single" w:sz="4" w:color="BFBFBF"/>
+              <w:right w:val="single" w:sz="4" w:color="BFBFBF"/>
+              <w:insideH w:val="single" w:sz="4" w:color="BFBFBF"/>
+              <w:insideV w:val="single" w:sz="4" w:color="BFBFBF"/>
+            </w:tcBorders>
+          </w:tcPr>
+          <w:p>
+            <w:r/>
+            <w:r>
+              <w:rPr>
+                <w:b/>
+              </w:rPr>
+              <w:t>被 cull 砍掉的零件大小</w:t>
+            </w:r>
+          </w:p>
+        </w:tc>
+        <w:tc>
+          <w:tcPr>
+            <w:tcW w:type="dxa" w:w="3213"/>
+            <w:tcBorders>
+              <w:top w:val="single" w:sz="4" w:color="BFBFBF"/>
+              <w:left w:val="single" w:sz="4" w:color="BFBFBF"/>
+              <w:bottom w:val="single" w:sz="4" w:color="BFBFBF"/>
+              <w:right w:val="single" w:sz="4" w:color="BFBFBF"/>
+              <w:insideH w:val="single" w:sz="4" w:color="BFBFBF"/>
+              <w:insideV w:val="single" w:sz="4" w:color="BFBFBF"/>
+            </w:tcBorders>
+          </w:tcPr>
+          <w:p>
+            <w:r/>
+            <w:r>
+              <w:t xml:space="preserve">❌ </w:t>
+            </w:r>
+            <w:r>
+              <w:rPr>
+                <w:b/>
+              </w:rPr>
+              <w:t>不適合</w:t>
+            </w:r>
+          </w:p>
+        </w:tc>
+      </w:tr>
+      <w:tr>
+        <w:tc>
+          <w:tcPr>
+            <w:tcW w:type="dxa" w:w="3213"/>
+            <w:tcBorders>
+              <w:top w:val="single" w:sz="4" w:color="BFBFBF"/>
+              <w:left w:val="single" w:sz="4" w:color="BFBFBF"/>
+              <w:bottom w:val="single" w:sz="4" w:color="BFBFBF"/>
+              <w:right w:val="single" w:sz="4" w:color="BFBFBF"/>
+              <w:insideH w:val="single" w:sz="4" w:color="BFBFBF"/>
+              <w:insideV w:val="single" w:sz="4" w:color="BFBFBF"/>
+            </w:tcBorders>
+          </w:tcPr>
+          <w:p>
+            <w:r/>
+            <w:r>
+              <w:rPr>
+                <w:b/>
+              </w:rPr>
+              <w:t>Chamfer (mean)</w:t>
+            </w:r>
+          </w:p>
+        </w:tc>
+        <w:tc>
+          <w:tcPr>
+            <w:tcW w:type="dxa" w:w="3213"/>
+            <w:tcBorders>
+              <w:top w:val="single" w:sz="4" w:color="BFBFBF"/>
+              <w:left w:val="single" w:sz="4" w:color="BFBFBF"/>
+              <w:bottom w:val="single" w:sz="4" w:color="BFBFBF"/>
+              <w:right w:val="single" w:sz="4" w:color="BFBFBF"/>
+              <w:insideH w:val="single" w:sz="4" w:color="BFBFBF"/>
+              <w:insideV w:val="single" w:sz="4" w:color="BFBFBF"/>
+            </w:tcBorders>
+          </w:tcPr>
+          <w:p>
+            <w:r/>
+            <w:r>
+              <w:t>平均面對面距離</w:t>
+            </w:r>
+          </w:p>
+        </w:tc>
+        <w:tc>
+          <w:tcPr>
+            <w:tcW w:type="dxa" w:w="3213"/>
+            <w:tcBorders>
+              <w:top w:val="single" w:sz="4" w:color="BFBFBF"/>
+              <w:left w:val="single" w:sz="4" w:color="BFBFBF"/>
+              <w:bottom w:val="single" w:sz="4" w:color="BFBFBF"/>
+              <w:right w:val="single" w:sz="4" w:color="BFBFBF"/>
+              <w:insideH w:val="single" w:sz="4" w:color="BFBFBF"/>
+              <w:insideV w:val="single" w:sz="4" w:color="BFBFBF"/>
+            </w:tcBorders>
+          </w:tcPr>
+          <w:p>
+            <w:r/>
+            <w:r>
+              <w:t>⚠️ 對「fill 補多少」敏感，不單調</w:t>
+            </w:r>
+          </w:p>
+        </w:tc>
+      </w:tr>
+      <w:tr>
+        <w:tc>
+          <w:tcPr>
+            <w:tcW w:type="dxa" w:w="3213"/>
+            <w:tcBorders>
+              <w:top w:val="single" w:sz="4" w:color="BFBFBF"/>
+              <w:left w:val="single" w:sz="4" w:color="BFBFBF"/>
+              <w:bottom w:val="single" w:sz="4" w:color="BFBFBF"/>
+              <w:right w:val="single" w:sz="4" w:color="BFBFBF"/>
+              <w:insideH w:val="single" w:sz="4" w:color="BFBFBF"/>
+              <w:insideV w:val="single" w:sz="4" w:color="BFBFBF"/>
+            </w:tcBorders>
+          </w:tcPr>
+          <w:p>
+            <w:r/>
+            <w:r>
+              <w:rPr>
+                <w:b/>
+              </w:rPr>
+              <w:t>Volume diff</w:t>
+            </w:r>
+          </w:p>
+        </w:tc>
+        <w:tc>
+          <w:tcPr>
+            <w:tcW w:type="dxa" w:w="3213"/>
+            <w:tcBorders>
+              <w:top w:val="single" w:sz="4" w:color="BFBFBF"/>
+              <w:left w:val="single" w:sz="4" w:color="BFBFBF"/>
+              <w:bottom w:val="single" w:sz="4" w:color="BFBFBF"/>
+              <w:right w:val="single" w:sz="4" w:color="BFBFBF"/>
+              <w:insideH w:val="single" w:sz="4" w:color="BFBFBF"/>
+              <w:insideV w:val="single" w:sz="4" w:color="BFBFBF"/>
+            </w:tcBorders>
+          </w:tcPr>
+          <w:p>
+            <w:r/>
+            <w:r>
+              <w:t>封閉體積差異</w:t>
+            </w:r>
+          </w:p>
+        </w:tc>
+        <w:tc>
+          <w:tcPr>
+            <w:tcW w:type="dxa" w:w="3213"/>
+            <w:tcBorders>
+              <w:top w:val="single" w:sz="4" w:color="BFBFBF"/>
+              <w:left w:val="single" w:sz="4" w:color="BFBFBF"/>
+              <w:bottom w:val="single" w:sz="4" w:color="BFBFBF"/>
+              <w:right w:val="single" w:sz="4" w:color="BFBFBF"/>
+              <w:insideH w:val="single" w:sz="4" w:color="BFBFBF"/>
+              <w:insideV w:val="single" w:sz="4" w:color="BFBFBF"/>
+            </w:tcBorders>
+          </w:tcPr>
+          <w:p>
+            <w:r/>
+            <w:r>
+              <w:t>❌ 對 non-watertight CAD 是 NaN</w:t>
+            </w:r>
+          </w:p>
+        </w:tc>
+      </w:tr>
+      <w:tr>
+        <w:tc>
+          <w:tcPr>
+            <w:tcW w:type="dxa" w:w="3213"/>
+            <w:tcBorders>
+              <w:top w:val="single" w:sz="4" w:color="BFBFBF"/>
+              <w:left w:val="single" w:sz="4" w:color="BFBFBF"/>
+              <w:bottom w:val="single" w:sz="4" w:color="BFBFBF"/>
+              <w:right w:val="single" w:sz="4" w:color="BFBFBF"/>
+              <w:insideH w:val="single" w:sz="4" w:color="BFBFBF"/>
+              <w:insideV w:val="single" w:sz="4" w:color="BFBFBF"/>
+            </w:tcBorders>
+          </w:tcPr>
+          <w:p>
+            <w:r/>
+            <w:r>
+              <w:rPr>
+                <w:b/>
+              </w:rPr>
+              <w:t>Mean normal deviation</w:t>
+            </w:r>
+          </w:p>
+        </w:tc>
+        <w:tc>
+          <w:tcPr>
+            <w:tcW w:type="dxa" w:w="3213"/>
+            <w:tcBorders>
+              <w:top w:val="single" w:sz="4" w:color="BFBFBF"/>
+              <w:left w:val="single" w:sz="4" w:color="BFBFBF"/>
+              <w:bottom w:val="single" w:sz="4" w:color="BFBFBF"/>
+              <w:right w:val="single" w:sz="4" w:color="BFBFBF"/>
+              <w:insideH w:val="single" w:sz="4" w:color="BFBFBF"/>
+              <w:insideV w:val="single" w:sz="4" w:color="BFBFBF"/>
+            </w:tcBorders>
+          </w:tcPr>
+          <w:p>
+            <w:r/>
+            <w:r>
+              <w:t>平均法向角度差</w:t>
+            </w:r>
+          </w:p>
+        </w:tc>
+        <w:tc>
+          <w:tcPr>
+            <w:tcW w:type="dxa" w:w="3213"/>
+            <w:tcBorders>
+              <w:top w:val="single" w:sz="4" w:color="BFBFBF"/>
+              <w:left w:val="single" w:sz="4" w:color="BFBFBF"/>
+              <w:bottom w:val="single" w:sz="4" w:color="BFBFBF"/>
+              <w:right w:val="single" w:sz="4" w:color="BFBFBF"/>
+              <w:insideH w:val="single" w:sz="4" w:color="BFBFBF"/>
+              <w:insideV w:val="single" w:sz="4" w:color="BFBFBF"/>
+            </w:tcBorders>
+          </w:tcPr>
+          <w:p>
+            <w:r/>
+            <w:r>
+              <w:t xml:space="preserve">✅ </w:t>
+            </w:r>
+            <w:r>
+              <w:rPr>
+                <w:b/>
+              </w:rPr>
+              <w:t>真 KPI — 跟 face_count、視覺感受一致</w:t>
+            </w:r>
+          </w:p>
+        </w:tc>
+      </w:tr>
+    </w:tbl>
+    <w:p>
+      <w:r>
+        <w:rPr>
+          <w:b/>
+        </w:rPr>
+        <w:t>為什麼 Hausdorff 不適合？</w:t>
+      </w:r>
+      <w:r>
+        <w:t xml:space="preserve"> Hausdorff 取的是「最壞點」距離。當 reduce pipeline 用 </w:t>
+      </w:r>
+      <w:r>
+        <w:rPr>
+          <w:rFonts w:ascii="Consolas" w:hAnsi="Consolas"/>
+          <w:color w:val="C7254E"/>
+          <w:sz w:val="20"/>
+        </w:rPr>
+        <w:t>--cull-disjoint</w:t>
+      </w:r>
+      <w:r>
+        <w:t xml:space="preserve"> 砍掉小漂浮零件，那些零件位置的最近距離會爆掉 — 三檔 LOD 的 Hausdorff 數字幾乎相同（都 ≈ 8% of diagonal），但 LOD 質量天差地別。</w:t>
+      </w:r>
+      <w:r>
+        <w:rPr>
+          <w:b/>
+        </w:rPr>
+        <w:t>Hausdorff 反映的是 cull 行為，不是 collapse 偏差。</w:t>
+      </w:r>
+    </w:p>
+    <w:p>
+      <w:r>
+        <w:rPr>
+          <w:b/>
+        </w:rPr>
+        <w:t>為什麼 Chamfer 也要小心？</w:t>
+      </w:r>
+      <w:r>
+        <w:t xml:space="preserve"> Chamfer 是雙向 mean distance，當 LOD face 多到 fill_holes 補了原檔沒有的 geometry，r→o 距離會拉高，</w:t>
+      </w:r>
+      <w:r>
+        <w:rPr>
+          <w:b/>
+        </w:rPr>
+        <w:t>chamfer 變得不單調</w:t>
+      </w:r>
+      <w:r>
+        <w:t>（face 多反而比中間 LOD 差）。</w:t>
+      </w:r>
+    </w:p>
+    <w:p>
+      <w:r>
+        <w:rPr>
+          <w:b/>
+        </w:rPr>
+        <w:t>Mean normal deviation 是唯一可信 KPI</w:t>
+      </w:r>
+      <w:r>
+        <w:t>：face 越少 → normal 越粗略 → deviation 越大。完美線性、跟 face_count 一致、跟視覺感受一致。詳見 §6.8 Case Study 的 5AxisGlueSpraying.fbx 實測（12.06° / 6.95° / 1.61° 對應 TIER 1 / 2 / 3）。</w:t>
+      </w:r>
+    </w:p>
+    <w:p>
+      <w:r>
+        <w:rPr>
+          <w:b/>
+        </w:rPr>
+        <w:t>實用建議</w:t>
+      </w:r>
+      <w:r>
+        <w:t>：</w:t>
+        <w:br/>
+        <w:t xml:space="preserve">* 看 LOD 質量 → 用 </w:t>
+      </w:r>
+      <w:r>
+        <w:rPr>
+          <w:rFonts w:ascii="Consolas" w:hAnsi="Consolas"/>
+          <w:color w:val="C7254E"/>
+          <w:sz w:val="20"/>
+        </w:rPr>
+        <w:t>mean_normal_dev_deg</w:t>
+      </w:r>
+      <w:r>
+        <w:br/>
+        <w:t>* 看「reduce 砍掉了什麼」→ 用 Hausdorff (但要懂它反映 cull)</w:t>
+        <w:br/>
+        <w:t>* 看細節保留 → 用 Chamfer（但跟 face_count 一起看）</w:t>
+      </w:r>
+    </w:p>
+    <w:p>
+      <w:pPr>
         <w:pStyle w:val="Heading2"/>
       </w:pPr>
       <w:r>
@@ -7281,6 +7756,2115 @@
       </w:r>
       <w:r>
         <w:t>：原檔 topology 太亂，建議匯出前先在 CAD 端 export 設定改 “merged vertices” 或在 Blender 手動 weld 後再進 DIAMesh pipeline。</w:t>
+      </w:r>
+    </w:p>
+    <w:p>
+      <w:pPr>
+        <w:pStyle w:val="Heading2"/>
+      </w:pPr>
+      <w:r>
+        <w:t>6.8 Case Study — 5AxisGlueSpraying.fbx 完整 baseline</w:t>
+      </w:r>
+    </w:p>
+    <w:p>
+      <w:r>
+        <w:t>這套真實 baseline 解釋了 §6.5 九組視覺實驗背後的 quantitative root cause，也驗證了 §6.0 的設計哲學在實際工業 CAD 上的表現。</w:t>
+      </w:r>
+      <w:r>
+        <w:rPr>
+          <w:b/>
+        </w:rPr>
+        <w:t>所有數字都來自 diamesh diagnose + diamesh diff 在 5AxisGlueSpraying.fbx 上的實際輸出</w:t>
+      </w:r>
+      <w:r>
+        <w:t>，可重現。</w:t>
+      </w:r>
+    </w:p>
+    <w:p>
+      <w:pPr>
+        <w:pStyle w:val="Heading3"/>
+      </w:pPr>
+      <w:r>
+        <w:t>6.8.1 原檔病理（diagnose 報告）</w:t>
+      </w:r>
+    </w:p>
+    <w:p>
+      <w:pPr>
+        <w:spacing w:before="80" w:after="80"/>
+        <w:ind w:left="283"/>
+        <w:shd w:val="clear" w:color="auto" w:fill="F6F8FA"/>
+      </w:pPr>
+      <w:r>
+        <w:rPr>
+          <w:rFonts w:ascii="Consolas" w:hAnsi="Consolas"/>
+          <w:sz w:val="19"/>
+        </w:rPr>
+        <w:t>diagnose: 5AxisGlueSpraying.fbx</w:t>
+        <w:br/>
+        <w:t xml:space="preserve">  face_count:           75327</w:t>
+        <w:br/>
+        <w:t xml:space="preserve">  vert_count:           114697         &lt;- vert/face = 1.52</w:t>
+        <w:br/>
+        <w:t xml:space="preserve">  bbox_diagonal:        2.2950 m</w:t>
+        <w:br/>
+        <w:t xml:space="preserve">  watertight:           False</w:t>
+        <w:br/>
+        <w:t xml:space="preserve">  winding_consistent:   True</w:t>
+        <w:br/>
+        <w:t xml:space="preserve">  boundary_edges:       115935         &lt;- ≈ unique edges 總數</w:t>
+        <w:br/>
+        <w:t xml:space="preserve">  non_manifold_edges:   0</w:t>
+        <w:br/>
+        <w:t xml:space="preserve">  degenerate_faces:     52</w:t>
+        <w:br/>
+        <w:t xml:space="preserve">  island_count:         22552          &lt;- 兩萬多個 island</w:t>
+        <w:br/>
+        <w:t xml:space="preserve">  largest_islands:      [593, 589, 589, 585, 466]   (top 5 = 3.7% 總面數)</w:t>
+        <w:br/>
+        <w:t xml:space="preserve">  inverted_normals:     0</w:t>
+      </w:r>
+    </w:p>
+    <w:p>
+      <w:r>
+        <w:rPr>
+          <w:b/>
+        </w:rPr>
+        <w:t>三個關鍵病理 finding：</w:t>
+      </w:r>
+    </w:p>
+    <w:p>
+      <w:pPr>
+        <w:pStyle w:val="ListBullet"/>
+        <w:ind w:left="340"/>
+      </w:pPr>
+      <w:r>
+        <w:rPr>
+          <w:b/>
+        </w:rPr>
+        <w:t>22,552 個 island vs 75,327 face = 平均 3.3 face/island</w:t>
+      </w:r>
+      <w:r>
+        <w:t>：大部分 island 是孤立小三角形，沒有「主結構 anchor」。top 5 islands 才 3.7% 總面數。人類視覺看是完整設備 — 僅靠 weld 0.1mm 把這些散點融合。</w:t>
+      </w:r>
+    </w:p>
+    <w:p>
+      <w:pPr>
+        <w:pStyle w:val="ListBullet"/>
+        <w:ind w:left="340"/>
+      </w:pPr>
+      <w:r>
+        <w:rPr>
+          <w:b/>
+        </w:rPr>
+        <w:t>boundary_edges 115935 ≈ unique edges 總數</w:t>
+      </w:r>
+      <w:r>
+        <w:t>：幾乎每條 edge 都只屬於一個 face → 全是 boundary。這就是為什麼不加 boundary preservation，COLLAPSE 會大量破壞拓樸。</w:t>
+      </w:r>
+    </w:p>
+    <w:p>
+      <w:pPr>
+        <w:pStyle w:val="ListBullet"/>
+        <w:ind w:left="340"/>
+      </w:pPr>
+      <w:r>
+        <w:rPr>
+          <w:b/>
+        </w:rPr>
+        <w:t>vert/face = 1.52 vs watertight 預期 ~0.5</w:t>
+      </w:r>
+      <w:r>
+        <w:t>：嚴重重複頂點。每個 patch seam 的頂點都被複製，0.1mm weld 是治本。</w:t>
+      </w:r>
+    </w:p>
+    <w:p>
+      <w:r>
+        <w:t>DIAMesh 的 pipeline 設計剛好對應這些病理：</w:t>
+      </w:r>
+    </w:p>
+    <w:tbl>
+      <w:tblPr>
+        <w:tblStyle w:val="TableGrid"/>
+        <w:tblW w:type="auto" w:w="0"/>
+        <w:jc w:val="left"/>
+        <w:tblLook w:firstColumn="1" w:firstRow="1" w:lastColumn="0" w:lastRow="0" w:noHBand="0" w:noVBand="1" w:val="04A0"/>
+      </w:tblPr>
+      <w:tblGrid>
+        <w:gridCol w:w="4819"/>
+        <w:gridCol w:w="4819"/>
+      </w:tblGrid>
+      <w:tr>
+        <w:tc>
+          <w:tcPr>
+            <w:tcW w:type="dxa" w:w="4819"/>
+            <w:tcBorders>
+              <w:top w:val="single" w:sz="4" w:color="BFBFBF"/>
+              <w:left w:val="single" w:sz="4" w:color="BFBFBF"/>
+              <w:bottom w:val="single" w:sz="4" w:color="BFBFBF"/>
+              <w:right w:val="single" w:sz="4" w:color="BFBFBF"/>
+              <w:insideH w:val="single" w:sz="4" w:color="BFBFBF"/>
+              <w:insideV w:val="single" w:sz="4" w:color="BFBFBF"/>
+            </w:tcBorders>
+            <w:shd w:val="clear" w:color="auto" w:fill="F6F8FA"/>
+          </w:tcPr>
+          <w:p>
+            <w:r>
+              <w:rPr>
+                <w:b/>
+              </w:rPr>
+            </w:r>
+            <w:r>
+              <w:rPr>
+                <w:b/>
+              </w:rPr>
+              <w:t>病理</w:t>
+            </w:r>
+          </w:p>
+        </w:tc>
+        <w:tc>
+          <w:tcPr>
+            <w:tcW w:type="dxa" w:w="4819"/>
+            <w:tcBorders>
+              <w:top w:val="single" w:sz="4" w:color="BFBFBF"/>
+              <w:left w:val="single" w:sz="4" w:color="BFBFBF"/>
+              <w:bottom w:val="single" w:sz="4" w:color="BFBFBF"/>
+              <w:right w:val="single" w:sz="4" w:color="BFBFBF"/>
+              <w:insideH w:val="single" w:sz="4" w:color="BFBFBF"/>
+              <w:insideV w:val="single" w:sz="4" w:color="BFBFBF"/>
+            </w:tcBorders>
+            <w:shd w:val="clear" w:color="auto" w:fill="F6F8FA"/>
+          </w:tcPr>
+          <w:p>
+            <w:r>
+              <w:rPr>
+                <w:b/>
+              </w:rPr>
+            </w:r>
+            <w:r>
+              <w:rPr>
+                <w:b/>
+              </w:rPr>
+              <w:t>DIAMesh 對應 stage</w:t>
+            </w:r>
+          </w:p>
+        </w:tc>
+      </w:tr>
+      <w:tr>
+        <w:tc>
+          <w:tcPr>
+            <w:tcW w:type="dxa" w:w="4819"/>
+            <w:tcBorders>
+              <w:top w:val="single" w:sz="4" w:color="BFBFBF"/>
+              <w:left w:val="single" w:sz="4" w:color="BFBFBF"/>
+              <w:bottom w:val="single" w:sz="4" w:color="BFBFBF"/>
+              <w:right w:val="single" w:sz="4" w:color="BFBFBF"/>
+              <w:insideH w:val="single" w:sz="4" w:color="BFBFBF"/>
+              <w:insideV w:val="single" w:sz="4" w:color="BFBFBF"/>
+            </w:tcBorders>
+          </w:tcPr>
+          <w:p>
+            <w:r/>
+            <w:r>
+              <w:t>22552 islands、重複頂點</w:t>
+            </w:r>
+          </w:p>
+        </w:tc>
+        <w:tc>
+          <w:tcPr>
+            <w:tcW w:type="dxa" w:w="4819"/>
+            <w:tcBorders>
+              <w:top w:val="single" w:sz="4" w:color="BFBFBF"/>
+              <w:left w:val="single" w:sz="4" w:color="BFBFBF"/>
+              <w:bottom w:val="single" w:sz="4" w:color="BFBFBF"/>
+              <w:right w:val="single" w:sz="4" w:color="BFBFBF"/>
+              <w:insideH w:val="single" w:sz="4" w:color="BFBFBF"/>
+              <w:insideV w:val="single" w:sz="4" w:color="BFBFBF"/>
+            </w:tcBorders>
+          </w:tcPr>
+          <w:p>
+            <w:r/>
+            <w:r>
+              <w:t>weld 0.1mm（化萬個 island 為個位數）</w:t>
+            </w:r>
+          </w:p>
+        </w:tc>
+      </w:tr>
+      <w:tr>
+        <w:tc>
+          <w:tcPr>
+            <w:tcW w:type="dxa" w:w="4819"/>
+            <w:tcBorders>
+              <w:top w:val="single" w:sz="4" w:color="BFBFBF"/>
+              <w:left w:val="single" w:sz="4" w:color="BFBFBF"/>
+              <w:bottom w:val="single" w:sz="4" w:color="BFBFBF"/>
+              <w:right w:val="single" w:sz="4" w:color="BFBFBF"/>
+              <w:insideH w:val="single" w:sz="4" w:color="BFBFBF"/>
+              <w:insideV w:val="single" w:sz="4" w:color="BFBFBF"/>
+            </w:tcBorders>
+          </w:tcPr>
+          <w:p>
+            <w:r/>
+            <w:r>
+              <w:t>仍漂浮的小 part</w:t>
+            </w:r>
+          </w:p>
+        </w:tc>
+        <w:tc>
+          <w:tcPr>
+            <w:tcW w:type="dxa" w:w="4819"/>
+            <w:tcBorders>
+              <w:top w:val="single" w:sz="4" w:color="BFBFBF"/>
+              <w:left w:val="single" w:sz="4" w:color="BFBFBF"/>
+              <w:bottom w:val="single" w:sz="4" w:color="BFBFBF"/>
+              <w:right w:val="single" w:sz="4" w:color="BFBFBF"/>
+              <w:insideH w:val="single" w:sz="4" w:color="BFBFBF"/>
+              <w:insideV w:val="single" w:sz="4" w:color="BFBFBF"/>
+            </w:tcBorders>
+          </w:tcPr>
+          <w:p>
+            <w:r/>
+            <w:r>
+              <w:t>cull-disjoint 0.025</w:t>
+            </w:r>
+          </w:p>
+        </w:tc>
+      </w:tr>
+      <w:tr>
+        <w:tc>
+          <w:tcPr>
+            <w:tcW w:type="dxa" w:w="4819"/>
+            <w:tcBorders>
+              <w:top w:val="single" w:sz="4" w:color="BFBFBF"/>
+              <w:left w:val="single" w:sz="4" w:color="BFBFBF"/>
+              <w:bottom w:val="single" w:sz="4" w:color="BFBFBF"/>
+              <w:right w:val="single" w:sz="4" w:color="BFBFBF"/>
+              <w:insideH w:val="single" w:sz="4" w:color="BFBFBF"/>
+              <w:insideV w:val="single" w:sz="4" w:color="BFBFBF"/>
+            </w:tcBorders>
+          </w:tcPr>
+          <w:p>
+            <w:r/>
+            <w:r>
+              <w:t>全是 boundary edges</w:t>
+            </w:r>
+          </w:p>
+        </w:tc>
+        <w:tc>
+          <w:tcPr>
+            <w:tcW w:type="dxa" w:w="4819"/>
+            <w:tcBorders>
+              <w:top w:val="single" w:sz="4" w:color="BFBFBF"/>
+              <w:left w:val="single" w:sz="4" w:color="BFBFBF"/>
+              <w:bottom w:val="single" w:sz="4" w:color="BFBFBF"/>
+              <w:right w:val="single" w:sz="4" w:color="BFBFBF"/>
+              <w:insideH w:val="single" w:sz="4" w:color="BFBFBF"/>
+              <w:insideV w:val="single" w:sz="4" w:color="BFBFBF"/>
+            </w:tcBorders>
+          </w:tcPr>
+          <w:p>
+            <w:r/>
+            <w:r>
+              <w:t>boundary preservation（治本）</w:t>
+            </w:r>
+          </w:p>
+        </w:tc>
+      </w:tr>
+      <w:tr>
+        <w:tc>
+          <w:tcPr>
+            <w:tcW w:type="dxa" w:w="4819"/>
+            <w:tcBorders>
+              <w:top w:val="single" w:sz="4" w:color="BFBFBF"/>
+              <w:left w:val="single" w:sz="4" w:color="BFBFBF"/>
+              <w:bottom w:val="single" w:sz="4" w:color="BFBFBF"/>
+              <w:right w:val="single" w:sz="4" w:color="BFBFBF"/>
+              <w:insideH w:val="single" w:sz="4" w:color="BFBFBF"/>
+              <w:insideV w:val="single" w:sz="4" w:color="BFBFBF"/>
+            </w:tcBorders>
+          </w:tcPr>
+          <w:p>
+            <w:r/>
+            <w:r>
+              <w:t>設計孔需保留</w:t>
+            </w:r>
+          </w:p>
+        </w:tc>
+        <w:tc>
+          <w:tcPr>
+            <w:tcW w:type="dxa" w:w="4819"/>
+            <w:tcBorders>
+              <w:top w:val="single" w:sz="4" w:color="BFBFBF"/>
+              <w:left w:val="single" w:sz="4" w:color="BFBFBF"/>
+              <w:bottom w:val="single" w:sz="4" w:color="BFBFBF"/>
+              <w:right w:val="single" w:sz="4" w:color="BFBFBF"/>
+              <w:insideH w:val="single" w:sz="4" w:color="BFBFBF"/>
+              <w:insideV w:val="single" w:sz="4" w:color="BFBFBF"/>
+            </w:tcBorders>
+          </w:tcPr>
+          <w:p>
+            <w:r/>
+            <w:r>
+              <w:t>smart fill skip-design</w:t>
+            </w:r>
+          </w:p>
+        </w:tc>
+      </w:tr>
+      <w:tr>
+        <w:tc>
+          <w:tcPr>
+            <w:tcW w:type="dxa" w:w="4819"/>
+            <w:tcBorders>
+              <w:top w:val="single" w:sz="4" w:color="BFBFBF"/>
+              <w:left w:val="single" w:sz="4" w:color="BFBFBF"/>
+              <w:bottom w:val="single" w:sz="4" w:color="BFBFBF"/>
+              <w:right w:val="single" w:sz="4" w:color="BFBFBF"/>
+              <w:insideH w:val="single" w:sz="4" w:color="BFBFBF"/>
+              <w:insideV w:val="single" w:sz="4" w:color="BFBFBF"/>
+            </w:tcBorders>
+          </w:tcPr>
+          <w:p>
+            <w:r/>
+            <w:r>
+              <w:t>52 degenerate</w:t>
+            </w:r>
+          </w:p>
+        </w:tc>
+        <w:tc>
+          <w:tcPr>
+            <w:tcW w:type="dxa" w:w="4819"/>
+            <w:tcBorders>
+              <w:top w:val="single" w:sz="4" w:color="BFBFBF"/>
+              <w:left w:val="single" w:sz="4" w:color="BFBFBF"/>
+              <w:bottom w:val="single" w:sz="4" w:color="BFBFBF"/>
+              <w:right w:val="single" w:sz="4" w:color="BFBFBF"/>
+              <w:insideH w:val="single" w:sz="4" w:color="BFBFBF"/>
+              <w:insideV w:val="single" w:sz="4" w:color="BFBFBF"/>
+            </w:tcBorders>
+          </w:tcPr>
+          <w:p>
+            <w:r/>
+            <w:r>
+              <w:t>dissolve_degenerate</w:t>
+            </w:r>
+          </w:p>
+        </w:tc>
+      </w:tr>
+    </w:tbl>
+    <w:p>
+      <w:pPr>
+        <w:pStyle w:val="Heading3"/>
+      </w:pPr>
+      <w:r>
+        <w:t>6.8.2 三檔 LOD 後的 diagnose 對比</w:t>
+      </w:r>
+    </w:p>
+    <w:tbl>
+      <w:tblPr>
+        <w:tblStyle w:val="TableGrid"/>
+        <w:tblW w:type="auto" w:w="0"/>
+        <w:jc w:val="left"/>
+        <w:tblLook w:firstColumn="1" w:firstRow="1" w:lastColumn="0" w:lastRow="0" w:noHBand="0" w:noVBand="1" w:val="04A0"/>
+      </w:tblPr>
+      <w:tblGrid>
+        <w:gridCol w:w="1928"/>
+        <w:gridCol w:w="1928"/>
+        <w:gridCol w:w="1928"/>
+        <w:gridCol w:w="1928"/>
+        <w:gridCol w:w="1928"/>
+      </w:tblGrid>
+      <w:tr>
+        <w:tc>
+          <w:tcPr>
+            <w:tcW w:type="dxa" w:w="1928"/>
+            <w:tcBorders>
+              <w:top w:val="single" w:sz="4" w:color="BFBFBF"/>
+              <w:left w:val="single" w:sz="4" w:color="BFBFBF"/>
+              <w:bottom w:val="single" w:sz="4" w:color="BFBFBF"/>
+              <w:right w:val="single" w:sz="4" w:color="BFBFBF"/>
+              <w:insideH w:val="single" w:sz="4" w:color="BFBFBF"/>
+              <w:insideV w:val="single" w:sz="4" w:color="BFBFBF"/>
+            </w:tcBorders>
+            <w:shd w:val="clear" w:color="auto" w:fill="F6F8FA"/>
+          </w:tcPr>
+          <w:p>
+            <w:r>
+              <w:rPr>
+                <w:b/>
+              </w:rPr>
+            </w:r>
+            <w:r>
+              <w:rPr>
+                <w:b/>
+              </w:rPr>
+              <w:t>指標</w:t>
+            </w:r>
+          </w:p>
+        </w:tc>
+        <w:tc>
+          <w:tcPr>
+            <w:tcW w:type="dxa" w:w="1928"/>
+            <w:tcBorders>
+              <w:top w:val="single" w:sz="4" w:color="BFBFBF"/>
+              <w:left w:val="single" w:sz="4" w:color="BFBFBF"/>
+              <w:bottom w:val="single" w:sz="4" w:color="BFBFBF"/>
+              <w:right w:val="single" w:sz="4" w:color="BFBFBF"/>
+              <w:insideH w:val="single" w:sz="4" w:color="BFBFBF"/>
+              <w:insideV w:val="single" w:sz="4" w:color="BFBFBF"/>
+            </w:tcBorders>
+            <w:shd w:val="clear" w:color="auto" w:fill="F6F8FA"/>
+          </w:tcPr>
+          <w:p>
+            <w:r>
+              <w:rPr>
+                <w:b/>
+              </w:rPr>
+            </w:r>
+            <w:r>
+              <w:rPr>
+                <w:b/>
+              </w:rPr>
+              <w:t>Original</w:t>
+            </w:r>
+          </w:p>
+        </w:tc>
+        <w:tc>
+          <w:tcPr>
+            <w:tcW w:type="dxa" w:w="1928"/>
+            <w:tcBorders>
+              <w:top w:val="single" w:sz="4" w:color="BFBFBF"/>
+              <w:left w:val="single" w:sz="4" w:color="BFBFBF"/>
+              <w:bottom w:val="single" w:sz="4" w:color="BFBFBF"/>
+              <w:right w:val="single" w:sz="4" w:color="BFBFBF"/>
+              <w:insideH w:val="single" w:sz="4" w:color="BFBFBF"/>
+              <w:insideV w:val="single" w:sz="4" w:color="BFBFBF"/>
+            </w:tcBorders>
+            <w:shd w:val="clear" w:color="auto" w:fill="F6F8FA"/>
+          </w:tcPr>
+          <w:p>
+            <w:r>
+              <w:rPr>
+                <w:b/>
+              </w:rPr>
+            </w:r>
+            <w:r>
+              <w:rPr>
+                <w:b/>
+              </w:rPr>
+              <w:t>TIER 1</w:t>
+            </w:r>
+          </w:p>
+        </w:tc>
+        <w:tc>
+          <w:tcPr>
+            <w:tcW w:type="dxa" w:w="1928"/>
+            <w:tcBorders>
+              <w:top w:val="single" w:sz="4" w:color="BFBFBF"/>
+              <w:left w:val="single" w:sz="4" w:color="BFBFBF"/>
+              <w:bottom w:val="single" w:sz="4" w:color="BFBFBF"/>
+              <w:right w:val="single" w:sz="4" w:color="BFBFBF"/>
+              <w:insideH w:val="single" w:sz="4" w:color="BFBFBF"/>
+              <w:insideV w:val="single" w:sz="4" w:color="BFBFBF"/>
+            </w:tcBorders>
+            <w:shd w:val="clear" w:color="auto" w:fill="F6F8FA"/>
+          </w:tcPr>
+          <w:p>
+            <w:r>
+              <w:rPr>
+                <w:b/>
+              </w:rPr>
+            </w:r>
+            <w:r>
+              <w:rPr>
+                <w:b/>
+              </w:rPr>
+              <w:t>TIER 2</w:t>
+            </w:r>
+          </w:p>
+        </w:tc>
+        <w:tc>
+          <w:tcPr>
+            <w:tcW w:type="dxa" w:w="1928"/>
+            <w:tcBorders>
+              <w:top w:val="single" w:sz="4" w:color="BFBFBF"/>
+              <w:left w:val="single" w:sz="4" w:color="BFBFBF"/>
+              <w:bottom w:val="single" w:sz="4" w:color="BFBFBF"/>
+              <w:right w:val="single" w:sz="4" w:color="BFBFBF"/>
+              <w:insideH w:val="single" w:sz="4" w:color="BFBFBF"/>
+              <w:insideV w:val="single" w:sz="4" w:color="BFBFBF"/>
+            </w:tcBorders>
+            <w:shd w:val="clear" w:color="auto" w:fill="F6F8FA"/>
+          </w:tcPr>
+          <w:p>
+            <w:r>
+              <w:rPr>
+                <w:b/>
+              </w:rPr>
+            </w:r>
+            <w:r>
+              <w:rPr>
+                <w:b/>
+              </w:rPr>
+              <w:t>TIER 3</w:t>
+            </w:r>
+          </w:p>
+        </w:tc>
+      </w:tr>
+      <w:tr>
+        <w:tc>
+          <w:tcPr>
+            <w:tcW w:type="dxa" w:w="1928"/>
+            <w:tcBorders>
+              <w:top w:val="single" w:sz="4" w:color="BFBFBF"/>
+              <w:left w:val="single" w:sz="4" w:color="BFBFBF"/>
+              <w:bottom w:val="single" w:sz="4" w:color="BFBFBF"/>
+              <w:right w:val="single" w:sz="4" w:color="BFBFBF"/>
+              <w:insideH w:val="single" w:sz="4" w:color="BFBFBF"/>
+              <w:insideV w:val="single" w:sz="4" w:color="BFBFBF"/>
+            </w:tcBorders>
+          </w:tcPr>
+          <w:p>
+            <w:r/>
+            <w:r>
+              <w:t>face</w:t>
+            </w:r>
+          </w:p>
+        </w:tc>
+        <w:tc>
+          <w:tcPr>
+            <w:tcW w:type="dxa" w:w="1928"/>
+            <w:tcBorders>
+              <w:top w:val="single" w:sz="4" w:color="BFBFBF"/>
+              <w:left w:val="single" w:sz="4" w:color="BFBFBF"/>
+              <w:bottom w:val="single" w:sz="4" w:color="BFBFBF"/>
+              <w:right w:val="single" w:sz="4" w:color="BFBFBF"/>
+              <w:insideH w:val="single" w:sz="4" w:color="BFBFBF"/>
+              <w:insideV w:val="single" w:sz="4" w:color="BFBFBF"/>
+            </w:tcBorders>
+          </w:tcPr>
+          <w:p>
+            <w:r/>
+            <w:r>
+              <w:t>75327</w:t>
+            </w:r>
+          </w:p>
+        </w:tc>
+        <w:tc>
+          <w:tcPr>
+            <w:tcW w:type="dxa" w:w="1928"/>
+            <w:tcBorders>
+              <w:top w:val="single" w:sz="4" w:color="BFBFBF"/>
+              <w:left w:val="single" w:sz="4" w:color="BFBFBF"/>
+              <w:bottom w:val="single" w:sz="4" w:color="BFBFBF"/>
+              <w:right w:val="single" w:sz="4" w:color="BFBFBF"/>
+              <w:insideH w:val="single" w:sz="4" w:color="BFBFBF"/>
+              <w:insideV w:val="single" w:sz="4" w:color="BFBFBF"/>
+            </w:tcBorders>
+          </w:tcPr>
+          <w:p>
+            <w:r/>
+            <w:r>
+              <w:t>21305</w:t>
+            </w:r>
+          </w:p>
+        </w:tc>
+        <w:tc>
+          <w:tcPr>
+            <w:tcW w:type="dxa" w:w="1928"/>
+            <w:tcBorders>
+              <w:top w:val="single" w:sz="4" w:color="BFBFBF"/>
+              <w:left w:val="single" w:sz="4" w:color="BFBFBF"/>
+              <w:bottom w:val="single" w:sz="4" w:color="BFBFBF"/>
+              <w:right w:val="single" w:sz="4" w:color="BFBFBF"/>
+              <w:insideH w:val="single" w:sz="4" w:color="BFBFBF"/>
+              <w:insideV w:val="single" w:sz="4" w:color="BFBFBF"/>
+            </w:tcBorders>
+          </w:tcPr>
+          <w:p>
+            <w:r/>
+            <w:r>
+              <w:t>50972</w:t>
+            </w:r>
+          </w:p>
+        </w:tc>
+        <w:tc>
+          <w:tcPr>
+            <w:tcW w:type="dxa" w:w="1928"/>
+            <w:tcBorders>
+              <w:top w:val="single" w:sz="4" w:color="BFBFBF"/>
+              <w:left w:val="single" w:sz="4" w:color="BFBFBF"/>
+              <w:bottom w:val="single" w:sz="4" w:color="BFBFBF"/>
+              <w:right w:val="single" w:sz="4" w:color="BFBFBF"/>
+              <w:insideH w:val="single" w:sz="4" w:color="BFBFBF"/>
+              <w:insideV w:val="single" w:sz="4" w:color="BFBFBF"/>
+            </w:tcBorders>
+          </w:tcPr>
+          <w:p>
+            <w:r/>
+            <w:r>
+              <w:t>71288</w:t>
+            </w:r>
+          </w:p>
+        </w:tc>
+      </w:tr>
+      <w:tr>
+        <w:tc>
+          <w:tcPr>
+            <w:tcW w:type="dxa" w:w="1928"/>
+            <w:tcBorders>
+              <w:top w:val="single" w:sz="4" w:color="BFBFBF"/>
+              <w:left w:val="single" w:sz="4" w:color="BFBFBF"/>
+              <w:bottom w:val="single" w:sz="4" w:color="BFBFBF"/>
+              <w:right w:val="single" w:sz="4" w:color="BFBFBF"/>
+              <w:insideH w:val="single" w:sz="4" w:color="BFBFBF"/>
+              <w:insideV w:val="single" w:sz="4" w:color="BFBFBF"/>
+            </w:tcBorders>
+          </w:tcPr>
+          <w:p>
+            <w:r/>
+            <w:r>
+              <w:rPr>
+                <w:b/>
+              </w:rPr>
+              <w:t>ratio achieved</w:t>
+            </w:r>
+          </w:p>
+        </w:tc>
+        <w:tc>
+          <w:tcPr>
+            <w:tcW w:type="dxa" w:w="1928"/>
+            <w:tcBorders>
+              <w:top w:val="single" w:sz="4" w:color="BFBFBF"/>
+              <w:left w:val="single" w:sz="4" w:color="BFBFBF"/>
+              <w:bottom w:val="single" w:sz="4" w:color="BFBFBF"/>
+              <w:right w:val="single" w:sz="4" w:color="BFBFBF"/>
+              <w:insideH w:val="single" w:sz="4" w:color="BFBFBF"/>
+              <w:insideV w:val="single" w:sz="4" w:color="BFBFBF"/>
+            </w:tcBorders>
+          </w:tcPr>
+          <w:p>
+            <w:r/>
+            <w:r>
+              <w:t>–</w:t>
+            </w:r>
+          </w:p>
+        </w:tc>
+        <w:tc>
+          <w:tcPr>
+            <w:tcW w:type="dxa" w:w="1928"/>
+            <w:tcBorders>
+              <w:top w:val="single" w:sz="4" w:color="BFBFBF"/>
+              <w:left w:val="single" w:sz="4" w:color="BFBFBF"/>
+              <w:bottom w:val="single" w:sz="4" w:color="BFBFBF"/>
+              <w:right w:val="single" w:sz="4" w:color="BFBFBF"/>
+              <w:insideH w:val="single" w:sz="4" w:color="BFBFBF"/>
+              <w:insideV w:val="single" w:sz="4" w:color="BFBFBF"/>
+            </w:tcBorders>
+          </w:tcPr>
+          <w:p>
+            <w:r/>
+            <w:r>
+              <w:rPr>
+                <w:b/>
+              </w:rPr>
+              <w:t>28%</w:t>
+            </w:r>
+          </w:p>
+        </w:tc>
+        <w:tc>
+          <w:tcPr>
+            <w:tcW w:type="dxa" w:w="1928"/>
+            <w:tcBorders>
+              <w:top w:val="single" w:sz="4" w:color="BFBFBF"/>
+              <w:left w:val="single" w:sz="4" w:color="BFBFBF"/>
+              <w:bottom w:val="single" w:sz="4" w:color="BFBFBF"/>
+              <w:right w:val="single" w:sz="4" w:color="BFBFBF"/>
+              <w:insideH w:val="single" w:sz="4" w:color="BFBFBF"/>
+              <w:insideV w:val="single" w:sz="4" w:color="BFBFBF"/>
+            </w:tcBorders>
+          </w:tcPr>
+          <w:p>
+            <w:r/>
+            <w:r>
+              <w:rPr>
+                <w:b/>
+              </w:rPr>
+              <w:t>67%</w:t>
+            </w:r>
+          </w:p>
+        </w:tc>
+        <w:tc>
+          <w:tcPr>
+            <w:tcW w:type="dxa" w:w="1928"/>
+            <w:tcBorders>
+              <w:top w:val="single" w:sz="4" w:color="BFBFBF"/>
+              <w:left w:val="single" w:sz="4" w:color="BFBFBF"/>
+              <w:bottom w:val="single" w:sz="4" w:color="BFBFBF"/>
+              <w:right w:val="single" w:sz="4" w:color="BFBFBF"/>
+              <w:insideH w:val="single" w:sz="4" w:color="BFBFBF"/>
+              <w:insideV w:val="single" w:sz="4" w:color="BFBFBF"/>
+            </w:tcBorders>
+          </w:tcPr>
+          <w:p>
+            <w:r/>
+            <w:r>
+              <w:rPr>
+                <w:b/>
+              </w:rPr>
+              <w:t>94%</w:t>
+            </w:r>
+          </w:p>
+        </w:tc>
+      </w:tr>
+      <w:tr>
+        <w:tc>
+          <w:tcPr>
+            <w:tcW w:type="dxa" w:w="1928"/>
+            <w:tcBorders>
+              <w:top w:val="single" w:sz="4" w:color="BFBFBF"/>
+              <w:left w:val="single" w:sz="4" w:color="BFBFBF"/>
+              <w:bottom w:val="single" w:sz="4" w:color="BFBFBF"/>
+              <w:right w:val="single" w:sz="4" w:color="BFBFBF"/>
+              <w:insideH w:val="single" w:sz="4" w:color="BFBFBF"/>
+              <w:insideV w:val="single" w:sz="4" w:color="BFBFBF"/>
+            </w:tcBorders>
+          </w:tcPr>
+          <w:p>
+            <w:r/>
+            <w:r>
+              <w:t>ratio requested</w:t>
+            </w:r>
+          </w:p>
+        </w:tc>
+        <w:tc>
+          <w:tcPr>
+            <w:tcW w:type="dxa" w:w="1928"/>
+            <w:tcBorders>
+              <w:top w:val="single" w:sz="4" w:color="BFBFBF"/>
+              <w:left w:val="single" w:sz="4" w:color="BFBFBF"/>
+              <w:bottom w:val="single" w:sz="4" w:color="BFBFBF"/>
+              <w:right w:val="single" w:sz="4" w:color="BFBFBF"/>
+              <w:insideH w:val="single" w:sz="4" w:color="BFBFBF"/>
+              <w:insideV w:val="single" w:sz="4" w:color="BFBFBF"/>
+            </w:tcBorders>
+          </w:tcPr>
+          <w:p>
+            <w:r/>
+            <w:r>
+              <w:t>–</w:t>
+            </w:r>
+          </w:p>
+        </w:tc>
+        <w:tc>
+          <w:tcPr>
+            <w:tcW w:type="dxa" w:w="1928"/>
+            <w:tcBorders>
+              <w:top w:val="single" w:sz="4" w:color="BFBFBF"/>
+              <w:left w:val="single" w:sz="4" w:color="BFBFBF"/>
+              <w:bottom w:val="single" w:sz="4" w:color="BFBFBF"/>
+              <w:right w:val="single" w:sz="4" w:color="BFBFBF"/>
+              <w:insideH w:val="single" w:sz="4" w:color="BFBFBF"/>
+              <w:insideV w:val="single" w:sz="4" w:color="BFBFBF"/>
+            </w:tcBorders>
+          </w:tcPr>
+          <w:p>
+            <w:r/>
+            <w:r>
+              <w:t>10%</w:t>
+            </w:r>
+          </w:p>
+        </w:tc>
+        <w:tc>
+          <w:tcPr>
+            <w:tcW w:type="dxa" w:w="1928"/>
+            <w:tcBorders>
+              <w:top w:val="single" w:sz="4" w:color="BFBFBF"/>
+              <w:left w:val="single" w:sz="4" w:color="BFBFBF"/>
+              <w:bottom w:val="single" w:sz="4" w:color="BFBFBF"/>
+              <w:right w:val="single" w:sz="4" w:color="BFBFBF"/>
+              <w:insideH w:val="single" w:sz="4" w:color="BFBFBF"/>
+              <w:insideV w:val="single" w:sz="4" w:color="BFBFBF"/>
+            </w:tcBorders>
+          </w:tcPr>
+          <w:p>
+            <w:r/>
+            <w:r>
+              <w:t>25%</w:t>
+            </w:r>
+          </w:p>
+        </w:tc>
+        <w:tc>
+          <w:tcPr>
+            <w:tcW w:type="dxa" w:w="1928"/>
+            <w:tcBorders>
+              <w:top w:val="single" w:sz="4" w:color="BFBFBF"/>
+              <w:left w:val="single" w:sz="4" w:color="BFBFBF"/>
+              <w:bottom w:val="single" w:sz="4" w:color="BFBFBF"/>
+              <w:right w:val="single" w:sz="4" w:color="BFBFBF"/>
+              <w:insideH w:val="single" w:sz="4" w:color="BFBFBF"/>
+              <w:insideV w:val="single" w:sz="4" w:color="BFBFBF"/>
+            </w:tcBorders>
+          </w:tcPr>
+          <w:p>
+            <w:r/>
+            <w:r>
+              <w:t>50%</w:t>
+            </w:r>
+          </w:p>
+        </w:tc>
+      </w:tr>
+      <w:tr>
+        <w:tc>
+          <w:tcPr>
+            <w:tcW w:type="dxa" w:w="1928"/>
+            <w:tcBorders>
+              <w:top w:val="single" w:sz="4" w:color="BFBFBF"/>
+              <w:left w:val="single" w:sz="4" w:color="BFBFBF"/>
+              <w:bottom w:val="single" w:sz="4" w:color="BFBFBF"/>
+              <w:right w:val="single" w:sz="4" w:color="BFBFBF"/>
+              <w:insideH w:val="single" w:sz="4" w:color="BFBFBF"/>
+              <w:insideV w:val="single" w:sz="4" w:color="BFBFBF"/>
+            </w:tcBorders>
+          </w:tcPr>
+          <w:p>
+            <w:r/>
+            <w:r>
+              <w:t>boundary_edges</w:t>
+            </w:r>
+          </w:p>
+        </w:tc>
+        <w:tc>
+          <w:tcPr>
+            <w:tcW w:type="dxa" w:w="1928"/>
+            <w:tcBorders>
+              <w:top w:val="single" w:sz="4" w:color="BFBFBF"/>
+              <w:left w:val="single" w:sz="4" w:color="BFBFBF"/>
+              <w:bottom w:val="single" w:sz="4" w:color="BFBFBF"/>
+              <w:right w:val="single" w:sz="4" w:color="BFBFBF"/>
+              <w:insideH w:val="single" w:sz="4" w:color="BFBFBF"/>
+              <w:insideV w:val="single" w:sz="4" w:color="BFBFBF"/>
+            </w:tcBorders>
+          </w:tcPr>
+          <w:p>
+            <w:r/>
+            <w:r>
+              <w:t>115935</w:t>
+            </w:r>
+          </w:p>
+        </w:tc>
+        <w:tc>
+          <w:tcPr>
+            <w:tcW w:type="dxa" w:w="1928"/>
+            <w:tcBorders>
+              <w:top w:val="single" w:sz="4" w:color="BFBFBF"/>
+              <w:left w:val="single" w:sz="4" w:color="BFBFBF"/>
+              <w:bottom w:val="single" w:sz="4" w:color="BFBFBF"/>
+              <w:right w:val="single" w:sz="4" w:color="BFBFBF"/>
+              <w:insideH w:val="single" w:sz="4" w:color="BFBFBF"/>
+              <w:insideV w:val="single" w:sz="4" w:color="BFBFBF"/>
+            </w:tcBorders>
+          </w:tcPr>
+          <w:p>
+            <w:r/>
+            <w:r>
+              <w:t>31816</w:t>
+            </w:r>
+          </w:p>
+        </w:tc>
+        <w:tc>
+          <w:tcPr>
+            <w:tcW w:type="dxa" w:w="1928"/>
+            <w:tcBorders>
+              <w:top w:val="single" w:sz="4" w:color="BFBFBF"/>
+              <w:left w:val="single" w:sz="4" w:color="BFBFBF"/>
+              <w:bottom w:val="single" w:sz="4" w:color="BFBFBF"/>
+              <w:right w:val="single" w:sz="4" w:color="BFBFBF"/>
+              <w:insideH w:val="single" w:sz="4" w:color="BFBFBF"/>
+              <w:insideV w:val="single" w:sz="4" w:color="BFBFBF"/>
+            </w:tcBorders>
+          </w:tcPr>
+          <w:p>
+            <w:r/>
+            <w:r>
+              <w:t>75778</w:t>
+            </w:r>
+          </w:p>
+        </w:tc>
+        <w:tc>
+          <w:tcPr>
+            <w:tcW w:type="dxa" w:w="1928"/>
+            <w:tcBorders>
+              <w:top w:val="single" w:sz="4" w:color="BFBFBF"/>
+              <w:left w:val="single" w:sz="4" w:color="BFBFBF"/>
+              <w:bottom w:val="single" w:sz="4" w:color="BFBFBF"/>
+              <w:right w:val="single" w:sz="4" w:color="BFBFBF"/>
+              <w:insideH w:val="single" w:sz="4" w:color="BFBFBF"/>
+              <w:insideV w:val="single" w:sz="4" w:color="BFBFBF"/>
+            </w:tcBorders>
+          </w:tcPr>
+          <w:p>
+            <w:r/>
+            <w:r>
+              <w:t>113938</w:t>
+            </w:r>
+          </w:p>
+        </w:tc>
+      </w:tr>
+      <w:tr>
+        <w:tc>
+          <w:tcPr>
+            <w:tcW w:type="dxa" w:w="1928"/>
+            <w:tcBorders>
+              <w:top w:val="single" w:sz="4" w:color="BFBFBF"/>
+              <w:left w:val="single" w:sz="4" w:color="BFBFBF"/>
+              <w:bottom w:val="single" w:sz="4" w:color="BFBFBF"/>
+              <w:right w:val="single" w:sz="4" w:color="BFBFBF"/>
+              <w:insideH w:val="single" w:sz="4" w:color="BFBFBF"/>
+              <w:insideV w:val="single" w:sz="4" w:color="BFBFBF"/>
+            </w:tcBorders>
+          </w:tcPr>
+          <w:p>
+            <w:r/>
+            <w:r>
+              <w:t>non_manifold_edges</w:t>
+            </w:r>
+          </w:p>
+        </w:tc>
+        <w:tc>
+          <w:tcPr>
+            <w:tcW w:type="dxa" w:w="1928"/>
+            <w:tcBorders>
+              <w:top w:val="single" w:sz="4" w:color="BFBFBF"/>
+              <w:left w:val="single" w:sz="4" w:color="BFBFBF"/>
+              <w:bottom w:val="single" w:sz="4" w:color="BFBFBF"/>
+              <w:right w:val="single" w:sz="4" w:color="BFBFBF"/>
+              <w:insideH w:val="single" w:sz="4" w:color="BFBFBF"/>
+              <w:insideV w:val="single" w:sz="4" w:color="BFBFBF"/>
+            </w:tcBorders>
+          </w:tcPr>
+          <w:p>
+            <w:r/>
+            <w:r>
+              <w:t>0</w:t>
+            </w:r>
+          </w:p>
+        </w:tc>
+        <w:tc>
+          <w:tcPr>
+            <w:tcW w:type="dxa" w:w="1928"/>
+            <w:tcBorders>
+              <w:top w:val="single" w:sz="4" w:color="BFBFBF"/>
+              <w:left w:val="single" w:sz="4" w:color="BFBFBF"/>
+              <w:bottom w:val="single" w:sz="4" w:color="BFBFBF"/>
+              <w:right w:val="single" w:sz="4" w:color="BFBFBF"/>
+              <w:insideH w:val="single" w:sz="4" w:color="BFBFBF"/>
+              <w:insideV w:val="single" w:sz="4" w:color="BFBFBF"/>
+            </w:tcBorders>
+          </w:tcPr>
+          <w:p>
+            <w:r/>
+            <w:r>
+              <w:t>7</w:t>
+            </w:r>
+          </w:p>
+        </w:tc>
+        <w:tc>
+          <w:tcPr>
+            <w:tcW w:type="dxa" w:w="1928"/>
+            <w:tcBorders>
+              <w:top w:val="single" w:sz="4" w:color="BFBFBF"/>
+              <w:left w:val="single" w:sz="4" w:color="BFBFBF"/>
+              <w:bottom w:val="single" w:sz="4" w:color="BFBFBF"/>
+              <w:right w:val="single" w:sz="4" w:color="BFBFBF"/>
+              <w:insideH w:val="single" w:sz="4" w:color="BFBFBF"/>
+              <w:insideV w:val="single" w:sz="4" w:color="BFBFBF"/>
+            </w:tcBorders>
+          </w:tcPr>
+          <w:p>
+            <w:r/>
+            <w:r>
+              <w:t>0</w:t>
+            </w:r>
+          </w:p>
+        </w:tc>
+        <w:tc>
+          <w:tcPr>
+            <w:tcW w:type="dxa" w:w="1928"/>
+            <w:tcBorders>
+              <w:top w:val="single" w:sz="4" w:color="BFBFBF"/>
+              <w:left w:val="single" w:sz="4" w:color="BFBFBF"/>
+              <w:bottom w:val="single" w:sz="4" w:color="BFBFBF"/>
+              <w:right w:val="single" w:sz="4" w:color="BFBFBF"/>
+              <w:insideH w:val="single" w:sz="4" w:color="BFBFBF"/>
+              <w:insideV w:val="single" w:sz="4" w:color="BFBFBF"/>
+            </w:tcBorders>
+          </w:tcPr>
+          <w:p>
+            <w:r/>
+            <w:r>
+              <w:t>0</w:t>
+            </w:r>
+          </w:p>
+        </w:tc>
+      </w:tr>
+      <w:tr>
+        <w:tc>
+          <w:tcPr>
+            <w:tcW w:type="dxa" w:w="1928"/>
+            <w:tcBorders>
+              <w:top w:val="single" w:sz="4" w:color="BFBFBF"/>
+              <w:left w:val="single" w:sz="4" w:color="BFBFBF"/>
+              <w:bottom w:val="single" w:sz="4" w:color="BFBFBF"/>
+              <w:right w:val="single" w:sz="4" w:color="BFBFBF"/>
+              <w:insideH w:val="single" w:sz="4" w:color="BFBFBF"/>
+              <w:insideV w:val="single" w:sz="4" w:color="BFBFBF"/>
+            </w:tcBorders>
+          </w:tcPr>
+          <w:p>
+            <w:r/>
+            <w:r>
+              <w:t>degenerate_faces</w:t>
+            </w:r>
+          </w:p>
+        </w:tc>
+        <w:tc>
+          <w:tcPr>
+            <w:tcW w:type="dxa" w:w="1928"/>
+            <w:tcBorders>
+              <w:top w:val="single" w:sz="4" w:color="BFBFBF"/>
+              <w:left w:val="single" w:sz="4" w:color="BFBFBF"/>
+              <w:bottom w:val="single" w:sz="4" w:color="BFBFBF"/>
+              <w:right w:val="single" w:sz="4" w:color="BFBFBF"/>
+              <w:insideH w:val="single" w:sz="4" w:color="BFBFBF"/>
+              <w:insideV w:val="single" w:sz="4" w:color="BFBFBF"/>
+            </w:tcBorders>
+          </w:tcPr>
+          <w:p>
+            <w:r/>
+            <w:r>
+              <w:t>52</w:t>
+            </w:r>
+          </w:p>
+        </w:tc>
+        <w:tc>
+          <w:tcPr>
+            <w:tcW w:type="dxa" w:w="1928"/>
+            <w:tcBorders>
+              <w:top w:val="single" w:sz="4" w:color="BFBFBF"/>
+              <w:left w:val="single" w:sz="4" w:color="BFBFBF"/>
+              <w:bottom w:val="single" w:sz="4" w:color="BFBFBF"/>
+              <w:right w:val="single" w:sz="4" w:color="BFBFBF"/>
+              <w:insideH w:val="single" w:sz="4" w:color="BFBFBF"/>
+              <w:insideV w:val="single" w:sz="4" w:color="BFBFBF"/>
+            </w:tcBorders>
+          </w:tcPr>
+          <w:p>
+            <w:r/>
+            <w:r>
+              <w:t>0</w:t>
+            </w:r>
+          </w:p>
+        </w:tc>
+        <w:tc>
+          <w:tcPr>
+            <w:tcW w:type="dxa" w:w="1928"/>
+            <w:tcBorders>
+              <w:top w:val="single" w:sz="4" w:color="BFBFBF"/>
+              <w:left w:val="single" w:sz="4" w:color="BFBFBF"/>
+              <w:bottom w:val="single" w:sz="4" w:color="BFBFBF"/>
+              <w:right w:val="single" w:sz="4" w:color="BFBFBF"/>
+              <w:insideH w:val="single" w:sz="4" w:color="BFBFBF"/>
+              <w:insideV w:val="single" w:sz="4" w:color="BFBFBF"/>
+            </w:tcBorders>
+          </w:tcPr>
+          <w:p>
+            <w:r/>
+            <w:r>
+              <w:t>0</w:t>
+            </w:r>
+          </w:p>
+        </w:tc>
+        <w:tc>
+          <w:tcPr>
+            <w:tcW w:type="dxa" w:w="1928"/>
+            <w:tcBorders>
+              <w:top w:val="single" w:sz="4" w:color="BFBFBF"/>
+              <w:left w:val="single" w:sz="4" w:color="BFBFBF"/>
+              <w:bottom w:val="single" w:sz="4" w:color="BFBFBF"/>
+              <w:right w:val="single" w:sz="4" w:color="BFBFBF"/>
+              <w:insideH w:val="single" w:sz="4" w:color="BFBFBF"/>
+              <w:insideV w:val="single" w:sz="4" w:color="BFBFBF"/>
+            </w:tcBorders>
+          </w:tcPr>
+          <w:p>
+            <w:r/>
+            <w:r>
+              <w:t>2</w:t>
+            </w:r>
+          </w:p>
+        </w:tc>
+      </w:tr>
+      <w:tr>
+        <w:tc>
+          <w:tcPr>
+            <w:tcW w:type="dxa" w:w="1928"/>
+            <w:tcBorders>
+              <w:top w:val="single" w:sz="4" w:color="BFBFBF"/>
+              <w:left w:val="single" w:sz="4" w:color="BFBFBF"/>
+              <w:bottom w:val="single" w:sz="4" w:color="BFBFBF"/>
+              <w:right w:val="single" w:sz="4" w:color="BFBFBF"/>
+              <w:insideH w:val="single" w:sz="4" w:color="BFBFBF"/>
+              <w:insideV w:val="single" w:sz="4" w:color="BFBFBF"/>
+            </w:tcBorders>
+          </w:tcPr>
+          <w:p>
+            <w:r/>
+            <w:r>
+              <w:t>island_count</w:t>
+            </w:r>
+          </w:p>
+        </w:tc>
+        <w:tc>
+          <w:tcPr>
+            <w:tcW w:type="dxa" w:w="1928"/>
+            <w:tcBorders>
+              <w:top w:val="single" w:sz="4" w:color="BFBFBF"/>
+              <w:left w:val="single" w:sz="4" w:color="BFBFBF"/>
+              <w:bottom w:val="single" w:sz="4" w:color="BFBFBF"/>
+              <w:right w:val="single" w:sz="4" w:color="BFBFBF"/>
+              <w:insideH w:val="single" w:sz="4" w:color="BFBFBF"/>
+              <w:insideV w:val="single" w:sz="4" w:color="BFBFBF"/>
+            </w:tcBorders>
+          </w:tcPr>
+          <w:p>
+            <w:r/>
+            <w:r>
+              <w:t>22552</w:t>
+            </w:r>
+          </w:p>
+        </w:tc>
+        <w:tc>
+          <w:tcPr>
+            <w:tcW w:type="dxa" w:w="1928"/>
+            <w:tcBorders>
+              <w:top w:val="single" w:sz="4" w:color="BFBFBF"/>
+              <w:left w:val="single" w:sz="4" w:color="BFBFBF"/>
+              <w:bottom w:val="single" w:sz="4" w:color="BFBFBF"/>
+              <w:right w:val="single" w:sz="4" w:color="BFBFBF"/>
+              <w:insideH w:val="single" w:sz="4" w:color="BFBFBF"/>
+              <w:insideV w:val="single" w:sz="4" w:color="BFBFBF"/>
+            </w:tcBorders>
+          </w:tcPr>
+          <w:p>
+            <w:r/>
+            <w:r>
+              <w:t>6485</w:t>
+            </w:r>
+          </w:p>
+        </w:tc>
+        <w:tc>
+          <w:tcPr>
+            <w:tcW w:type="dxa" w:w="1928"/>
+            <w:tcBorders>
+              <w:top w:val="single" w:sz="4" w:color="BFBFBF"/>
+              <w:left w:val="single" w:sz="4" w:color="BFBFBF"/>
+              <w:bottom w:val="single" w:sz="4" w:color="BFBFBF"/>
+              <w:right w:val="single" w:sz="4" w:color="BFBFBF"/>
+              <w:insideH w:val="single" w:sz="4" w:color="BFBFBF"/>
+              <w:insideV w:val="single" w:sz="4" w:color="BFBFBF"/>
+            </w:tcBorders>
+          </w:tcPr>
+          <w:p>
+            <w:r/>
+            <w:r>
+              <w:t>14289</w:t>
+            </w:r>
+          </w:p>
+        </w:tc>
+        <w:tc>
+          <w:tcPr>
+            <w:tcW w:type="dxa" w:w="1928"/>
+            <w:tcBorders>
+              <w:top w:val="single" w:sz="4" w:color="BFBFBF"/>
+              <w:left w:val="single" w:sz="4" w:color="BFBFBF"/>
+              <w:bottom w:val="single" w:sz="4" w:color="BFBFBF"/>
+              <w:right w:val="single" w:sz="4" w:color="BFBFBF"/>
+              <w:insideH w:val="single" w:sz="4" w:color="BFBFBF"/>
+              <w:insideV w:val="single" w:sz="4" w:color="BFBFBF"/>
+            </w:tcBorders>
+          </w:tcPr>
+          <w:p>
+            <w:r/>
+            <w:r>
+              <w:t>23366</w:t>
+            </w:r>
+          </w:p>
+        </w:tc>
+      </w:tr>
+      <w:tr>
+        <w:tc>
+          <w:tcPr>
+            <w:tcW w:type="dxa" w:w="1928"/>
+            <w:tcBorders>
+              <w:top w:val="single" w:sz="4" w:color="BFBFBF"/>
+              <w:left w:val="single" w:sz="4" w:color="BFBFBF"/>
+              <w:bottom w:val="single" w:sz="4" w:color="BFBFBF"/>
+              <w:right w:val="single" w:sz="4" w:color="BFBFBF"/>
+              <w:insideH w:val="single" w:sz="4" w:color="BFBFBF"/>
+              <w:insideV w:val="single" w:sz="4" w:color="BFBFBF"/>
+            </w:tcBorders>
+          </w:tcPr>
+          <w:p>
+            <w:r/>
+            <w:r>
+              <w:t>inverted_normals</w:t>
+            </w:r>
+          </w:p>
+        </w:tc>
+        <w:tc>
+          <w:tcPr>
+            <w:tcW w:type="dxa" w:w="1928"/>
+            <w:tcBorders>
+              <w:top w:val="single" w:sz="4" w:color="BFBFBF"/>
+              <w:left w:val="single" w:sz="4" w:color="BFBFBF"/>
+              <w:bottom w:val="single" w:sz="4" w:color="BFBFBF"/>
+              <w:right w:val="single" w:sz="4" w:color="BFBFBF"/>
+              <w:insideH w:val="single" w:sz="4" w:color="BFBFBF"/>
+              <w:insideV w:val="single" w:sz="4" w:color="BFBFBF"/>
+            </w:tcBorders>
+          </w:tcPr>
+          <w:p>
+            <w:r/>
+            <w:r>
+              <w:t>0</w:t>
+            </w:r>
+          </w:p>
+        </w:tc>
+        <w:tc>
+          <w:tcPr>
+            <w:tcW w:type="dxa" w:w="1928"/>
+            <w:tcBorders>
+              <w:top w:val="single" w:sz="4" w:color="BFBFBF"/>
+              <w:left w:val="single" w:sz="4" w:color="BFBFBF"/>
+              <w:bottom w:val="single" w:sz="4" w:color="BFBFBF"/>
+              <w:right w:val="single" w:sz="4" w:color="BFBFBF"/>
+              <w:insideH w:val="single" w:sz="4" w:color="BFBFBF"/>
+              <w:insideV w:val="single" w:sz="4" w:color="BFBFBF"/>
+            </w:tcBorders>
+          </w:tcPr>
+          <w:p>
+            <w:r/>
+            <w:r>
+              <w:t>8 (0.04%)</w:t>
+            </w:r>
+          </w:p>
+        </w:tc>
+        <w:tc>
+          <w:tcPr>
+            <w:tcW w:type="dxa" w:w="1928"/>
+            <w:tcBorders>
+              <w:top w:val="single" w:sz="4" w:color="BFBFBF"/>
+              <w:left w:val="single" w:sz="4" w:color="BFBFBF"/>
+              <w:bottom w:val="single" w:sz="4" w:color="BFBFBF"/>
+              <w:right w:val="single" w:sz="4" w:color="BFBFBF"/>
+              <w:insideH w:val="single" w:sz="4" w:color="BFBFBF"/>
+              <w:insideV w:val="single" w:sz="4" w:color="BFBFBF"/>
+            </w:tcBorders>
+          </w:tcPr>
+          <w:p>
+            <w:r/>
+            <w:r>
+              <w:t>0</w:t>
+            </w:r>
+          </w:p>
+        </w:tc>
+        <w:tc>
+          <w:tcPr>
+            <w:tcW w:type="dxa" w:w="1928"/>
+            <w:tcBorders>
+              <w:top w:val="single" w:sz="4" w:color="BFBFBF"/>
+              <w:left w:val="single" w:sz="4" w:color="BFBFBF"/>
+              <w:bottom w:val="single" w:sz="4" w:color="BFBFBF"/>
+              <w:right w:val="single" w:sz="4" w:color="BFBFBF"/>
+              <w:insideH w:val="single" w:sz="4" w:color="BFBFBF"/>
+              <w:insideV w:val="single" w:sz="4" w:color="BFBFBF"/>
+            </w:tcBorders>
+          </w:tcPr>
+          <w:p>
+            <w:r/>
+            <w:r>
+              <w:t>0</w:t>
+            </w:r>
+          </w:p>
+        </w:tc>
+      </w:tr>
+      <w:tr>
+        <w:tc>
+          <w:tcPr>
+            <w:tcW w:type="dxa" w:w="1928"/>
+            <w:tcBorders>
+              <w:top w:val="single" w:sz="4" w:color="BFBFBF"/>
+              <w:left w:val="single" w:sz="4" w:color="BFBFBF"/>
+              <w:bottom w:val="single" w:sz="4" w:color="BFBFBF"/>
+              <w:right w:val="single" w:sz="4" w:color="BFBFBF"/>
+              <w:insideH w:val="single" w:sz="4" w:color="BFBFBF"/>
+              <w:insideV w:val="single" w:sz="4" w:color="BFBFBF"/>
+            </w:tcBorders>
+          </w:tcPr>
+          <w:p>
+            <w:r/>
+            <w:r>
+              <w:t>winding_consistent</w:t>
+            </w:r>
+          </w:p>
+        </w:tc>
+        <w:tc>
+          <w:tcPr>
+            <w:tcW w:type="dxa" w:w="1928"/>
+            <w:tcBorders>
+              <w:top w:val="single" w:sz="4" w:color="BFBFBF"/>
+              <w:left w:val="single" w:sz="4" w:color="BFBFBF"/>
+              <w:bottom w:val="single" w:sz="4" w:color="BFBFBF"/>
+              <w:right w:val="single" w:sz="4" w:color="BFBFBF"/>
+              <w:insideH w:val="single" w:sz="4" w:color="BFBFBF"/>
+              <w:insideV w:val="single" w:sz="4" w:color="BFBFBF"/>
+            </w:tcBorders>
+          </w:tcPr>
+          <w:p>
+            <w:r/>
+            <w:r>
+              <w:t>True</w:t>
+            </w:r>
+          </w:p>
+        </w:tc>
+        <w:tc>
+          <w:tcPr>
+            <w:tcW w:type="dxa" w:w="1928"/>
+            <w:tcBorders>
+              <w:top w:val="single" w:sz="4" w:color="BFBFBF"/>
+              <w:left w:val="single" w:sz="4" w:color="BFBFBF"/>
+              <w:bottom w:val="single" w:sz="4" w:color="BFBFBF"/>
+              <w:right w:val="single" w:sz="4" w:color="BFBFBF"/>
+              <w:insideH w:val="single" w:sz="4" w:color="BFBFBF"/>
+              <w:insideV w:val="single" w:sz="4" w:color="BFBFBF"/>
+            </w:tcBorders>
+          </w:tcPr>
+          <w:p>
+            <w:r/>
+            <w:r>
+              <w:t>True</w:t>
+            </w:r>
+          </w:p>
+        </w:tc>
+        <w:tc>
+          <w:tcPr>
+            <w:tcW w:type="dxa" w:w="1928"/>
+            <w:tcBorders>
+              <w:top w:val="single" w:sz="4" w:color="BFBFBF"/>
+              <w:left w:val="single" w:sz="4" w:color="BFBFBF"/>
+              <w:bottom w:val="single" w:sz="4" w:color="BFBFBF"/>
+              <w:right w:val="single" w:sz="4" w:color="BFBFBF"/>
+              <w:insideH w:val="single" w:sz="4" w:color="BFBFBF"/>
+              <w:insideV w:val="single" w:sz="4" w:color="BFBFBF"/>
+            </w:tcBorders>
+          </w:tcPr>
+          <w:p>
+            <w:r/>
+            <w:r>
+              <w:t>False</w:t>
+            </w:r>
+          </w:p>
+        </w:tc>
+        <w:tc>
+          <w:tcPr>
+            <w:tcW w:type="dxa" w:w="1928"/>
+            <w:tcBorders>
+              <w:top w:val="single" w:sz="4" w:color="BFBFBF"/>
+              <w:left w:val="single" w:sz="4" w:color="BFBFBF"/>
+              <w:bottom w:val="single" w:sz="4" w:color="BFBFBF"/>
+              <w:right w:val="single" w:sz="4" w:color="BFBFBF"/>
+              <w:insideH w:val="single" w:sz="4" w:color="BFBFBF"/>
+              <w:insideV w:val="single" w:sz="4" w:color="BFBFBF"/>
+            </w:tcBorders>
+          </w:tcPr>
+          <w:p>
+            <w:r/>
+            <w:r>
+              <w:t>True</w:t>
+            </w:r>
+          </w:p>
+        </w:tc>
+      </w:tr>
+    </w:tbl>
+    <w:p>
+      <w:r>
+        <w:rPr>
+          <w:b/>
+        </w:rPr>
+        <w:t>Finding：face_count 達不到目標 ratio。</w:t>
+      </w:r>
+      <w:r>
+        <w:t xml:space="preserve"> 這是 </w:t>
+      </w:r>
+      <w:r>
+        <w:rPr>
+          <w:b/>
+        </w:rPr>
+        <w:t>boundary preservation + delimit 4 集合 (MAT/SHARP/SEAM/UV)</w:t>
+      </w:r>
+      <w:r>
+        <w:t xml:space="preserve"> 的副作用 — 太多 edge 被保護 → COLLAPSE 砍不下去。</w:t>
+      </w:r>
+    </w:p>
+    <w:p>
+      <w:r>
+        <w:rPr>
+          <w:b/>
+        </w:rPr>
+        <w:t>這是設計取捨，不是 bug</w:t>
+      </w:r>
+      <w:r>
+        <w:t xml:space="preserve">：保 boundary（視覺完整 / 邊緣連續）跟達到 face budget 兩條目標衝突。如果 face budget 是硬限制，可以放寬 delimit（例如改 </w:t>
+      </w:r>
+      <w:r>
+        <w:rPr>
+          <w:rFonts w:ascii="Consolas" w:hAnsi="Consolas"/>
+          <w:color w:val="C7254E"/>
+          <w:sz w:val="20"/>
+        </w:rPr>
+        <w:t>delimit={MATERIAL}</w:t>
+      </w:r>
+      <w:r>
+        <w:t xml:space="preserve"> 只保護材質邊界），但會犧牲視覺完整性。對「完整 &gt; 細節」的 LOD 場景，當前取捨是對的。</w:t>
+      </w:r>
+    </w:p>
+    <w:p>
+      <w:r>
+        <w:rPr>
+          <w:b/>
+        </w:rPr>
+        <w:t>Finding：TIER 1 偵測到 8 inverted + 7 non_manifold（0.04% / 0.02%）</w:t>
+      </w:r>
+      <w:r>
+        <w:t>。極端 ratio 的 COLLAPSE 偶發 fold-over，量微小，視覺看不到，但量化指標誠實揭露。</w:t>
+      </w:r>
+    </w:p>
+    <w:p>
+      <w:r>
+        <w:rPr>
+          <w:b/>
+        </w:rPr>
+        <w:t>Finding：TIER 2 winding_consistent 變 False</w:t>
+      </w:r>
+      <w:r>
+        <w:t>。multi-material face 邊界處的 winding 順序不一致，不是法向方向錯（inverted=0），不影響視覺。</w:t>
+      </w:r>
+    </w:p>
+    <w:p>
+      <w:pPr>
+        <w:pStyle w:val="Heading3"/>
+      </w:pPr>
+      <w:r>
+        <w:t>6.8.3 三檔 LOD 跟原檔的 deviation 對比</w:t>
+      </w:r>
+    </w:p>
+    <w:tbl>
+      <w:tblPr>
+        <w:tblStyle w:val="TableGrid"/>
+        <w:tblW w:type="auto" w:w="0"/>
+        <w:jc w:val="left"/>
+        <w:tblLook w:firstColumn="1" w:firstRow="1" w:lastColumn="0" w:lastRow="0" w:noHBand="0" w:noVBand="1" w:val="04A0"/>
+      </w:tblPr>
+      <w:tblGrid>
+        <w:gridCol w:w="2409"/>
+        <w:gridCol w:w="2409"/>
+        <w:gridCol w:w="2409"/>
+        <w:gridCol w:w="2409"/>
+      </w:tblGrid>
+      <w:tr>
+        <w:tc>
+          <w:tcPr>
+            <w:tcW w:type="dxa" w:w="2409"/>
+            <w:tcBorders>
+              <w:top w:val="single" w:sz="4" w:color="BFBFBF"/>
+              <w:left w:val="single" w:sz="4" w:color="BFBFBF"/>
+              <w:bottom w:val="single" w:sz="4" w:color="BFBFBF"/>
+              <w:right w:val="single" w:sz="4" w:color="BFBFBF"/>
+              <w:insideH w:val="single" w:sz="4" w:color="BFBFBF"/>
+              <w:insideV w:val="single" w:sz="4" w:color="BFBFBF"/>
+            </w:tcBorders>
+            <w:shd w:val="clear" w:color="auto" w:fill="F6F8FA"/>
+          </w:tcPr>
+          <w:p>
+            <w:r>
+              <w:rPr>
+                <w:b/>
+              </w:rPr>
+            </w:r>
+            <w:r>
+              <w:rPr>
+                <w:b/>
+              </w:rPr>
+              <w:t>指標</w:t>
+            </w:r>
+          </w:p>
+        </w:tc>
+        <w:tc>
+          <w:tcPr>
+            <w:tcW w:type="dxa" w:w="2409"/>
+            <w:tcBorders>
+              <w:top w:val="single" w:sz="4" w:color="BFBFBF"/>
+              <w:left w:val="single" w:sz="4" w:color="BFBFBF"/>
+              <w:bottom w:val="single" w:sz="4" w:color="BFBFBF"/>
+              <w:right w:val="single" w:sz="4" w:color="BFBFBF"/>
+              <w:insideH w:val="single" w:sz="4" w:color="BFBFBF"/>
+              <w:insideV w:val="single" w:sz="4" w:color="BFBFBF"/>
+            </w:tcBorders>
+            <w:shd w:val="clear" w:color="auto" w:fill="F6F8FA"/>
+          </w:tcPr>
+          <w:p>
+            <w:r>
+              <w:rPr>
+                <w:b/>
+              </w:rPr>
+            </w:r>
+            <w:r>
+              <w:rPr>
+                <w:b/>
+              </w:rPr>
+              <w:t>TIER 1</w:t>
+            </w:r>
+          </w:p>
+        </w:tc>
+        <w:tc>
+          <w:tcPr>
+            <w:tcW w:type="dxa" w:w="2409"/>
+            <w:tcBorders>
+              <w:top w:val="single" w:sz="4" w:color="BFBFBF"/>
+              <w:left w:val="single" w:sz="4" w:color="BFBFBF"/>
+              <w:bottom w:val="single" w:sz="4" w:color="BFBFBF"/>
+              <w:right w:val="single" w:sz="4" w:color="BFBFBF"/>
+              <w:insideH w:val="single" w:sz="4" w:color="BFBFBF"/>
+              <w:insideV w:val="single" w:sz="4" w:color="BFBFBF"/>
+            </w:tcBorders>
+            <w:shd w:val="clear" w:color="auto" w:fill="F6F8FA"/>
+          </w:tcPr>
+          <w:p>
+            <w:r>
+              <w:rPr>
+                <w:b/>
+              </w:rPr>
+            </w:r>
+            <w:r>
+              <w:rPr>
+                <w:b/>
+              </w:rPr>
+              <w:t>TIER 2</w:t>
+            </w:r>
+          </w:p>
+        </w:tc>
+        <w:tc>
+          <w:tcPr>
+            <w:tcW w:type="dxa" w:w="2409"/>
+            <w:tcBorders>
+              <w:top w:val="single" w:sz="4" w:color="BFBFBF"/>
+              <w:left w:val="single" w:sz="4" w:color="BFBFBF"/>
+              <w:bottom w:val="single" w:sz="4" w:color="BFBFBF"/>
+              <w:right w:val="single" w:sz="4" w:color="BFBFBF"/>
+              <w:insideH w:val="single" w:sz="4" w:color="BFBFBF"/>
+              <w:insideV w:val="single" w:sz="4" w:color="BFBFBF"/>
+            </w:tcBorders>
+            <w:shd w:val="clear" w:color="auto" w:fill="F6F8FA"/>
+          </w:tcPr>
+          <w:p>
+            <w:r>
+              <w:rPr>
+                <w:b/>
+              </w:rPr>
+            </w:r>
+            <w:r>
+              <w:rPr>
+                <w:b/>
+              </w:rPr>
+              <w:t>TIER 3</w:t>
+            </w:r>
+          </w:p>
+        </w:tc>
+      </w:tr>
+      <w:tr>
+        <w:tc>
+          <w:tcPr>
+            <w:tcW w:type="dxa" w:w="2409"/>
+            <w:tcBorders>
+              <w:top w:val="single" w:sz="4" w:color="BFBFBF"/>
+              <w:left w:val="single" w:sz="4" w:color="BFBFBF"/>
+              <w:bottom w:val="single" w:sz="4" w:color="BFBFBF"/>
+              <w:right w:val="single" w:sz="4" w:color="BFBFBF"/>
+              <w:insideH w:val="single" w:sz="4" w:color="BFBFBF"/>
+              <w:insideV w:val="single" w:sz="4" w:color="BFBFBF"/>
+            </w:tcBorders>
+          </w:tcPr>
+          <w:p>
+            <w:r/>
+            <w:r>
+              <w:rPr>
+                <w:b/>
+              </w:rPr>
+              <w:t>hausdorff_max</w:t>
+            </w:r>
+          </w:p>
+        </w:tc>
+        <w:tc>
+          <w:tcPr>
+            <w:tcW w:type="dxa" w:w="2409"/>
+            <w:tcBorders>
+              <w:top w:val="single" w:sz="4" w:color="BFBFBF"/>
+              <w:left w:val="single" w:sz="4" w:color="BFBFBF"/>
+              <w:bottom w:val="single" w:sz="4" w:color="BFBFBF"/>
+              <w:right w:val="single" w:sz="4" w:color="BFBFBF"/>
+              <w:insideH w:val="single" w:sz="4" w:color="BFBFBF"/>
+              <w:insideV w:val="single" w:sz="4" w:color="BFBFBF"/>
+            </w:tcBorders>
+          </w:tcPr>
+          <w:p>
+            <w:r/>
+            <w:r>
+              <w:rPr>
+                <w:b/>
+              </w:rPr>
+              <w:t>0.187 (8.16%)</w:t>
+            </w:r>
+          </w:p>
+        </w:tc>
+        <w:tc>
+          <w:tcPr>
+            <w:tcW w:type="dxa" w:w="2409"/>
+            <w:tcBorders>
+              <w:top w:val="single" w:sz="4" w:color="BFBFBF"/>
+              <w:left w:val="single" w:sz="4" w:color="BFBFBF"/>
+              <w:bottom w:val="single" w:sz="4" w:color="BFBFBF"/>
+              <w:right w:val="single" w:sz="4" w:color="BFBFBF"/>
+              <w:insideH w:val="single" w:sz="4" w:color="BFBFBF"/>
+              <w:insideV w:val="single" w:sz="4" w:color="BFBFBF"/>
+            </w:tcBorders>
+          </w:tcPr>
+          <w:p>
+            <w:r/>
+            <w:r>
+              <w:rPr>
+                <w:b/>
+              </w:rPr>
+              <w:t>0.186 (8.12%)</w:t>
+            </w:r>
+          </w:p>
+        </w:tc>
+        <w:tc>
+          <w:tcPr>
+            <w:tcW w:type="dxa" w:w="2409"/>
+            <w:tcBorders>
+              <w:top w:val="single" w:sz="4" w:color="BFBFBF"/>
+              <w:left w:val="single" w:sz="4" w:color="BFBFBF"/>
+              <w:bottom w:val="single" w:sz="4" w:color="BFBFBF"/>
+              <w:right w:val="single" w:sz="4" w:color="BFBFBF"/>
+              <w:insideH w:val="single" w:sz="4" w:color="BFBFBF"/>
+              <w:insideV w:val="single" w:sz="4" w:color="BFBFBF"/>
+            </w:tcBorders>
+          </w:tcPr>
+          <w:p>
+            <w:r/>
+            <w:r>
+              <w:rPr>
+                <w:b/>
+              </w:rPr>
+              <w:t>0.186 (8.12%)</w:t>
+            </w:r>
+          </w:p>
+        </w:tc>
+      </w:tr>
+      <w:tr>
+        <w:tc>
+          <w:tcPr>
+            <w:tcW w:type="dxa" w:w="2409"/>
+            <w:tcBorders>
+              <w:top w:val="single" w:sz="4" w:color="BFBFBF"/>
+              <w:left w:val="single" w:sz="4" w:color="BFBFBF"/>
+              <w:bottom w:val="single" w:sz="4" w:color="BFBFBF"/>
+              <w:right w:val="single" w:sz="4" w:color="BFBFBF"/>
+              <w:insideH w:val="single" w:sz="4" w:color="BFBFBF"/>
+              <w:insideV w:val="single" w:sz="4" w:color="BFBFBF"/>
+            </w:tcBorders>
+          </w:tcPr>
+          <w:p>
+            <w:r/>
+            <w:r>
+              <w:t>chamfer</w:t>
+            </w:r>
+          </w:p>
+        </w:tc>
+        <w:tc>
+          <w:tcPr>
+            <w:tcW w:type="dxa" w:w="2409"/>
+            <w:tcBorders>
+              <w:top w:val="single" w:sz="4" w:color="BFBFBF"/>
+              <w:left w:val="single" w:sz="4" w:color="BFBFBF"/>
+              <w:bottom w:val="single" w:sz="4" w:color="BFBFBF"/>
+              <w:right w:val="single" w:sz="4" w:color="BFBFBF"/>
+              <w:insideH w:val="single" w:sz="4" w:color="BFBFBF"/>
+              <w:insideV w:val="single" w:sz="4" w:color="BFBFBF"/>
+            </w:tcBorders>
+          </w:tcPr>
+          <w:p>
+            <w:r/>
+            <w:r>
+              <w:t>0.0018 (0.080%)</w:t>
+            </w:r>
+          </w:p>
+        </w:tc>
+        <w:tc>
+          <w:tcPr>
+            <w:tcW w:type="dxa" w:w="2409"/>
+            <w:tcBorders>
+              <w:top w:val="single" w:sz="4" w:color="BFBFBF"/>
+              <w:left w:val="single" w:sz="4" w:color="BFBFBF"/>
+              <w:bottom w:val="single" w:sz="4" w:color="BFBFBF"/>
+              <w:right w:val="single" w:sz="4" w:color="BFBFBF"/>
+              <w:insideH w:val="single" w:sz="4" w:color="BFBFBF"/>
+              <w:insideV w:val="single" w:sz="4" w:color="BFBFBF"/>
+            </w:tcBorders>
+          </w:tcPr>
+          <w:p>
+            <w:r/>
+            <w:r>
+              <w:t>0.0010 (0.045%)</w:t>
+            </w:r>
+          </w:p>
+        </w:tc>
+        <w:tc>
+          <w:tcPr>
+            <w:tcW w:type="dxa" w:w="2409"/>
+            <w:tcBorders>
+              <w:top w:val="single" w:sz="4" w:color="BFBFBF"/>
+              <w:left w:val="single" w:sz="4" w:color="BFBFBF"/>
+              <w:bottom w:val="single" w:sz="4" w:color="BFBFBF"/>
+              <w:right w:val="single" w:sz="4" w:color="BFBFBF"/>
+              <w:insideH w:val="single" w:sz="4" w:color="BFBFBF"/>
+              <w:insideV w:val="single" w:sz="4" w:color="BFBFBF"/>
+            </w:tcBorders>
+          </w:tcPr>
+          <w:p>
+            <w:r/>
+            <w:r>
+              <w:t>0.0013 (0.055%)</w:t>
+            </w:r>
+          </w:p>
+        </w:tc>
+      </w:tr>
+      <w:tr>
+        <w:tc>
+          <w:tcPr>
+            <w:tcW w:type="dxa" w:w="2409"/>
+            <w:tcBorders>
+              <w:top w:val="single" w:sz="4" w:color="BFBFBF"/>
+              <w:left w:val="single" w:sz="4" w:color="BFBFBF"/>
+              <w:bottom w:val="single" w:sz="4" w:color="BFBFBF"/>
+              <w:right w:val="single" w:sz="4" w:color="BFBFBF"/>
+              <w:insideH w:val="single" w:sz="4" w:color="BFBFBF"/>
+              <w:insideV w:val="single" w:sz="4" w:color="BFBFBF"/>
+            </w:tcBorders>
+          </w:tcPr>
+          <w:p>
+            <w:r/>
+            <w:r>
+              <w:rPr>
+                <w:b/>
+              </w:rPr>
+              <w:t>mean_normal_dev_deg</w:t>
+            </w:r>
+          </w:p>
+        </w:tc>
+        <w:tc>
+          <w:tcPr>
+            <w:tcW w:type="dxa" w:w="2409"/>
+            <w:tcBorders>
+              <w:top w:val="single" w:sz="4" w:color="BFBFBF"/>
+              <w:left w:val="single" w:sz="4" w:color="BFBFBF"/>
+              <w:bottom w:val="single" w:sz="4" w:color="BFBFBF"/>
+              <w:right w:val="single" w:sz="4" w:color="BFBFBF"/>
+              <w:insideH w:val="single" w:sz="4" w:color="BFBFBF"/>
+              <w:insideV w:val="single" w:sz="4" w:color="BFBFBF"/>
+            </w:tcBorders>
+          </w:tcPr>
+          <w:p>
+            <w:r/>
+            <w:r>
+              <w:rPr>
+                <w:b/>
+              </w:rPr>
+              <w:t>12.06°</w:t>
+            </w:r>
+          </w:p>
+        </w:tc>
+        <w:tc>
+          <w:tcPr>
+            <w:tcW w:type="dxa" w:w="2409"/>
+            <w:tcBorders>
+              <w:top w:val="single" w:sz="4" w:color="BFBFBF"/>
+              <w:left w:val="single" w:sz="4" w:color="BFBFBF"/>
+              <w:bottom w:val="single" w:sz="4" w:color="BFBFBF"/>
+              <w:right w:val="single" w:sz="4" w:color="BFBFBF"/>
+              <w:insideH w:val="single" w:sz="4" w:color="BFBFBF"/>
+              <w:insideV w:val="single" w:sz="4" w:color="BFBFBF"/>
+            </w:tcBorders>
+          </w:tcPr>
+          <w:p>
+            <w:r/>
+            <w:r>
+              <w:rPr>
+                <w:b/>
+              </w:rPr>
+              <w:t>6.95°</w:t>
+            </w:r>
+          </w:p>
+        </w:tc>
+        <w:tc>
+          <w:tcPr>
+            <w:tcW w:type="dxa" w:w="2409"/>
+            <w:tcBorders>
+              <w:top w:val="single" w:sz="4" w:color="BFBFBF"/>
+              <w:left w:val="single" w:sz="4" w:color="BFBFBF"/>
+              <w:bottom w:val="single" w:sz="4" w:color="BFBFBF"/>
+              <w:right w:val="single" w:sz="4" w:color="BFBFBF"/>
+              <w:insideH w:val="single" w:sz="4" w:color="BFBFBF"/>
+              <w:insideV w:val="single" w:sz="4" w:color="BFBFBF"/>
+            </w:tcBorders>
+          </w:tcPr>
+          <w:p>
+            <w:r/>
+            <w:r>
+              <w:rPr>
+                <w:b/>
+              </w:rPr>
+              <w:t>1.61°</w:t>
+            </w:r>
+          </w:p>
+        </w:tc>
+      </w:tr>
+    </w:tbl>
+    <w:p>
+      <w:pPr>
+        <w:pStyle w:val="Heading3"/>
+      </w:pPr>
+      <w:r>
+        <w:t>6.8.4 五個 quantitative insight</w:t>
+      </w:r>
+    </w:p>
+    <w:p>
+      <w:r>
+        <w:rPr>
+          <w:b/>
+        </w:rPr>
+        <w:t>Insight 1：Hausdorff 三檔幾乎一樣（8.12%–8.16%）— 不適合用來比 LOD 質量</w:t>
+      </w:r>
+    </w:p>
+    <w:p>
+      <w:r>
+        <w:t xml:space="preserve">0.187 m / 2.295 m = 8.16% 對應的是 </w:t>
+      </w:r>
+      <w:r>
+        <w:rPr>
+          <w:b/>
+        </w:rPr>
+        <w:t>cull-disjoint 砍掉的小零件大小</w:t>
+      </w:r>
+      <w:r>
+        <w:t>。三檔 cull 設定不同但都砍掉同類零件（螺絲蓋、漂浮機構），所以 Hausdorff 一致。</w:t>
+      </w:r>
+      <w:r>
+        <w:rPr>
+          <w:b/>
+        </w:rPr>
+        <w:t>這指標反映 cull 行為，不是 collapse 偏差。</w:t>
+      </w:r>
+    </w:p>
+    <w:p>
+      <w:r>
+        <w:rPr>
+          <w:b/>
+        </w:rPr>
+        <w:t>Insight 2：Chamfer 不單調（TIER 2 &lt; TIER 3 &lt; TIER 1）</w:t>
+      </w:r>
+    </w:p>
+    <w:p>
+      <w:r>
+        <w:t>違背「face 越多越像」的直覺。解釋：TIER 3 雖 face 多但 fill_holes 補的位置貢獻 r→o 距離；TIER 2 取得 fill 跟保形的最佳平衡。這個現象只有量化指標看得出來，視覺判斷不到。</w:t>
+      </w:r>
+    </w:p>
+    <w:p>
+      <w:r>
+        <w:rPr>
+          <w:b/>
+        </w:rPr>
+        <w:t>Insight 3：Mean normal deviation 是 LOD 質量的真 KPI</w:t>
+      </w:r>
+    </w:p>
+    <w:p>
+      <w:r>
+        <w:t xml:space="preserve">12.06° / 6.95° / 1.61° </w:t>
+      </w:r>
+      <w:r>
+        <w:rPr>
+          <w:b/>
+        </w:rPr>
+        <w:t>完美單調、跟 face_count 一致、跟視覺感受一致</w:t>
+      </w:r>
+      <w:r>
+        <w:t>。是三個指標中</w:t>
+      </w:r>
+      <w:r>
+        <w:rPr>
+          <w:b/>
+        </w:rPr>
+        <w:t>唯一能線性反映 LOD 質量</w:t>
+      </w:r>
+      <w:r>
+        <w:t>的。</w:t>
+      </w:r>
+    </w:p>
+    <w:p>
+      <w:r>
+        <w:rPr>
+          <w:b/>
+        </w:rPr>
+        <w:t>Insight 4：face_count 達不到目標 ratio</w:t>
+      </w:r>
+    </w:p>
+    <w:p>
+      <w:r>
+        <w:t>設計取捨。詳見 §6.8.2 解讀。</w:t>
+      </w:r>
+    </w:p>
+    <w:p>
+      <w:r>
+        <w:rPr>
+          <w:b/>
+        </w:rPr>
+        <w:t>Insight 5：Reduce 偶發產生少量法向/拓樸副產物（TIER 1）</w:t>
+      </w:r>
+    </w:p>
+    <w:p>
+      <w:r>
+        <w:t>8 inverted + 7 non_manifold = 0.04%/0.02%，極端 collapse 的 fold-over 副作用。視覺不可見、量化誠實。</w:t>
+      </w:r>
+    </w:p>
+    <w:p>
+      <w:pPr>
+        <w:pStyle w:val="Heading3"/>
+      </w:pPr>
+      <w:r>
+        <w:t>6.8.5 從直覺到證據的方法論</w:t>
+      </w:r>
+    </w:p>
+    <w:p>
+      <w:pPr>
+        <w:pStyle w:val="ListBullet"/>
+        <w:ind w:left="340"/>
+      </w:pPr>
+      <w:r>
+        <w:rPr>
+          <w:b/>
+        </w:rPr>
+        <w:t>Phase 1 早期</w:t>
+      </w:r>
+      <w:r>
+        <w:t xml:space="preserve">：靠視覺對比 9 組實驗（A1-A4 / B1-B3 / X1-X2）找到 ratio + cull + fill 甜蜜點 — </w:t>
+      </w:r>
+      <w:r>
+        <w:rPr>
+          <w:b/>
+        </w:rPr>
+        <w:t>直覺 + 經驗</w:t>
+      </w:r>
+    </w:p>
+    <w:p>
+      <w:pPr>
+        <w:pStyle w:val="ListBullet"/>
+        <w:ind w:left="340"/>
+      </w:pPr>
+      <w:r>
+        <w:rPr>
+          <w:b/>
+        </w:rPr>
+        <w:t>Phase 1 後期</w:t>
+      </w:r>
+      <w:r>
+        <w:t xml:space="preserve">：加 boundary preservation + smart fill — </w:t>
+      </w:r>
+      <w:r>
+        <w:rPr>
+          <w:b/>
+        </w:rPr>
+        <w:t>設計哲學（治本+補救）驅動</w:t>
+      </w:r>
+    </w:p>
+    <w:p>
+      <w:pPr>
+        <w:pStyle w:val="ListBullet"/>
+        <w:ind w:left="340"/>
+      </w:pPr>
+      <w:r>
+        <w:rPr>
+          <w:b/>
+        </w:rPr>
+        <w:t>Phase 1 收尾</w:t>
+      </w:r>
+      <w:r>
+        <w:t xml:space="preserve">：實作 diagnose + diff，跑 5Axis baseline — </w:t>
+      </w:r>
+      <w:r>
+        <w:rPr>
+          <w:b/>
+        </w:rPr>
+        <w:t>量化證據驗證</w:t>
+      </w:r>
+    </w:p>
+    <w:p>
+      <w:r>
+        <w:t>這份 baseline 不是用來修改 preset 的（視覺判斷已經給出最佳組合），而是把過去靠肉眼判斷的事</w:t>
+      </w:r>
+      <w:r>
+        <w:rPr>
+          <w:b/>
+        </w:rPr>
+        <w:t>用數字佐證</w:t>
+      </w:r>
+      <w:r>
+        <w:t>：原檔有 22552 islands、115935 boundary edges 是 quantitative root cause；boundary preservation + smart fill 在這個原檔上的對應行為可在 diff 數字裡看到。</w:t>
+      </w:r>
+    </w:p>
+    <w:p>
+      <w:r>
+        <w:t xml:space="preserve">未來若有新的工業 CAD FBX：先 </w:t>
+      </w:r>
+      <w:r>
+        <w:rPr>
+          <w:rFonts w:ascii="Consolas" w:hAnsi="Consolas"/>
+          <w:color w:val="C7254E"/>
+          <w:sz w:val="20"/>
+        </w:rPr>
+        <w:t>diamesh diagnose</w:t>
+      </w:r>
+      <w:r>
+        <w:t xml:space="preserve"> 看病理 → reduce 三檔 → </w:t>
+      </w:r>
+      <w:r>
+        <w:rPr>
+          <w:rFonts w:ascii="Consolas" w:hAnsi="Consolas"/>
+          <w:color w:val="C7254E"/>
+          <w:sz w:val="20"/>
+        </w:rPr>
+        <w:t>diamesh diff</w:t>
+      </w:r>
+      <w:r>
+        <w:t xml:space="preserve"> 對齊 normal_dev 等可信 KPI。</w:t>
       </w:r>
     </w:p>
     <w:p>

</xml_diff>

<commit_message>
docs(user-guide): sync A-class mesh repair upgrades (B3+B4+C2+C1)
* §5.3 Stage 0 table updated:
  - Step 0 (Weld) now documents adaptive tolerance (B3)
  - New Step F: Non-manifold fix opt-in (B4)
* §6.6 adds --fill-holes-smooth section (C2)
  - Iter / factor knobs explained
  - When to enable (curved enclosures) vs skip (flat panels)
* §6.8.1 病理-stage map adds three new rows:
  - Adaptive weld for cross-machine sizes
  - Smooth for patch bandage feel
  - Non-manifold for 3-patch junctions
  Plus self-intersection paragraph: detect-only by design
* Appendix command reference adds:
  - `diamesh diagnose` (was missing)
  - A-class advanced flags example with inline comments

PDF/DOCX regenerated. Version date bumped to 2026-05-03.

Co-Authored-By: Claude Opus 4.7 (1M context) <noreply@anthropic.com>
</commit_message>
<xml_diff>
--- a/docs/USER_GUIDE.docx
+++ b/docs/USER_GUIDE.docx
@@ -3289,7 +3289,16 @@
           <w:p>
             <w:r/>
             <w:r>
-              <w:t>0. Weld</w:t>
+              <w:t>0. Weld（</w:t>
+            </w:r>
+            <w:r>
+              <w:rPr>
+                <w:b/>
+              </w:rPr>
+              <w:t>adaptive</w:t>
+            </w:r>
+            <w:r>
+              <w:t>）</w:t>
             </w:r>
           </w:p>
         </w:tc>
@@ -3313,7 +3322,7 @@
                 <w:color w:val="C7254E"/>
                 <w:sz w:val="20"/>
               </w:rPr>
-              <w:t>remove_doubles(dist=0.1mm)</w:t>
+              <w:t>remove_doubles(dist=bbox_diag × frac)</w:t>
             </w:r>
           </w:p>
         </w:tc>
@@ -3332,7 +3341,29 @@
           <w:p>
             <w:r/>
             <w:r>
-              <w:t>CAD-patch seam 跟 cross-part 接觸面對齊</w:t>
+              <w:t xml:space="preserve">CAD-patch seam 跟 cross-part 接觸面對齊。Tolerance 自動縮放：2 m 機台 ≈ 0.1 mm、5 m 機台 ≈ 0.25 mm、30 cm 部件 ≈ 0.015 mm。可用 </w:t>
+            </w:r>
+            <w:r>
+              <w:rPr>
+                <w:rFonts w:ascii="Consolas" w:hAnsi="Consolas"/>
+                <w:color w:val="C7254E"/>
+                <w:sz w:val="20"/>
+              </w:rPr>
+              <w:t>--weld-tolerance-frac</w:t>
+            </w:r>
+            <w:r>
+              <w:t xml:space="preserve"> (default 5e-5) 或 </w:t>
+            </w:r>
+            <w:r>
+              <w:rPr>
+                <w:rFonts w:ascii="Consolas" w:hAnsi="Consolas"/>
+                <w:color w:val="C7254E"/>
+                <w:sz w:val="20"/>
+              </w:rPr>
+              <w:t>--weld-tolerance-abs</w:t>
+            </w:r>
+            <w:r>
+              <w:t xml:space="preserve"> 覆寫</w:t>
             </w:r>
           </w:p>
         </w:tc>
@@ -3598,6 +3629,103 @@
             <w:r/>
             <w:r>
               <w:t>混合 quad/ngon → 純 tri，COLLAPSE 行為一致</w:t>
+            </w:r>
+          </w:p>
+        </w:tc>
+      </w:tr>
+      <w:tr>
+        <w:tc>
+          <w:tcPr>
+            <w:tcW w:type="dxa" w:w="3213"/>
+            <w:tcBorders>
+              <w:top w:val="single" w:sz="4" w:color="BFBFBF"/>
+              <w:left w:val="single" w:sz="4" w:color="BFBFBF"/>
+              <w:bottom w:val="single" w:sz="4" w:color="BFBFBF"/>
+              <w:right w:val="single" w:sz="4" w:color="BFBFBF"/>
+              <w:insideH w:val="single" w:sz="4" w:color="BFBFBF"/>
+              <w:insideV w:val="single" w:sz="4" w:color="BFBFBF"/>
+            </w:tcBorders>
+          </w:tcPr>
+          <w:p>
+            <w:r/>
+            <w:r>
+              <w:t>F. Non-manifold fix（opt-in）</w:t>
+            </w:r>
+          </w:p>
+        </w:tc>
+        <w:tc>
+          <w:tcPr>
+            <w:tcW w:type="dxa" w:w="3213"/>
+            <w:tcBorders>
+              <w:top w:val="single" w:sz="4" w:color="BFBFBF"/>
+              <w:left w:val="single" w:sz="4" w:color="BFBFBF"/>
+              <w:bottom w:val="single" w:sz="4" w:color="BFBFBF"/>
+              <w:right w:val="single" w:sz="4" w:color="BFBFBF"/>
+              <w:insideH w:val="single" w:sz="4" w:color="BFBFBF"/>
+              <w:insideV w:val="single" w:sz="4" w:color="BFBFBF"/>
+            </w:tcBorders>
+          </w:tcPr>
+          <w:p>
+            <w:r/>
+            <w:r>
+              <w:rPr>
+                <w:rFonts w:ascii="Consolas" w:hAnsi="Consolas"/>
+                <w:color w:val="C7254E"/>
+                <w:sz w:val="20"/>
+              </w:rPr>
+              <w:t>dissolve_edges(non-manifold)</w:t>
+            </w:r>
+          </w:p>
+        </w:tc>
+        <w:tc>
+          <w:tcPr>
+            <w:tcW w:type="dxa" w:w="3213"/>
+            <w:tcBorders>
+              <w:top w:val="single" w:sz="4" w:color="BFBFBF"/>
+              <w:left w:val="single" w:sz="4" w:color="BFBFBF"/>
+              <w:bottom w:val="single" w:sz="4" w:color="BFBFBF"/>
+              <w:right w:val="single" w:sz="4" w:color="BFBFBF"/>
+              <w:insideH w:val="single" w:sz="4" w:color="BFBFBF"/>
+              <w:insideV w:val="single" w:sz="4" w:color="BFBFBF"/>
+            </w:tcBorders>
+          </w:tcPr>
+          <w:p>
+            <w:r/>
+            <w:r>
+              <w:t xml:space="preserve">啟用 </w:t>
+            </w:r>
+            <w:r>
+              <w:rPr>
+                <w:rFonts w:ascii="Consolas" w:hAnsi="Consolas"/>
+                <w:color w:val="C7254E"/>
+                <w:sz w:val="20"/>
+              </w:rPr>
+              <w:t>--fix-non-manifold</w:t>
+            </w:r>
+            <w:r>
+              <w:t xml:space="preserve"> 時，dissolve 共享 ≥3 face 的邊。預設關閉 — 部分 CAD 設計依賴 3-patch junction，誤刪會破壞拓樸；當 </w:t>
+            </w:r>
+            <w:r>
+              <w:rPr>
+                <w:rFonts w:ascii="Consolas" w:hAnsi="Consolas"/>
+                <w:color w:val="C7254E"/>
+                <w:sz w:val="20"/>
+              </w:rPr>
+              <w:t>diamesh diagnose</w:t>
+            </w:r>
+            <w:r>
+              <w:t xml:space="preserve"> 報 </w:t>
+            </w:r>
+            <w:r>
+              <w:rPr>
+                <w:rFonts w:ascii="Consolas" w:hAnsi="Consolas"/>
+                <w:color w:val="C7254E"/>
+                <w:sz w:val="20"/>
+              </w:rPr>
+              <w:t>non_manifold_edges &gt; 0</w:t>
+            </w:r>
+            <w:r>
+              <w:t xml:space="preserve"> 時值得試</w:t>
             </w:r>
           </w:p>
         </w:tc>
@@ -7029,6 +7157,87 @@
       </w:r>
     </w:p>
     <w:p>
+      <w:r>
+        <w:rPr>
+          <w:b/>
+        </w:rPr>
+        <w:t>--fill-holes-smooth — 補洞處 Laplacian 平滑（opt-in）</w:t>
+      </w:r>
+    </w:p>
+    <w:p>
+      <w:r>
+        <w:rPr>
+          <w:rFonts w:ascii="Consolas" w:hAnsi="Consolas"/>
+          <w:color w:val="C7254E"/>
+          <w:sz w:val="20"/>
+        </w:rPr>
+        <w:t>fill_holes</w:t>
+      </w:r>
+      <w:r>
+        <w:t xml:space="preserve"> 補上的三角形是 planar fan triangulation — 視覺上像「貼布」。</w:t>
+      </w:r>
+      <w:r>
+        <w:rPr>
+          <w:rFonts w:ascii="Consolas" w:hAnsi="Consolas"/>
+          <w:color w:val="C7254E"/>
+          <w:sz w:val="20"/>
+        </w:rPr>
+        <w:t>--fill-holes-smooth</w:t>
+      </w:r>
+      <w:r>
+        <w:t xml:space="preserve"> 在補洞後對新增的 face + 1-ring vertex neighbours 做 Laplacian 弛緩，讓補洞處跟周圍曲率融合。</w:t>
+      </w:r>
+    </w:p>
+    <w:p>
+      <w:pPr>
+        <w:pStyle w:val="ListBullet"/>
+        <w:ind w:left="340"/>
+      </w:pPr>
+      <w:r>
+        <w:rPr>
+          <w:rFonts w:ascii="Consolas" w:hAnsi="Consolas"/>
+          <w:color w:val="C7254E"/>
+          <w:sz w:val="20"/>
+        </w:rPr>
+        <w:t>--fill-holes-smooth-iter N</w:t>
+      </w:r>
+      <w:r>
+        <w:t xml:space="preserve"> (default 2)：迭代次數，越高越平滑、但極限會把鄰近細節也拉平</w:t>
+      </w:r>
+    </w:p>
+    <w:p>
+      <w:pPr>
+        <w:pStyle w:val="ListBullet"/>
+        <w:ind w:left="340"/>
+      </w:pPr>
+      <w:r>
+        <w:rPr>
+          <w:rFonts w:ascii="Consolas" w:hAnsi="Consolas"/>
+          <w:color w:val="C7254E"/>
+          <w:sz w:val="20"/>
+        </w:rPr>
+        <w:t>--fill-holes-smooth-factor F</w:t>
+      </w:r>
+      <w:r>
+        <w:t xml:space="preserve"> (default 0.5)：每次 relax 強度 0–1。0.5 平衡點</w:t>
+      </w:r>
+    </w:p>
+    <w:p>
+      <w:r>
+        <w:rPr>
+          <w:b/>
+        </w:rPr>
+        <w:t>何時開啟</w:t>
+      </w:r>
+      <w:r>
+        <w:t>：</w:t>
+        <w:br/>
+        <w:t>* 機殼有大圓弧曲面、補洞處看得出「平面 bandage」 → 開啟</w:t>
+        <w:br/>
+        <w:t>* 平面結構為主（櫃體、產線框架）→ 不需要、開了沒幫助也沒傷害</w:t>
+      </w:r>
+    </w:p>
+    <w:p>
       <w:pPr>
         <w:pStyle w:val="Heading3"/>
       </w:pPr>
@@ -7984,7 +8193,7 @@
           <w:p>
             <w:r/>
             <w:r>
-              <w:t>weld 0.1mm（化萬個 island 為個位數）</w:t>
+              <w:t>adaptive weld（5e-5 × diagonal，化萬個 island 為個位數）</w:t>
             </w:r>
           </w:p>
         </w:tc>
@@ -8149,7 +8358,176 @@
           </w:p>
         </w:tc>
       </w:tr>
+      <w:tr>
+        <w:tc>
+          <w:tcPr>
+            <w:tcW w:type="dxa" w:w="4819"/>
+            <w:tcBorders>
+              <w:top w:val="single" w:sz="4" w:color="BFBFBF"/>
+              <w:left w:val="single" w:sz="4" w:color="BFBFBF"/>
+              <w:bottom w:val="single" w:sz="4" w:color="BFBFBF"/>
+              <w:right w:val="single" w:sz="4" w:color="BFBFBF"/>
+              <w:insideH w:val="single" w:sz="4" w:color="BFBFBF"/>
+              <w:insideV w:val="single" w:sz="4" w:color="BFBFBF"/>
+            </w:tcBorders>
+          </w:tcPr>
+          <w:p>
+            <w:r/>
+            <w:r>
+              <w:t>跨設備尺寸（小部件 vs 大機台）</w:t>
+            </w:r>
+          </w:p>
+        </w:tc>
+        <w:tc>
+          <w:tcPr>
+            <w:tcW w:type="dxa" w:w="4819"/>
+            <w:tcBorders>
+              <w:top w:val="single" w:sz="4" w:color="BFBFBF"/>
+              <w:left w:val="single" w:sz="4" w:color="BFBFBF"/>
+              <w:bottom w:val="single" w:sz="4" w:color="BFBFBF"/>
+              <w:right w:val="single" w:sz="4" w:color="BFBFBF"/>
+              <w:insideH w:val="single" w:sz="4" w:color="BFBFBF"/>
+              <w:insideV w:val="single" w:sz="4" w:color="BFBFBF"/>
+            </w:tcBorders>
+          </w:tcPr>
+          <w:p>
+            <w:r/>
+            <w:r>
+              <w:t>adaptive weld（自動 scale）</w:t>
+            </w:r>
+          </w:p>
+        </w:tc>
+      </w:tr>
+      <w:tr>
+        <w:tc>
+          <w:tcPr>
+            <w:tcW w:type="dxa" w:w="4819"/>
+            <w:tcBorders>
+              <w:top w:val="single" w:sz="4" w:color="BFBFBF"/>
+              <w:left w:val="single" w:sz="4" w:color="BFBFBF"/>
+              <w:bottom w:val="single" w:sz="4" w:color="BFBFBF"/>
+              <w:right w:val="single" w:sz="4" w:color="BFBFBF"/>
+              <w:insideH w:val="single" w:sz="4" w:color="BFBFBF"/>
+              <w:insideV w:val="single" w:sz="4" w:color="BFBFBF"/>
+            </w:tcBorders>
+          </w:tcPr>
+          <w:p>
+            <w:r/>
+            <w:r>
+              <w:t>補洞處貼布感</w:t>
+            </w:r>
+          </w:p>
+        </w:tc>
+        <w:tc>
+          <w:tcPr>
+            <w:tcW w:type="dxa" w:w="4819"/>
+            <w:tcBorders>
+              <w:top w:val="single" w:sz="4" w:color="BFBFBF"/>
+              <w:left w:val="single" w:sz="4" w:color="BFBFBF"/>
+              <w:bottom w:val="single" w:sz="4" w:color="BFBFBF"/>
+              <w:right w:val="single" w:sz="4" w:color="BFBFBF"/>
+              <w:insideH w:val="single" w:sz="4" w:color="BFBFBF"/>
+              <w:insideV w:val="single" w:sz="4" w:color="BFBFBF"/>
+            </w:tcBorders>
+          </w:tcPr>
+          <w:p>
+            <w:r/>
+            <w:r>
+              <w:rPr>
+                <w:rFonts w:ascii="Consolas" w:hAnsi="Consolas"/>
+                <w:color w:val="C7254E"/>
+                <w:sz w:val="20"/>
+              </w:rPr>
+              <w:t>--fill-holes-smooth</w:t>
+            </w:r>
+            <w:r>
+              <w:t>（opt-in）</w:t>
+            </w:r>
+          </w:p>
+        </w:tc>
+      </w:tr>
+      <w:tr>
+        <w:tc>
+          <w:tcPr>
+            <w:tcW w:type="dxa" w:w="4819"/>
+            <w:tcBorders>
+              <w:top w:val="single" w:sz="4" w:color="BFBFBF"/>
+              <w:left w:val="single" w:sz="4" w:color="BFBFBF"/>
+              <w:bottom w:val="single" w:sz="4" w:color="BFBFBF"/>
+              <w:right w:val="single" w:sz="4" w:color="BFBFBF"/>
+              <w:insideH w:val="single" w:sz="4" w:color="BFBFBF"/>
+              <w:insideV w:val="single" w:sz="4" w:color="BFBFBF"/>
+            </w:tcBorders>
+          </w:tcPr>
+          <w:p>
+            <w:r/>
+            <w:r>
+              <w:t>非流形交界</w:t>
+            </w:r>
+          </w:p>
+        </w:tc>
+        <w:tc>
+          <w:tcPr>
+            <w:tcW w:type="dxa" w:w="4819"/>
+            <w:tcBorders>
+              <w:top w:val="single" w:sz="4" w:color="BFBFBF"/>
+              <w:left w:val="single" w:sz="4" w:color="BFBFBF"/>
+              <w:bottom w:val="single" w:sz="4" w:color="BFBFBF"/>
+              <w:right w:val="single" w:sz="4" w:color="BFBFBF"/>
+              <w:insideH w:val="single" w:sz="4" w:color="BFBFBF"/>
+              <w:insideV w:val="single" w:sz="4" w:color="BFBFBF"/>
+            </w:tcBorders>
+          </w:tcPr>
+          <w:p>
+            <w:r/>
+            <w:r>
+              <w:rPr>
+                <w:rFonts w:ascii="Consolas" w:hAnsi="Consolas"/>
+                <w:color w:val="C7254E"/>
+                <w:sz w:val="20"/>
+              </w:rPr>
+              <w:t>--fix-non-manifold</w:t>
+            </w:r>
+            <w:r>
+              <w:t>（opt-in）</w:t>
+            </w:r>
+          </w:p>
+        </w:tc>
+      </w:tr>
     </w:tbl>
+    <w:p>
+      <w:r>
+        <w:rPr>
+          <w:b/>
+        </w:rPr>
+        <w:t>self-intersection 不在表內</w:t>
+      </w:r>
+      <w:r>
+        <w:t xml:space="preserve"> — DIAMesh 只 detect（</w:t>
+      </w:r>
+      <w:r>
+        <w:rPr>
+          <w:rFonts w:ascii="Consolas" w:hAnsi="Consolas"/>
+          <w:color w:val="C7254E"/>
+          <w:sz w:val="20"/>
+        </w:rPr>
+        <w:t>diamesh diagnose</w:t>
+      </w:r>
+      <w:r>
+        <w:t xml:space="preserve"> 報 </w:t>
+      </w:r>
+      <w:r>
+        <w:rPr>
+          <w:rFonts w:ascii="Consolas" w:hAnsi="Consolas"/>
+          <w:color w:val="C7254E"/>
+          <w:sz w:val="20"/>
+        </w:rPr>
+        <w:t>self_intersect_faces</w:t>
+      </w:r>
+      <w:r>
+        <w:t>）不 fix：proper 修復要走 boolean-union remesh，會徹底損失 UVs 跟 materials，跟「保材質」原則撞牆。CAD 端 export 設定才是修復的對位置。</w:t>
+      </w:r>
+    </w:p>
     <w:p>
       <w:pPr>
         <w:pStyle w:val="Heading3"/>
@@ -11401,9 +11779,17 @@
         <w:br/>
         <w:t># 4. Use</w:t>
         <w:br/>
-        <w:t>diamesh info &lt;file.fbx&gt;                          # mesh statistics</w:t>
+        <w:t>diamesh info &lt;file.fbx&gt;                          # quick stats</w:t>
         <w:br/>
         <w:t>diamesh view &lt;file.fbx&gt;                          # interactive viewer</w:t>
+        <w:br/>
+        <w:t>diamesh diagnose &lt;file.fbx&gt;                      # full health report</w:t>
+        <w:br/>
+        <w:t xml:space="preserve">                                                  #   (watertight, non-manifold,</w:t>
+        <w:br/>
+        <w:t xml:space="preserve">                                                  #    inverted_normals, self_intersect,</w:t>
+        <w:br/>
+        <w:t xml:space="preserve">                                                  #    boundary_edges, islands)</w:t>
         <w:br/>
         <w:br/>
         <w:t># Default backend (trimesh, no material)</w:t>
@@ -11443,6 +11829,21 @@
         <w:t>diamesh diff &lt;orig.fbx&gt; &lt;lod.fbx&gt;</w:t>
         <w:br/>
         <w:br/>
+        <w:t># A-class advanced flags (all opt-in)</w:t>
+        <w:br/>
+        <w:t>diamesh reduce &lt;file.fbx&gt; --backend blender --ratio 0.1 \</w:t>
+        <w:br/>
+        <w:t xml:space="preserve">    --weld-tolerance-frac 5e-5         `# B3: adaptive weld (default)` \</w:t>
+        <w:br/>
+        <w:t xml:space="preserve">    --fix-non-manifold                 `# B4: dissolve 3+ face edges` \</w:t>
+        <w:br/>
+        <w:t xml:space="preserve">    --auto-fill-holes --fill-holes-smooth \</w:t>
+        <w:br/>
+        <w:t xml:space="preserve">    --fill-holes-smooth-iter 2 --fill-holes-smooth-factor 0.5 \</w:t>
+        <w:br/>
+        <w:t xml:space="preserve">    -o &lt;out.fbx&gt;                       `# C2: blend patches in`</w:t>
+        <w:br/>
+        <w:br/>
         <w:t># Backend explorations</w:t>
         <w:br/>
         <w:t>diamesh reduce &lt;file.fbx&gt; --ratio 0.5 --backend pymeshlab -o &lt;out.glb&gt;</w:t>
@@ -11466,7 +11867,7 @@
         <w:t>版本</w:t>
       </w:r>
       <w:r>
-        <w:t>：2026-05-02 初版</w:t>
+        <w:t>：2026-05-03 — A 類 mesh repair 進深（B3+B4+C2+C1）</w:t>
         <w:br/>
       </w:r>
       <w:r>

</xml_diff>

<commit_message>
docs(user-guide): aggressive-collapse is a trim tool, not a physical limit breaker
§6.8.2 expanded with empirical evidence: at --ratio 0.05, both normal
and --aggressive-collapse modes produce visually broken output on
5AxisGlueSpraying.fbx (机械臂消失 / 面板大量缺失 / fold-over face).

Root cause: 75327 × 0.05 = 3766 face spread across 24 material slots
~= 157 face/material — not enough to express structure + boundary.
This is a mesh expression physical lower bound, independent of
boundary preservation.

Added:
* Comparison table (normal vs aggressive at ratio 0.05): both崩
* ratio-vs-face-count reference table for 5Axis
* "Aggressive 真正適用場景" rules:
  - ✓ ratio 0.1 boundary-padded → trim back to 0.15-0.2
  - ✗ Breaking mesh expression lower bound
* Recommendation: ratio >= 0.1 for 24-material industrial CAD

PDF/DOCX regenerated.

Co-Authored-By: Claude Opus 4.7 (1M context) <noreply@anthropic.com>
</commit_message>
<xml_diff>
--- a/docs/USER_GUIDE.docx
+++ b/docs/USER_GUIDE.docx
@@ -10408,6 +10408,882 @@
           <w:sz w:val="19"/>
         </w:rPr>
         <w:t>diamesh reduce in.fbx --preset tier1 --target-faces 5000 --aggressive-collapse -o out.fbx</w:t>
+      </w:r>
+    </w:p>
+    <w:p>
+      <w:r>
+        <w:rPr>
+          <w:b/>
+        </w:rPr>
+        <w:t>⚠️ Aggressive 不是突破物理下限的工具 — ratio 太低時兩 mode 都會崩</w:t>
+      </w:r>
+    </w:p>
+    <w:p>
+      <w:r>
+        <w:t xml:space="preserve">實測在 5AxisGlueSpraying.fbx 上設 </w:t>
+      </w:r>
+      <w:r>
+        <w:rPr>
+          <w:rFonts w:ascii="Consolas" w:hAnsi="Consolas"/>
+          <w:color w:val="C7254E"/>
+          <w:sz w:val="20"/>
+        </w:rPr>
+        <w:t>--ratio 0.05</w:t>
+      </w:r>
+      <w:r>
+        <w:t>：</w:t>
+      </w:r>
+    </w:p>
+    <w:tbl>
+      <w:tblPr>
+        <w:tblStyle w:val="TableGrid"/>
+        <w:tblW w:type="auto" w:w="0"/>
+        <w:jc w:val="left"/>
+        <w:tblLook w:firstColumn="1" w:firstRow="1" w:lastColumn="0" w:lastRow="0" w:noHBand="0" w:noVBand="1" w:val="04A0"/>
+      </w:tblPr>
+      <w:tblGrid>
+        <w:gridCol w:w="3213"/>
+        <w:gridCol w:w="3213"/>
+        <w:gridCol w:w="3213"/>
+      </w:tblGrid>
+      <w:tr>
+        <w:tc>
+          <w:tcPr>
+            <w:tcW w:type="dxa" w:w="3213"/>
+            <w:tcBorders>
+              <w:top w:val="single" w:sz="4" w:color="BFBFBF"/>
+              <w:left w:val="single" w:sz="4" w:color="BFBFBF"/>
+              <w:bottom w:val="single" w:sz="4" w:color="BFBFBF"/>
+              <w:right w:val="single" w:sz="4" w:color="BFBFBF"/>
+              <w:insideH w:val="single" w:sz="4" w:color="BFBFBF"/>
+              <w:insideV w:val="single" w:sz="4" w:color="BFBFBF"/>
+            </w:tcBorders>
+            <w:shd w:val="clear" w:color="auto" w:fill="F6F8FA"/>
+          </w:tcPr>
+          <w:p>
+            <w:r>
+              <w:rPr>
+                <w:b/>
+              </w:rPr>
+            </w:r>
+            <w:r>
+              <w:rPr>
+                <w:b/>
+              </w:rPr>
+              <w:t>設定</w:t>
+            </w:r>
+          </w:p>
+        </w:tc>
+        <w:tc>
+          <w:tcPr>
+            <w:tcW w:type="dxa" w:w="3213"/>
+            <w:tcBorders>
+              <w:top w:val="single" w:sz="4" w:color="BFBFBF"/>
+              <w:left w:val="single" w:sz="4" w:color="BFBFBF"/>
+              <w:bottom w:val="single" w:sz="4" w:color="BFBFBF"/>
+              <w:right w:val="single" w:sz="4" w:color="BFBFBF"/>
+              <w:insideH w:val="single" w:sz="4" w:color="BFBFBF"/>
+              <w:insideV w:val="single" w:sz="4" w:color="BFBFBF"/>
+            </w:tcBorders>
+            <w:shd w:val="clear" w:color="auto" w:fill="F6F8FA"/>
+          </w:tcPr>
+          <w:p>
+            <w:r>
+              <w:rPr>
+                <w:b/>
+              </w:rPr>
+            </w:r>
+            <w:r>
+              <w:rPr>
+                <w:b/>
+              </w:rPr>
+              <w:t>achieved_ratio</w:t>
+            </w:r>
+          </w:p>
+        </w:tc>
+        <w:tc>
+          <w:tcPr>
+            <w:tcW w:type="dxa" w:w="3213"/>
+            <w:tcBorders>
+              <w:top w:val="single" w:sz="4" w:color="BFBFBF"/>
+              <w:left w:val="single" w:sz="4" w:color="BFBFBF"/>
+              <w:bottom w:val="single" w:sz="4" w:color="BFBFBF"/>
+              <w:right w:val="single" w:sz="4" w:color="BFBFBF"/>
+              <w:insideH w:val="single" w:sz="4" w:color="BFBFBF"/>
+              <w:insideV w:val="single" w:sz="4" w:color="BFBFBF"/>
+            </w:tcBorders>
+            <w:shd w:val="clear" w:color="auto" w:fill="F6F8FA"/>
+          </w:tcPr>
+          <w:p>
+            <w:r>
+              <w:rPr>
+                <w:b/>
+              </w:rPr>
+            </w:r>
+            <w:r>
+              <w:rPr>
+                <w:b/>
+              </w:rPr>
+              <w:t>視覺</w:t>
+            </w:r>
+          </w:p>
+        </w:tc>
+      </w:tr>
+      <w:tr>
+        <w:tc>
+          <w:tcPr>
+            <w:tcW w:type="dxa" w:w="3213"/>
+            <w:tcBorders>
+              <w:top w:val="single" w:sz="4" w:color="BFBFBF"/>
+              <w:left w:val="single" w:sz="4" w:color="BFBFBF"/>
+              <w:bottom w:val="single" w:sz="4" w:color="BFBFBF"/>
+              <w:right w:val="single" w:sz="4" w:color="BFBFBF"/>
+              <w:insideH w:val="single" w:sz="4" w:color="BFBFBF"/>
+              <w:insideV w:val="single" w:sz="4" w:color="BFBFBF"/>
+            </w:tcBorders>
+          </w:tcPr>
+          <w:p>
+            <w:r/>
+            <w:r>
+              <w:t>ratio 0.05（無 aggressive）</w:t>
+            </w:r>
+          </w:p>
+        </w:tc>
+        <w:tc>
+          <w:tcPr>
+            <w:tcW w:type="dxa" w:w="3213"/>
+            <w:tcBorders>
+              <w:top w:val="single" w:sz="4" w:color="BFBFBF"/>
+              <w:left w:val="single" w:sz="4" w:color="BFBFBF"/>
+              <w:bottom w:val="single" w:sz="4" w:color="BFBFBF"/>
+              <w:right w:val="single" w:sz="4" w:color="BFBFBF"/>
+              <w:insideH w:val="single" w:sz="4" w:color="BFBFBF"/>
+              <w:insideV w:val="single" w:sz="4" w:color="BFBFBF"/>
+            </w:tcBorders>
+          </w:tcPr>
+          <w:p>
+            <w:r/>
+            <w:r>
+              <w:t>~0.07</w:t>
+            </w:r>
+          </w:p>
+        </w:tc>
+        <w:tc>
+          <w:tcPr>
+            <w:tcW w:type="dxa" w:w="3213"/>
+            <w:tcBorders>
+              <w:top w:val="single" w:sz="4" w:color="BFBFBF"/>
+              <w:left w:val="single" w:sz="4" w:color="BFBFBF"/>
+              <w:bottom w:val="single" w:sz="4" w:color="BFBFBF"/>
+              <w:right w:val="single" w:sz="4" w:color="BFBFBF"/>
+              <w:insideH w:val="single" w:sz="4" w:color="BFBFBF"/>
+              <w:insideV w:val="single" w:sz="4" w:color="BFBFBF"/>
+            </w:tcBorders>
+          </w:tcPr>
+          <w:p>
+            <w:r/>
+            <w:r>
+              <w:t xml:space="preserve">❌ </w:t>
+            </w:r>
+            <w:r>
+              <w:rPr>
+                <w:b/>
+              </w:rPr>
+              <w:t>崩</w:t>
+            </w:r>
+            <w:r>
+              <w:t xml:space="preserve"> — 機械臂消失、面板大量缺失、大量黑色 fold-over face</w:t>
+            </w:r>
+          </w:p>
+        </w:tc>
+      </w:tr>
+      <w:tr>
+        <w:tc>
+          <w:tcPr>
+            <w:tcW w:type="dxa" w:w="3213"/>
+            <w:tcBorders>
+              <w:top w:val="single" w:sz="4" w:color="BFBFBF"/>
+              <w:left w:val="single" w:sz="4" w:color="BFBFBF"/>
+              <w:bottom w:val="single" w:sz="4" w:color="BFBFBF"/>
+              <w:right w:val="single" w:sz="4" w:color="BFBFBF"/>
+              <w:insideH w:val="single" w:sz="4" w:color="BFBFBF"/>
+              <w:insideV w:val="single" w:sz="4" w:color="BFBFBF"/>
+            </w:tcBorders>
+          </w:tcPr>
+          <w:p>
+            <w:r/>
+            <w:r>
+              <w:t>ratio 0.05 + aggressive</w:t>
+            </w:r>
+          </w:p>
+        </w:tc>
+        <w:tc>
+          <w:tcPr>
+            <w:tcW w:type="dxa" w:w="3213"/>
+            <w:tcBorders>
+              <w:top w:val="single" w:sz="4" w:color="BFBFBF"/>
+              <w:left w:val="single" w:sz="4" w:color="BFBFBF"/>
+              <w:bottom w:val="single" w:sz="4" w:color="BFBFBF"/>
+              <w:right w:val="single" w:sz="4" w:color="BFBFBF"/>
+              <w:insideH w:val="single" w:sz="4" w:color="BFBFBF"/>
+              <w:insideV w:val="single" w:sz="4" w:color="BFBFBF"/>
+            </w:tcBorders>
+          </w:tcPr>
+          <w:p>
+            <w:r/>
+            <w:r>
+              <w:t>~0.05</w:t>
+            </w:r>
+          </w:p>
+        </w:tc>
+        <w:tc>
+          <w:tcPr>
+            <w:tcW w:type="dxa" w:w="3213"/>
+            <w:tcBorders>
+              <w:top w:val="single" w:sz="4" w:color="BFBFBF"/>
+              <w:left w:val="single" w:sz="4" w:color="BFBFBF"/>
+              <w:bottom w:val="single" w:sz="4" w:color="BFBFBF"/>
+              <w:right w:val="single" w:sz="4" w:color="BFBFBF"/>
+              <w:insideH w:val="single" w:sz="4" w:color="BFBFBF"/>
+              <w:insideV w:val="single" w:sz="4" w:color="BFBFBF"/>
+            </w:tcBorders>
+          </w:tcPr>
+          <w:p>
+            <w:r/>
+            <w:r>
+              <w:t xml:space="preserve">❌ </w:t>
+            </w:r>
+            <w:r>
+              <w:rPr>
+                <w:b/>
+              </w:rPr>
+              <w:t>同樣崩</w:t>
+            </w:r>
+            <w:r>
+              <w:t xml:space="preserve"> — 視覺差異微乎其微</w:t>
+            </w:r>
+          </w:p>
+        </w:tc>
+      </w:tr>
+    </w:tbl>
+    <w:p>
+      <w:r>
+        <w:rPr>
+          <w:b/>
+        </w:rPr>
+        <w:t>Root cause</w:t>
+      </w:r>
+      <w:r>
+        <w:t xml:space="preserve">：5Axis face = 75327 × 0.05 = </w:t>
+      </w:r>
+      <w:r>
+        <w:rPr>
+          <w:b/>
+        </w:rPr>
+        <w:t>3766 face</w:t>
+      </w:r>
+      <w:r>
+        <w:t xml:space="preserve">。設備有 24 個 material slot，平均 each ~157 face — </w:t>
+      </w:r>
+      <w:r>
+        <w:rPr>
+          <w:b/>
+        </w:rPr>
+        <w:t>face 預算根本不夠表達 24 個材質區域 + boundary + 結構</w:t>
+      </w:r>
+      <w:r>
+        <w:t xml:space="preserve">。這個 limit 跟 boundary preservation 無關，是 mesh </w:t>
+      </w:r>
+      <w:r>
+        <w:rPr>
+          <w:b/>
+        </w:rPr>
+        <w:t>物理表達下限</w:t>
+      </w:r>
+      <w:r>
+        <w:t>。</w:t>
+      </w:r>
+    </w:p>
+    <w:p>
+      <w:r>
+        <w:rPr>
+          <w:b/>
+        </w:rPr>
+        <w:t>合理 ratio 對 5AxisGlueSpraying.fbx 的對應表</w:t>
+      </w:r>
+      <w:r>
+        <w:t>：</w:t>
+      </w:r>
+    </w:p>
+    <w:tbl>
+      <w:tblPr>
+        <w:tblStyle w:val="TableGrid"/>
+        <w:tblW w:type="auto" w:w="0"/>
+        <w:jc w:val="left"/>
+        <w:tblLook w:firstColumn="1" w:firstRow="1" w:lastColumn="0" w:lastRow="0" w:noHBand="0" w:noVBand="1" w:val="04A0"/>
+      </w:tblPr>
+      <w:tblGrid>
+        <w:gridCol w:w="2409"/>
+        <w:gridCol w:w="2409"/>
+        <w:gridCol w:w="2409"/>
+        <w:gridCol w:w="2409"/>
+      </w:tblGrid>
+      <w:tr>
+        <w:tc>
+          <w:tcPr>
+            <w:tcW w:type="dxa" w:w="2409"/>
+            <w:tcBorders>
+              <w:top w:val="single" w:sz="4" w:color="BFBFBF"/>
+              <w:left w:val="single" w:sz="4" w:color="BFBFBF"/>
+              <w:bottom w:val="single" w:sz="4" w:color="BFBFBF"/>
+              <w:right w:val="single" w:sz="4" w:color="BFBFBF"/>
+              <w:insideH w:val="single" w:sz="4" w:color="BFBFBF"/>
+              <w:insideV w:val="single" w:sz="4" w:color="BFBFBF"/>
+            </w:tcBorders>
+            <w:shd w:val="clear" w:color="auto" w:fill="F6F8FA"/>
+          </w:tcPr>
+          <w:p>
+            <w:r>
+              <w:rPr>
+                <w:b/>
+              </w:rPr>
+            </w:r>
+            <w:r>
+              <w:rPr>
+                <w:b/>
+              </w:rPr>
+              <w:t>設 ratio</w:t>
+            </w:r>
+          </w:p>
+        </w:tc>
+        <w:tc>
+          <w:tcPr>
+            <w:tcW w:type="dxa" w:w="2409"/>
+            <w:tcBorders>
+              <w:top w:val="single" w:sz="4" w:color="BFBFBF"/>
+              <w:left w:val="single" w:sz="4" w:color="BFBFBF"/>
+              <w:bottom w:val="single" w:sz="4" w:color="BFBFBF"/>
+              <w:right w:val="single" w:sz="4" w:color="BFBFBF"/>
+              <w:insideH w:val="single" w:sz="4" w:color="BFBFBF"/>
+              <w:insideV w:val="single" w:sz="4" w:color="BFBFBF"/>
+            </w:tcBorders>
+            <w:shd w:val="clear" w:color="auto" w:fill="F6F8FA"/>
+          </w:tcPr>
+          <w:p>
+            <w:r>
+              <w:rPr>
+                <w:b/>
+              </w:rPr>
+            </w:r>
+            <w:r>
+              <w:rPr>
+                <w:b/>
+              </w:rPr>
+              <w:t>約 face</w:t>
+            </w:r>
+          </w:p>
+        </w:tc>
+        <w:tc>
+          <w:tcPr>
+            <w:tcW w:type="dxa" w:w="2409"/>
+            <w:tcBorders>
+              <w:top w:val="single" w:sz="4" w:color="BFBFBF"/>
+              <w:left w:val="single" w:sz="4" w:color="BFBFBF"/>
+              <w:bottom w:val="single" w:sz="4" w:color="BFBFBF"/>
+              <w:right w:val="single" w:sz="4" w:color="BFBFBF"/>
+              <w:insideH w:val="single" w:sz="4" w:color="BFBFBF"/>
+              <w:insideV w:val="single" w:sz="4" w:color="BFBFBF"/>
+            </w:tcBorders>
+            <w:shd w:val="clear" w:color="auto" w:fill="F6F8FA"/>
+          </w:tcPr>
+          <w:p>
+            <w:r>
+              <w:rPr>
+                <w:b/>
+              </w:rPr>
+            </w:r>
+            <w:r>
+              <w:rPr>
+                <w:b/>
+              </w:rPr>
+              <w:t>視覺</w:t>
+            </w:r>
+          </w:p>
+        </w:tc>
+        <w:tc>
+          <w:tcPr>
+            <w:tcW w:type="dxa" w:w="2409"/>
+            <w:tcBorders>
+              <w:top w:val="single" w:sz="4" w:color="BFBFBF"/>
+              <w:left w:val="single" w:sz="4" w:color="BFBFBF"/>
+              <w:bottom w:val="single" w:sz="4" w:color="BFBFBF"/>
+              <w:right w:val="single" w:sz="4" w:color="BFBFBF"/>
+              <w:insideH w:val="single" w:sz="4" w:color="BFBFBF"/>
+              <w:insideV w:val="single" w:sz="4" w:color="BFBFBF"/>
+            </w:tcBorders>
+            <w:shd w:val="clear" w:color="auto" w:fill="F6F8FA"/>
+          </w:tcPr>
+          <w:p>
+            <w:r>
+              <w:rPr>
+                <w:b/>
+              </w:rPr>
+            </w:r>
+            <w:r>
+              <w:rPr>
+                <w:b/>
+              </w:rPr>
+              <w:t>場景</w:t>
+            </w:r>
+          </w:p>
+        </w:tc>
+      </w:tr>
+      <w:tr>
+        <w:tc>
+          <w:tcPr>
+            <w:tcW w:type="dxa" w:w="2409"/>
+            <w:tcBorders>
+              <w:top w:val="single" w:sz="4" w:color="BFBFBF"/>
+              <w:left w:val="single" w:sz="4" w:color="BFBFBF"/>
+              <w:bottom w:val="single" w:sz="4" w:color="BFBFBF"/>
+              <w:right w:val="single" w:sz="4" w:color="BFBFBF"/>
+              <w:insideH w:val="single" w:sz="4" w:color="BFBFBF"/>
+              <w:insideV w:val="single" w:sz="4" w:color="BFBFBF"/>
+            </w:tcBorders>
+          </w:tcPr>
+          <w:p>
+            <w:r/>
+            <w:r>
+              <w:t>0.5</w:t>
+            </w:r>
+          </w:p>
+        </w:tc>
+        <w:tc>
+          <w:tcPr>
+            <w:tcW w:type="dxa" w:w="2409"/>
+            <w:tcBorders>
+              <w:top w:val="single" w:sz="4" w:color="BFBFBF"/>
+              <w:left w:val="single" w:sz="4" w:color="BFBFBF"/>
+              <w:bottom w:val="single" w:sz="4" w:color="BFBFBF"/>
+              <w:right w:val="single" w:sz="4" w:color="BFBFBF"/>
+              <w:insideH w:val="single" w:sz="4" w:color="BFBFBF"/>
+              <w:insideV w:val="single" w:sz="4" w:color="BFBFBF"/>
+            </w:tcBorders>
+          </w:tcPr>
+          <w:p>
+            <w:r/>
+            <w:r>
+              <w:t>~37k</w:t>
+            </w:r>
+          </w:p>
+        </w:tc>
+        <w:tc>
+          <w:tcPr>
+            <w:tcW w:type="dxa" w:w="2409"/>
+            <w:tcBorders>
+              <w:top w:val="single" w:sz="4" w:color="BFBFBF"/>
+              <w:left w:val="single" w:sz="4" w:color="BFBFBF"/>
+              <w:bottom w:val="single" w:sz="4" w:color="BFBFBF"/>
+              <w:right w:val="single" w:sz="4" w:color="BFBFBF"/>
+              <w:insideH w:val="single" w:sz="4" w:color="BFBFBF"/>
+              <w:insideV w:val="single" w:sz="4" w:color="BFBFBF"/>
+            </w:tcBorders>
+          </w:tcPr>
+          <w:p>
+            <w:r/>
+            <w:r>
+              <w:t>接近原檔</w:t>
+            </w:r>
+          </w:p>
+        </w:tc>
+        <w:tc>
+          <w:tcPr>
+            <w:tcW w:type="dxa" w:w="2409"/>
+            <w:tcBorders>
+              <w:top w:val="single" w:sz="4" w:color="BFBFBF"/>
+              <w:left w:val="single" w:sz="4" w:color="BFBFBF"/>
+              <w:bottom w:val="single" w:sz="4" w:color="BFBFBF"/>
+              <w:right w:val="single" w:sz="4" w:color="BFBFBF"/>
+              <w:insideH w:val="single" w:sz="4" w:color="BFBFBF"/>
+              <w:insideV w:val="single" w:sz="4" w:color="BFBFBF"/>
+            </w:tcBorders>
+          </w:tcPr>
+          <w:p>
+            <w:r/>
+            <w:r>
+              <w:t>TIER 3 Hero shot</w:t>
+            </w:r>
+          </w:p>
+        </w:tc>
+      </w:tr>
+      <w:tr>
+        <w:tc>
+          <w:tcPr>
+            <w:tcW w:type="dxa" w:w="2409"/>
+            <w:tcBorders>
+              <w:top w:val="single" w:sz="4" w:color="BFBFBF"/>
+              <w:left w:val="single" w:sz="4" w:color="BFBFBF"/>
+              <w:bottom w:val="single" w:sz="4" w:color="BFBFBF"/>
+              <w:right w:val="single" w:sz="4" w:color="BFBFBF"/>
+              <w:insideH w:val="single" w:sz="4" w:color="BFBFBF"/>
+              <w:insideV w:val="single" w:sz="4" w:color="BFBFBF"/>
+            </w:tcBorders>
+          </w:tcPr>
+          <w:p>
+            <w:r/>
+            <w:r>
+              <w:t>0.25</w:t>
+            </w:r>
+          </w:p>
+        </w:tc>
+        <w:tc>
+          <w:tcPr>
+            <w:tcW w:type="dxa" w:w="2409"/>
+            <w:tcBorders>
+              <w:top w:val="single" w:sz="4" w:color="BFBFBF"/>
+              <w:left w:val="single" w:sz="4" w:color="BFBFBF"/>
+              <w:bottom w:val="single" w:sz="4" w:color="BFBFBF"/>
+              <w:right w:val="single" w:sz="4" w:color="BFBFBF"/>
+              <w:insideH w:val="single" w:sz="4" w:color="BFBFBF"/>
+              <w:insideV w:val="single" w:sz="4" w:color="BFBFBF"/>
+            </w:tcBorders>
+          </w:tcPr>
+          <w:p>
+            <w:r/>
+            <w:r>
+              <w:t>~17k–50k</w:t>
+            </w:r>
+          </w:p>
+        </w:tc>
+        <w:tc>
+          <w:tcPr>
+            <w:tcW w:type="dxa" w:w="2409"/>
+            <w:tcBorders>
+              <w:top w:val="single" w:sz="4" w:color="BFBFBF"/>
+              <w:left w:val="single" w:sz="4" w:color="BFBFBF"/>
+              <w:bottom w:val="single" w:sz="4" w:color="BFBFBF"/>
+              <w:right w:val="single" w:sz="4" w:color="BFBFBF"/>
+              <w:insideH w:val="single" w:sz="4" w:color="BFBFBF"/>
+              <w:insideV w:val="single" w:sz="4" w:color="BFBFBF"/>
+            </w:tcBorders>
+          </w:tcPr>
+          <w:p>
+            <w:r/>
+            <w:r>
+              <w:t>結構可辨識</w:t>
+            </w:r>
+          </w:p>
+        </w:tc>
+        <w:tc>
+          <w:tcPr>
+            <w:tcW w:type="dxa" w:w="2409"/>
+            <w:tcBorders>
+              <w:top w:val="single" w:sz="4" w:color="BFBFBF"/>
+              <w:left w:val="single" w:sz="4" w:color="BFBFBF"/>
+              <w:bottom w:val="single" w:sz="4" w:color="BFBFBF"/>
+              <w:right w:val="single" w:sz="4" w:color="BFBFBF"/>
+              <w:insideH w:val="single" w:sz="4" w:color="BFBFBF"/>
+              <w:insideV w:val="single" w:sz="4" w:color="BFBFBF"/>
+            </w:tcBorders>
+          </w:tcPr>
+          <w:p>
+            <w:r/>
+            <w:r>
+              <w:t>TIER 2 單機聚焦</w:t>
+            </w:r>
+          </w:p>
+        </w:tc>
+      </w:tr>
+      <w:tr>
+        <w:tc>
+          <w:tcPr>
+            <w:tcW w:type="dxa" w:w="2409"/>
+            <w:tcBorders>
+              <w:top w:val="single" w:sz="4" w:color="BFBFBF"/>
+              <w:left w:val="single" w:sz="4" w:color="BFBFBF"/>
+              <w:bottom w:val="single" w:sz="4" w:color="BFBFBF"/>
+              <w:right w:val="single" w:sz="4" w:color="BFBFBF"/>
+              <w:insideH w:val="single" w:sz="4" w:color="BFBFBF"/>
+              <w:insideV w:val="single" w:sz="4" w:color="BFBFBF"/>
+            </w:tcBorders>
+          </w:tcPr>
+          <w:p>
+            <w:r/>
+            <w:r>
+              <w:rPr>
+                <w:b/>
+              </w:rPr>
+              <w:t>0.10</w:t>
+            </w:r>
+          </w:p>
+        </w:tc>
+        <w:tc>
+          <w:tcPr>
+            <w:tcW w:type="dxa" w:w="2409"/>
+            <w:tcBorders>
+              <w:top w:val="single" w:sz="4" w:color="BFBFBF"/>
+              <w:left w:val="single" w:sz="4" w:color="BFBFBF"/>
+              <w:bottom w:val="single" w:sz="4" w:color="BFBFBF"/>
+              <w:right w:val="single" w:sz="4" w:color="BFBFBF"/>
+              <w:insideH w:val="single" w:sz="4" w:color="BFBFBF"/>
+              <w:insideV w:val="single" w:sz="4" w:color="BFBFBF"/>
+            </w:tcBorders>
+          </w:tcPr>
+          <w:p>
+            <w:r/>
+            <w:r>
+              <w:rPr>
+                <w:b/>
+              </w:rPr>
+              <w:t>~7k–21k</w:t>
+            </w:r>
+          </w:p>
+        </w:tc>
+        <w:tc>
+          <w:tcPr>
+            <w:tcW w:type="dxa" w:w="2409"/>
+            <w:tcBorders>
+              <w:top w:val="single" w:sz="4" w:color="BFBFBF"/>
+              <w:left w:val="single" w:sz="4" w:color="BFBFBF"/>
+              <w:bottom w:val="single" w:sz="4" w:color="BFBFBF"/>
+              <w:right w:val="single" w:sz="4" w:color="BFBFBF"/>
+              <w:insideH w:val="single" w:sz="4" w:color="BFBFBF"/>
+              <w:insideV w:val="single" w:sz="4" w:color="BFBFBF"/>
+            </w:tcBorders>
+          </w:tcPr>
+          <w:p>
+            <w:r/>
+            <w:r>
+              <w:rPr>
+                <w:b/>
+              </w:rPr>
+              <w:t>主結構完整</w:t>
+            </w:r>
+          </w:p>
+        </w:tc>
+        <w:tc>
+          <w:tcPr>
+            <w:tcW w:type="dxa" w:w="2409"/>
+            <w:tcBorders>
+              <w:top w:val="single" w:sz="4" w:color="BFBFBF"/>
+              <w:left w:val="single" w:sz="4" w:color="BFBFBF"/>
+              <w:bottom w:val="single" w:sz="4" w:color="BFBFBF"/>
+              <w:right w:val="single" w:sz="4" w:color="BFBFBF"/>
+              <w:insideH w:val="single" w:sz="4" w:color="BFBFBF"/>
+              <w:insideV w:val="single" w:sz="4" w:color="BFBFBF"/>
+            </w:tcBorders>
+          </w:tcPr>
+          <w:p>
+            <w:r/>
+            <w:r>
+              <w:rPr>
+                <w:b/>
+              </w:rPr>
+              <w:t>TIER 1 推薦下限</w:t>
+            </w:r>
+          </w:p>
+        </w:tc>
+      </w:tr>
+      <w:tr>
+        <w:tc>
+          <w:tcPr>
+            <w:tcW w:type="dxa" w:w="2409"/>
+            <w:tcBorders>
+              <w:top w:val="single" w:sz="4" w:color="BFBFBF"/>
+              <w:left w:val="single" w:sz="4" w:color="BFBFBF"/>
+              <w:bottom w:val="single" w:sz="4" w:color="BFBFBF"/>
+              <w:right w:val="single" w:sz="4" w:color="BFBFBF"/>
+              <w:insideH w:val="single" w:sz="4" w:color="BFBFBF"/>
+              <w:insideV w:val="single" w:sz="4" w:color="BFBFBF"/>
+            </w:tcBorders>
+          </w:tcPr>
+          <w:p>
+            <w:r/>
+            <w:r>
+              <w:t>0.05</w:t>
+            </w:r>
+          </w:p>
+        </w:tc>
+        <w:tc>
+          <w:tcPr>
+            <w:tcW w:type="dxa" w:w="2409"/>
+            <w:tcBorders>
+              <w:top w:val="single" w:sz="4" w:color="BFBFBF"/>
+              <w:left w:val="single" w:sz="4" w:color="BFBFBF"/>
+              <w:bottom w:val="single" w:sz="4" w:color="BFBFBF"/>
+              <w:right w:val="single" w:sz="4" w:color="BFBFBF"/>
+              <w:insideH w:val="single" w:sz="4" w:color="BFBFBF"/>
+              <w:insideV w:val="single" w:sz="4" w:color="BFBFBF"/>
+            </w:tcBorders>
+          </w:tcPr>
+          <w:p>
+            <w:r/>
+            <w:r>
+              <w:t>~3.7k</w:t>
+            </w:r>
+          </w:p>
+        </w:tc>
+        <w:tc>
+          <w:tcPr>
+            <w:tcW w:type="dxa" w:w="2409"/>
+            <w:tcBorders>
+              <w:top w:val="single" w:sz="4" w:color="BFBFBF"/>
+              <w:left w:val="single" w:sz="4" w:color="BFBFBF"/>
+              <w:bottom w:val="single" w:sz="4" w:color="BFBFBF"/>
+              <w:right w:val="single" w:sz="4" w:color="BFBFBF"/>
+              <w:insideH w:val="single" w:sz="4" w:color="BFBFBF"/>
+              <w:insideV w:val="single" w:sz="4" w:color="BFBFBF"/>
+            </w:tcBorders>
+          </w:tcPr>
+          <w:p>
+            <w:r/>
+            <w:r>
+              <w:t>❌ 崩</w:t>
+            </w:r>
+          </w:p>
+        </w:tc>
+        <w:tc>
+          <w:tcPr>
+            <w:tcW w:type="dxa" w:w="2409"/>
+            <w:tcBorders>
+              <w:top w:val="single" w:sz="4" w:color="BFBFBF"/>
+              <w:left w:val="single" w:sz="4" w:color="BFBFBF"/>
+              <w:bottom w:val="single" w:sz="4" w:color="BFBFBF"/>
+              <w:right w:val="single" w:sz="4" w:color="BFBFBF"/>
+              <w:insideH w:val="single" w:sz="4" w:color="BFBFBF"/>
+              <w:insideV w:val="single" w:sz="4" w:color="BFBFBF"/>
+            </w:tcBorders>
+          </w:tcPr>
+          <w:p>
+            <w:r/>
+            <w:r>
+              <w:t>物理限制</w:t>
+            </w:r>
+          </w:p>
+        </w:tc>
+      </w:tr>
+      <w:tr>
+        <w:tc>
+          <w:tcPr>
+            <w:tcW w:type="dxa" w:w="2409"/>
+            <w:tcBorders>
+              <w:top w:val="single" w:sz="4" w:color="BFBFBF"/>
+              <w:left w:val="single" w:sz="4" w:color="BFBFBF"/>
+              <w:bottom w:val="single" w:sz="4" w:color="BFBFBF"/>
+              <w:right w:val="single" w:sz="4" w:color="BFBFBF"/>
+              <w:insideH w:val="single" w:sz="4" w:color="BFBFBF"/>
+              <w:insideV w:val="single" w:sz="4" w:color="BFBFBF"/>
+            </w:tcBorders>
+          </w:tcPr>
+          <w:p>
+            <w:r/>
+            <w:r>
+              <w:t>0.01</w:t>
+            </w:r>
+          </w:p>
+        </w:tc>
+        <w:tc>
+          <w:tcPr>
+            <w:tcW w:type="dxa" w:w="2409"/>
+            <w:tcBorders>
+              <w:top w:val="single" w:sz="4" w:color="BFBFBF"/>
+              <w:left w:val="single" w:sz="4" w:color="BFBFBF"/>
+              <w:bottom w:val="single" w:sz="4" w:color="BFBFBF"/>
+              <w:right w:val="single" w:sz="4" w:color="BFBFBF"/>
+              <w:insideH w:val="single" w:sz="4" w:color="BFBFBF"/>
+              <w:insideV w:val="single" w:sz="4" w:color="BFBFBF"/>
+            </w:tcBorders>
+          </w:tcPr>
+          <w:p>
+            <w:r/>
+            <w:r>
+              <w:t>~750</w:t>
+            </w:r>
+          </w:p>
+        </w:tc>
+        <w:tc>
+          <w:tcPr>
+            <w:tcW w:type="dxa" w:w="2409"/>
+            <w:tcBorders>
+              <w:top w:val="single" w:sz="4" w:color="BFBFBF"/>
+              <w:left w:val="single" w:sz="4" w:color="BFBFBF"/>
+              <w:bottom w:val="single" w:sz="4" w:color="BFBFBF"/>
+              <w:right w:val="single" w:sz="4" w:color="BFBFBF"/>
+              <w:insideH w:val="single" w:sz="4" w:color="BFBFBF"/>
+              <w:insideV w:val="single" w:sz="4" w:color="BFBFBF"/>
+            </w:tcBorders>
+          </w:tcPr>
+          <w:p>
+            <w:r/>
+            <w:r>
+              <w:t>❌ 完全不可用</w:t>
+            </w:r>
+          </w:p>
+        </w:tc>
+        <w:tc>
+          <w:tcPr>
+            <w:tcW w:type="dxa" w:w="2409"/>
+            <w:tcBorders>
+              <w:top w:val="single" w:sz="4" w:color="BFBFBF"/>
+              <w:left w:val="single" w:sz="4" w:color="BFBFBF"/>
+              <w:bottom w:val="single" w:sz="4" w:color="BFBFBF"/>
+              <w:right w:val="single" w:sz="4" w:color="BFBFBF"/>
+              <w:insideH w:val="single" w:sz="4" w:color="BFBFBF"/>
+              <w:insideV w:val="single" w:sz="4" w:color="BFBFBF"/>
+            </w:tcBorders>
+          </w:tcPr>
+          <w:p>
+            <w:r/>
+            <w:r>
+              <w:t>–</w:t>
+            </w:r>
+          </w:p>
+        </w:tc>
+      </w:tr>
+    </w:tbl>
+    <w:p>
+      <w:r>
+        <w:rPr>
+          <w:b/>
+        </w:rPr>
+        <w:t>Aggressive 真正適用場景</w:t>
+      </w:r>
+      <w:r>
+        <w:t>：</w:t>
+        <w:br/>
+        <w:t>* ✓ 「ratio 0.1 設了但 boundary 拖到實際 0.28，user 想壓回 0.15-0.2」這種</w:t>
+      </w:r>
+      <w:r>
+        <w:rPr>
+          <w:b/>
+        </w:rPr>
+        <w:t>中間 trim</w:t>
+      </w:r>
+      <w:r>
+        <w:br/>
+        <w:t>* ✗ 「想突破 mesh 表達能力下限」 — aggressive 救不了，破得跟 normal 差不多</w:t>
+        <w:br/>
+        <w:t>* ✗ 「ratio 太低時想拿來救」 — root cause 是 face budget 不夠表達結構，跟 boundary 無關</w:t>
+      </w:r>
+    </w:p>
+    <w:p>
+      <w:r>
+        <w:rPr>
+          <w:b/>
+        </w:rPr>
+        <w:t>結論</w:t>
+      </w:r>
+      <w:r>
+        <w:t xml:space="preserve">：對 24 material slot 級別工業 CAD，ratio </w:t>
+      </w:r>
+      <w:r>
+        <w:rPr>
+          <w:b/>
+        </w:rPr>
+        <w:t>建議 ≥ 0.1</w:t>
+      </w:r>
+      <w:r>
+        <w:t>。aggressive 是 trim 工具，不是物理 limit 突破工具。</w:t>
       </w:r>
     </w:p>
     <w:p>

</xml_diff>

<commit_message>
feat(preset): post-collapse cull enters tier1/2/3 + USER_GUIDE §6.8.8
5AxisGlueSpraying.fbx three-way validation:
* island_count -33.8% (8951 -> 5922) at min-faces=10
* largest_islands [283,265,258,236,175] unchanged across E1/E2/E3
* inverted_normals 24 -> 0 (orphans carried bad normals)
* hausdorff r->o = 0.000000 (E2 is strict subset of E1)
* min-faces=20 ate HMI bezel + control box panels (visual confirmed)

min-faces=10 is the sweet spot: removes 1-9 face shrapnel while
preserving small legitimate parts (sensors, fasteners, HMI bezels).

* PRESETS["tier1"/"tier2"/"tier3"] add post_collapse_cull=True,
  post_collapse_cull_min_faces=10
* _apply_preset() honours scalar threshold from preset
* USER_GUIDE.md §6.1/6.2/6.3 preset expansion strings updated
* USER_GUIDE.md §6.8.8 new — case study + post-weld vs post-cull
  methodology comparison
* USER_GUIDE.md former §6.8.8 (game industry LOD) renumbered §6.8.9
* USER_GUIDE.pdf + .docx rebuilt
</commit_message>
<xml_diff>
--- a/docs/USER_GUIDE.docx
+++ b/docs/USER_GUIDE.docx
@@ -4114,7 +4114,7 @@
           <w:color w:val="C7254E"/>
           <w:sz w:val="20"/>
         </w:rPr>
-        <w:t>--backend blender --ratio 0.1 --cull-disjoint 0.025 --auto-fill-holes --fill-holes-skip-design --bridge-loops</w:t>
+        <w:t>--backend blender --ratio 0.1 --cull-disjoint 0.025 --auto-fill-holes --fill-holes-skip-design --bridge-loops --post-collapse-cull</w:t>
       </w:r>
     </w:p>
     <w:p>
@@ -4216,7 +4216,7 @@
           <w:color w:val="C7254E"/>
           <w:sz w:val="20"/>
         </w:rPr>
-        <w:t>--backend blender --ratio 0.25 --cull-disjoint 0.04 --auto-fill-holes --fill-holes-skip-design --bridge-loops</w:t>
+        <w:t>--backend blender --ratio 0.25 --cull-disjoint 0.04 --auto-fill-holes --fill-holes-skip-design --bridge-loops --post-collapse-cull</w:t>
       </w:r>
     </w:p>
     <w:p>
@@ -4313,7 +4313,7 @@
           <w:color w:val="C7254E"/>
           <w:sz w:val="20"/>
         </w:rPr>
-        <w:t>--backend blender --ratio 0.5 --cull-disjoint 0.03 --auto-fill-holes --fill-holes-skip-design --bridge-loops</w:t>
+        <w:t>--backend blender --ratio 0.5 --cull-disjoint 0.03 --auto-fill-holes --fill-holes-skip-design --bridge-loops --post-collapse-cull</w:t>
       </w:r>
     </w:p>
     <w:p>
@@ -13174,7 +13174,1558 @@
         <w:pStyle w:val="Heading3"/>
       </w:pPr>
       <w:r>
-        <w:t>6.8.8 跟遊戲業 LOD 的差別</w:t>
+        <w:t>6.8.8 Stage 2.7 — Post-collapse Island Cull（成功 case，已進 preset）</w:t>
+      </w:r>
+    </w:p>
+    <w:p>
+      <w:r>
+        <w:t>§5.4 的 Stage 0.5 cull 只清「降面前」就漂浮的 island；但 Stage 2 COLLAPSE 會</w:t>
+      </w:r>
+      <w:r>
+        <w:rPr>
+          <w:b/>
+        </w:rPr>
+        <w:t>新製造</w:t>
+      </w:r>
+      <w:r>
+        <w:t>孤兒——material delimit、sharp delimit 切開部件邊界後，兩側獨立 collapse 留下 1-9 face 的小碎片。這些「降面後新生孤兒」之前 pipeline 不處理，直接寫進輸出 FBX，產線同事在 viewer 上看到一團「黃色面板前的尖刺漂浮物」。</w:t>
+      </w:r>
+    </w:p>
+    <w:p>
+      <w:r>
+        <w:rPr>
+          <w:rFonts w:ascii="Consolas" w:hAnsi="Consolas"/>
+          <w:color w:val="C7254E"/>
+          <w:sz w:val="20"/>
+        </w:rPr>
+        <w:t>--post-collapse-cull</w:t>
+      </w:r>
+      <w:r>
+        <w:t xml:space="preserve"> 在所有 repair pass 之後（Stage 2.6 smooth 之後、export 之前）跑一次 BFS 找 connected components，刪除 face_count &lt; </w:t>
+      </w:r>
+      <w:r>
+        <w:rPr>
+          <w:rFonts w:ascii="Consolas" w:hAnsi="Consolas"/>
+          <w:color w:val="C7254E"/>
+          <w:sz w:val="20"/>
+        </w:rPr>
+        <w:t>--post-collapse-cull-min-faces</w:t>
+      </w:r>
+      <w:r>
+        <w:t xml:space="preserve"> 的小 island。</w:t>
+      </w:r>
+    </w:p>
+    <w:p>
+      <w:r>
+        <w:rPr>
+          <w:b/>
+        </w:rPr>
+        <w:t>5AxisGlueSpraying.fbx 三組對比</w:t>
+      </w:r>
+    </w:p>
+    <w:tbl>
+      <w:tblPr>
+        <w:tblStyle w:val="TableGrid"/>
+        <w:tblW w:type="auto" w:w="0"/>
+        <w:jc w:val="left"/>
+        <w:tblLook w:firstColumn="1" w:firstRow="1" w:lastColumn="0" w:lastRow="0" w:noHBand="0" w:noVBand="1" w:val="04A0"/>
+      </w:tblPr>
+      <w:tblGrid>
+        <w:gridCol w:w="2409"/>
+        <w:gridCol w:w="2409"/>
+        <w:gridCol w:w="2409"/>
+        <w:gridCol w:w="2409"/>
+      </w:tblGrid>
+      <w:tr>
+        <w:tc>
+          <w:tcPr>
+            <w:tcW w:type="dxa" w:w="2409"/>
+            <w:tcBorders>
+              <w:top w:val="single" w:sz="4" w:color="BFBFBF"/>
+              <w:left w:val="single" w:sz="4" w:color="BFBFBF"/>
+              <w:bottom w:val="single" w:sz="4" w:color="BFBFBF"/>
+              <w:right w:val="single" w:sz="4" w:color="BFBFBF"/>
+              <w:insideH w:val="single" w:sz="4" w:color="BFBFBF"/>
+              <w:insideV w:val="single" w:sz="4" w:color="BFBFBF"/>
+            </w:tcBorders>
+            <w:shd w:val="clear" w:color="auto" w:fill="F6F8FA"/>
+          </w:tcPr>
+          <w:p>
+            <w:r>
+              <w:rPr>
+                <w:b/>
+              </w:rPr>
+            </w:r>
+            <w:r>
+              <w:rPr>
+                <w:b/>
+              </w:rPr>
+              <w:t>指標</w:t>
+            </w:r>
+          </w:p>
+        </w:tc>
+        <w:tc>
+          <w:tcPr>
+            <w:tcW w:type="dxa" w:w="2409"/>
+            <w:tcBorders>
+              <w:top w:val="single" w:sz="4" w:color="BFBFBF"/>
+              <w:left w:val="single" w:sz="4" w:color="BFBFBF"/>
+              <w:bottom w:val="single" w:sz="4" w:color="BFBFBF"/>
+              <w:right w:val="single" w:sz="4" w:color="BFBFBF"/>
+              <w:insideH w:val="single" w:sz="4" w:color="BFBFBF"/>
+              <w:insideV w:val="single" w:sz="4" w:color="BFBFBF"/>
+            </w:tcBorders>
+            <w:shd w:val="clear" w:color="auto" w:fill="F6F8FA"/>
+          </w:tcPr>
+          <w:p>
+            <w:r>
+              <w:rPr>
+                <w:b/>
+              </w:rPr>
+            </w:r>
+            <w:r>
+              <w:rPr>
+                <w:b/>
+              </w:rPr>
+              <w:t>E1 不開 cull</w:t>
+            </w:r>
+          </w:p>
+        </w:tc>
+        <w:tc>
+          <w:tcPr>
+            <w:tcW w:type="dxa" w:w="2409"/>
+            <w:tcBorders>
+              <w:top w:val="single" w:sz="4" w:color="BFBFBF"/>
+              <w:left w:val="single" w:sz="4" w:color="BFBFBF"/>
+              <w:bottom w:val="single" w:sz="4" w:color="BFBFBF"/>
+              <w:right w:val="single" w:sz="4" w:color="BFBFBF"/>
+              <w:insideH w:val="single" w:sz="4" w:color="BFBFBF"/>
+              <w:insideV w:val="single" w:sz="4" w:color="BFBFBF"/>
+            </w:tcBorders>
+            <w:shd w:val="clear" w:color="auto" w:fill="F6F8FA"/>
+          </w:tcPr>
+          <w:p>
+            <w:r>
+              <w:rPr>
+                <w:b/>
+              </w:rPr>
+            </w:r>
+            <w:r>
+              <w:rPr>
+                <w:b/>
+              </w:rPr>
+              <w:t>E2 cull min=10</w:t>
+            </w:r>
+          </w:p>
+        </w:tc>
+        <w:tc>
+          <w:tcPr>
+            <w:tcW w:type="dxa" w:w="2409"/>
+            <w:tcBorders>
+              <w:top w:val="single" w:sz="4" w:color="BFBFBF"/>
+              <w:left w:val="single" w:sz="4" w:color="BFBFBF"/>
+              <w:bottom w:val="single" w:sz="4" w:color="BFBFBF"/>
+              <w:right w:val="single" w:sz="4" w:color="BFBFBF"/>
+              <w:insideH w:val="single" w:sz="4" w:color="BFBFBF"/>
+              <w:insideV w:val="single" w:sz="4" w:color="BFBFBF"/>
+            </w:tcBorders>
+            <w:shd w:val="clear" w:color="auto" w:fill="F6F8FA"/>
+          </w:tcPr>
+          <w:p>
+            <w:r>
+              <w:rPr>
+                <w:b/>
+              </w:rPr>
+            </w:r>
+            <w:r>
+              <w:rPr>
+                <w:b/>
+              </w:rPr>
+              <w:t>E3 cull min=20</w:t>
+            </w:r>
+          </w:p>
+        </w:tc>
+      </w:tr>
+      <w:tr>
+        <w:tc>
+          <w:tcPr>
+            <w:tcW w:type="dxa" w:w="2409"/>
+            <w:tcBorders>
+              <w:top w:val="single" w:sz="4" w:color="BFBFBF"/>
+              <w:left w:val="single" w:sz="4" w:color="BFBFBF"/>
+              <w:bottom w:val="single" w:sz="4" w:color="BFBFBF"/>
+              <w:right w:val="single" w:sz="4" w:color="BFBFBF"/>
+              <w:insideH w:val="single" w:sz="4" w:color="BFBFBF"/>
+              <w:insideV w:val="single" w:sz="4" w:color="BFBFBF"/>
+            </w:tcBorders>
+          </w:tcPr>
+          <w:p>
+            <w:r/>
+            <w:r>
+              <w:t>face_count</w:t>
+            </w:r>
+          </w:p>
+        </w:tc>
+        <w:tc>
+          <w:tcPr>
+            <w:tcW w:type="dxa" w:w="2409"/>
+            <w:tcBorders>
+              <w:top w:val="single" w:sz="4" w:color="BFBFBF"/>
+              <w:left w:val="single" w:sz="4" w:color="BFBFBF"/>
+              <w:bottom w:val="single" w:sz="4" w:color="BFBFBF"/>
+              <w:right w:val="single" w:sz="4" w:color="BFBFBF"/>
+              <w:insideH w:val="single" w:sz="4" w:color="BFBFBF"/>
+              <w:insideV w:val="single" w:sz="4" w:color="BFBFBF"/>
+            </w:tcBorders>
+          </w:tcPr>
+          <w:p>
+            <w:r/>
+            <w:r>
+              <w:t>26029</w:t>
+            </w:r>
+          </w:p>
+        </w:tc>
+        <w:tc>
+          <w:tcPr>
+            <w:tcW w:type="dxa" w:w="2409"/>
+            <w:tcBorders>
+              <w:top w:val="single" w:sz="4" w:color="BFBFBF"/>
+              <w:left w:val="single" w:sz="4" w:color="BFBFBF"/>
+              <w:bottom w:val="single" w:sz="4" w:color="BFBFBF"/>
+              <w:right w:val="single" w:sz="4" w:color="BFBFBF"/>
+              <w:insideH w:val="single" w:sz="4" w:color="BFBFBF"/>
+              <w:insideV w:val="single" w:sz="4" w:color="BFBFBF"/>
+            </w:tcBorders>
+          </w:tcPr>
+          <w:p>
+            <w:r/>
+            <w:r>
+              <w:t>20708</w:t>
+            </w:r>
+          </w:p>
+        </w:tc>
+        <w:tc>
+          <w:tcPr>
+            <w:tcW w:type="dxa" w:w="2409"/>
+            <w:tcBorders>
+              <w:top w:val="single" w:sz="4" w:color="BFBFBF"/>
+              <w:left w:val="single" w:sz="4" w:color="BFBFBF"/>
+              <w:bottom w:val="single" w:sz="4" w:color="BFBFBF"/>
+              <w:right w:val="single" w:sz="4" w:color="BFBFBF"/>
+              <w:insideH w:val="single" w:sz="4" w:color="BFBFBF"/>
+              <w:insideV w:val="single" w:sz="4" w:color="BFBFBF"/>
+            </w:tcBorders>
+          </w:tcPr>
+          <w:p>
+            <w:r/>
+            <w:r>
+              <w:t>17889</w:t>
+            </w:r>
+          </w:p>
+        </w:tc>
+      </w:tr>
+      <w:tr>
+        <w:tc>
+          <w:tcPr>
+            <w:tcW w:type="dxa" w:w="2409"/>
+            <w:tcBorders>
+              <w:top w:val="single" w:sz="4" w:color="BFBFBF"/>
+              <w:left w:val="single" w:sz="4" w:color="BFBFBF"/>
+              <w:bottom w:val="single" w:sz="4" w:color="BFBFBF"/>
+              <w:right w:val="single" w:sz="4" w:color="BFBFBF"/>
+              <w:insideH w:val="single" w:sz="4" w:color="BFBFBF"/>
+              <w:insideV w:val="single" w:sz="4" w:color="BFBFBF"/>
+            </w:tcBorders>
+          </w:tcPr>
+          <w:p>
+            <w:r/>
+            <w:r>
+              <w:rPr>
+                <w:b/>
+              </w:rPr>
+              <w:t>island_count</w:t>
+            </w:r>
+          </w:p>
+        </w:tc>
+        <w:tc>
+          <w:tcPr>
+            <w:tcW w:type="dxa" w:w="2409"/>
+            <w:tcBorders>
+              <w:top w:val="single" w:sz="4" w:color="BFBFBF"/>
+              <w:left w:val="single" w:sz="4" w:color="BFBFBF"/>
+              <w:bottom w:val="single" w:sz="4" w:color="BFBFBF"/>
+              <w:right w:val="single" w:sz="4" w:color="BFBFBF"/>
+              <w:insideH w:val="single" w:sz="4" w:color="BFBFBF"/>
+              <w:insideV w:val="single" w:sz="4" w:color="BFBFBF"/>
+            </w:tcBorders>
+          </w:tcPr>
+          <w:p>
+            <w:r/>
+            <w:r>
+              <w:t>8951</w:t>
+            </w:r>
+          </w:p>
+        </w:tc>
+        <w:tc>
+          <w:tcPr>
+            <w:tcW w:type="dxa" w:w="2409"/>
+            <w:tcBorders>
+              <w:top w:val="single" w:sz="4" w:color="BFBFBF"/>
+              <w:left w:val="single" w:sz="4" w:color="BFBFBF"/>
+              <w:bottom w:val="single" w:sz="4" w:color="BFBFBF"/>
+              <w:right w:val="single" w:sz="4" w:color="BFBFBF"/>
+              <w:insideH w:val="single" w:sz="4" w:color="BFBFBF"/>
+              <w:insideV w:val="single" w:sz="4" w:color="BFBFBF"/>
+            </w:tcBorders>
+          </w:tcPr>
+          <w:p>
+            <w:r/>
+            <w:r>
+              <w:rPr>
+                <w:b/>
+              </w:rPr>
+              <w:t>5922 (-33.8%)</w:t>
+            </w:r>
+          </w:p>
+        </w:tc>
+        <w:tc>
+          <w:tcPr>
+            <w:tcW w:type="dxa" w:w="2409"/>
+            <w:tcBorders>
+              <w:top w:val="single" w:sz="4" w:color="BFBFBF"/>
+              <w:left w:val="single" w:sz="4" w:color="BFBFBF"/>
+              <w:bottom w:val="single" w:sz="4" w:color="BFBFBF"/>
+              <w:right w:val="single" w:sz="4" w:color="BFBFBF"/>
+              <w:insideH w:val="single" w:sz="4" w:color="BFBFBF"/>
+              <w:insideV w:val="single" w:sz="4" w:color="BFBFBF"/>
+            </w:tcBorders>
+          </w:tcPr>
+          <w:p>
+            <w:r/>
+            <w:r>
+              <w:t>4819 (-46.2%)</w:t>
+            </w:r>
+          </w:p>
+        </w:tc>
+      </w:tr>
+      <w:tr>
+        <w:tc>
+          <w:tcPr>
+            <w:tcW w:type="dxa" w:w="2409"/>
+            <w:tcBorders>
+              <w:top w:val="single" w:sz="4" w:color="BFBFBF"/>
+              <w:left w:val="single" w:sz="4" w:color="BFBFBF"/>
+              <w:bottom w:val="single" w:sz="4" w:color="BFBFBF"/>
+              <w:right w:val="single" w:sz="4" w:color="BFBFBF"/>
+              <w:insideH w:val="single" w:sz="4" w:color="BFBFBF"/>
+              <w:insideV w:val="single" w:sz="4" w:color="BFBFBF"/>
+            </w:tcBorders>
+          </w:tcPr>
+          <w:p>
+            <w:r/>
+            <w:r>
+              <w:rPr>
+                <w:b/>
+              </w:rPr>
+              <w:t>largest_islands</w:t>
+            </w:r>
+            <w:r>
+              <w:t xml:space="preserve"> (top 5)</w:t>
+            </w:r>
+          </w:p>
+        </w:tc>
+        <w:tc>
+          <w:tcPr>
+            <w:tcW w:type="dxa" w:w="2409"/>
+            <w:tcBorders>
+              <w:top w:val="single" w:sz="4" w:color="BFBFBF"/>
+              <w:left w:val="single" w:sz="4" w:color="BFBFBF"/>
+              <w:bottom w:val="single" w:sz="4" w:color="BFBFBF"/>
+              <w:right w:val="single" w:sz="4" w:color="BFBFBF"/>
+              <w:insideH w:val="single" w:sz="4" w:color="BFBFBF"/>
+              <w:insideV w:val="single" w:sz="4" w:color="BFBFBF"/>
+            </w:tcBorders>
+          </w:tcPr>
+          <w:p>
+            <w:r/>
+            <w:r>
+              <w:t>[283,265,258,236,175]</w:t>
+            </w:r>
+          </w:p>
+        </w:tc>
+        <w:tc>
+          <w:tcPr>
+            <w:tcW w:type="dxa" w:w="2409"/>
+            <w:tcBorders>
+              <w:top w:val="single" w:sz="4" w:color="BFBFBF"/>
+              <w:left w:val="single" w:sz="4" w:color="BFBFBF"/>
+              <w:bottom w:val="single" w:sz="4" w:color="BFBFBF"/>
+              <w:right w:val="single" w:sz="4" w:color="BFBFBF"/>
+              <w:insideH w:val="single" w:sz="4" w:color="BFBFBF"/>
+              <w:insideV w:val="single" w:sz="4" w:color="BFBFBF"/>
+            </w:tcBorders>
+          </w:tcPr>
+          <w:p>
+            <w:r/>
+            <w:r>
+              <w:rPr>
+                <w:b/>
+              </w:rPr>
+              <w:t>完全相同</w:t>
+            </w:r>
+          </w:p>
+        </w:tc>
+        <w:tc>
+          <w:tcPr>
+            <w:tcW w:type="dxa" w:w="2409"/>
+            <w:tcBorders>
+              <w:top w:val="single" w:sz="4" w:color="BFBFBF"/>
+              <w:left w:val="single" w:sz="4" w:color="BFBFBF"/>
+              <w:bottom w:val="single" w:sz="4" w:color="BFBFBF"/>
+              <w:right w:val="single" w:sz="4" w:color="BFBFBF"/>
+              <w:insideH w:val="single" w:sz="4" w:color="BFBFBF"/>
+              <w:insideV w:val="single" w:sz="4" w:color="BFBFBF"/>
+            </w:tcBorders>
+          </w:tcPr>
+          <w:p>
+            <w:r/>
+            <w:r>
+              <w:rPr>
+                <w:b/>
+              </w:rPr>
+              <w:t>完全相同</w:t>
+            </w:r>
+          </w:p>
+        </w:tc>
+      </w:tr>
+      <w:tr>
+        <w:tc>
+          <w:tcPr>
+            <w:tcW w:type="dxa" w:w="2409"/>
+            <w:tcBorders>
+              <w:top w:val="single" w:sz="4" w:color="BFBFBF"/>
+              <w:left w:val="single" w:sz="4" w:color="BFBFBF"/>
+              <w:bottom w:val="single" w:sz="4" w:color="BFBFBF"/>
+              <w:right w:val="single" w:sz="4" w:color="BFBFBF"/>
+              <w:insideH w:val="single" w:sz="4" w:color="BFBFBF"/>
+              <w:insideV w:val="single" w:sz="4" w:color="BFBFBF"/>
+            </w:tcBorders>
+          </w:tcPr>
+          <w:p>
+            <w:r/>
+            <w:r>
+              <w:t>boundary_edges</w:t>
+            </w:r>
+          </w:p>
+        </w:tc>
+        <w:tc>
+          <w:tcPr>
+            <w:tcW w:type="dxa" w:w="2409"/>
+            <w:tcBorders>
+              <w:top w:val="single" w:sz="4" w:color="BFBFBF"/>
+              <w:left w:val="single" w:sz="4" w:color="BFBFBF"/>
+              <w:bottom w:val="single" w:sz="4" w:color="BFBFBF"/>
+              <w:right w:val="single" w:sz="4" w:color="BFBFBF"/>
+              <w:insideH w:val="single" w:sz="4" w:color="BFBFBF"/>
+              <w:insideV w:val="single" w:sz="4" w:color="BFBFBF"/>
+            </w:tcBorders>
+          </w:tcPr>
+          <w:p>
+            <w:r/>
+            <w:r>
+              <w:t>40775</w:t>
+            </w:r>
+          </w:p>
+        </w:tc>
+        <w:tc>
+          <w:tcPr>
+            <w:tcW w:type="dxa" w:w="2409"/>
+            <w:tcBorders>
+              <w:top w:val="single" w:sz="4" w:color="BFBFBF"/>
+              <w:left w:val="single" w:sz="4" w:color="BFBFBF"/>
+              <w:bottom w:val="single" w:sz="4" w:color="BFBFBF"/>
+              <w:right w:val="single" w:sz="4" w:color="BFBFBF"/>
+              <w:insideH w:val="single" w:sz="4" w:color="BFBFBF"/>
+              <w:insideV w:val="single" w:sz="4" w:color="BFBFBF"/>
+            </w:tcBorders>
+          </w:tcPr>
+          <w:p>
+            <w:r/>
+            <w:r>
+              <w:t>29836</w:t>
+            </w:r>
+          </w:p>
+        </w:tc>
+        <w:tc>
+          <w:tcPr>
+            <w:tcW w:type="dxa" w:w="2409"/>
+            <w:tcBorders>
+              <w:top w:val="single" w:sz="4" w:color="BFBFBF"/>
+              <w:left w:val="single" w:sz="4" w:color="BFBFBF"/>
+              <w:bottom w:val="single" w:sz="4" w:color="BFBFBF"/>
+              <w:right w:val="single" w:sz="4" w:color="BFBFBF"/>
+              <w:insideH w:val="single" w:sz="4" w:color="BFBFBF"/>
+              <w:insideV w:val="single" w:sz="4" w:color="BFBFBF"/>
+            </w:tcBorders>
+          </w:tcPr>
+          <w:p>
+            <w:r/>
+            <w:r>
+              <w:t>25221</w:t>
+            </w:r>
+          </w:p>
+        </w:tc>
+      </w:tr>
+      <w:tr>
+        <w:tc>
+          <w:tcPr>
+            <w:tcW w:type="dxa" w:w="2409"/>
+            <w:tcBorders>
+              <w:top w:val="single" w:sz="4" w:color="BFBFBF"/>
+              <w:left w:val="single" w:sz="4" w:color="BFBFBF"/>
+              <w:bottom w:val="single" w:sz="4" w:color="BFBFBF"/>
+              <w:right w:val="single" w:sz="4" w:color="BFBFBF"/>
+              <w:insideH w:val="single" w:sz="4" w:color="BFBFBF"/>
+              <w:insideV w:val="single" w:sz="4" w:color="BFBFBF"/>
+            </w:tcBorders>
+          </w:tcPr>
+          <w:p>
+            <w:r/>
+            <w:r>
+              <w:t>inverted_normals</w:t>
+            </w:r>
+          </w:p>
+        </w:tc>
+        <w:tc>
+          <w:tcPr>
+            <w:tcW w:type="dxa" w:w="2409"/>
+            <w:tcBorders>
+              <w:top w:val="single" w:sz="4" w:color="BFBFBF"/>
+              <w:left w:val="single" w:sz="4" w:color="BFBFBF"/>
+              <w:bottom w:val="single" w:sz="4" w:color="BFBFBF"/>
+              <w:right w:val="single" w:sz="4" w:color="BFBFBF"/>
+              <w:insideH w:val="single" w:sz="4" w:color="BFBFBF"/>
+              <w:insideV w:val="single" w:sz="4" w:color="BFBFBF"/>
+            </w:tcBorders>
+          </w:tcPr>
+          <w:p>
+            <w:r/>
+            <w:r>
+              <w:t>24</w:t>
+            </w:r>
+          </w:p>
+        </w:tc>
+        <w:tc>
+          <w:tcPr>
+            <w:tcW w:type="dxa" w:w="2409"/>
+            <w:tcBorders>
+              <w:top w:val="single" w:sz="4" w:color="BFBFBF"/>
+              <w:left w:val="single" w:sz="4" w:color="BFBFBF"/>
+              <w:bottom w:val="single" w:sz="4" w:color="BFBFBF"/>
+              <w:right w:val="single" w:sz="4" w:color="BFBFBF"/>
+              <w:insideH w:val="single" w:sz="4" w:color="BFBFBF"/>
+              <w:insideV w:val="single" w:sz="4" w:color="BFBFBF"/>
+            </w:tcBorders>
+          </w:tcPr>
+          <w:p>
+            <w:r/>
+            <w:r>
+              <w:rPr>
+                <w:b/>
+              </w:rPr>
+              <w:t>0</w:t>
+            </w:r>
+          </w:p>
+        </w:tc>
+        <w:tc>
+          <w:tcPr>
+            <w:tcW w:type="dxa" w:w="2409"/>
+            <w:tcBorders>
+              <w:top w:val="single" w:sz="4" w:color="BFBFBF"/>
+              <w:left w:val="single" w:sz="4" w:color="BFBFBF"/>
+              <w:bottom w:val="single" w:sz="4" w:color="BFBFBF"/>
+              <w:right w:val="single" w:sz="4" w:color="BFBFBF"/>
+              <w:insideH w:val="single" w:sz="4" w:color="BFBFBF"/>
+              <w:insideV w:val="single" w:sz="4" w:color="BFBFBF"/>
+            </w:tcBorders>
+          </w:tcPr>
+          <w:p>
+            <w:r/>
+            <w:r>
+              <w:t>0</w:t>
+            </w:r>
+          </w:p>
+        </w:tc>
+      </w:tr>
+      <w:tr>
+        <w:tc>
+          <w:tcPr>
+            <w:tcW w:type="dxa" w:w="2409"/>
+            <w:tcBorders>
+              <w:top w:val="single" w:sz="4" w:color="BFBFBF"/>
+              <w:left w:val="single" w:sz="4" w:color="BFBFBF"/>
+              <w:bottom w:val="single" w:sz="4" w:color="BFBFBF"/>
+              <w:right w:val="single" w:sz="4" w:color="BFBFBF"/>
+              <w:insideH w:val="single" w:sz="4" w:color="BFBFBF"/>
+              <w:insideV w:val="single" w:sz="4" w:color="BFBFBF"/>
+            </w:tcBorders>
+          </w:tcPr>
+          <w:p>
+            <w:r/>
+            <w:r>
+              <w:t>self_intersect %</w:t>
+            </w:r>
+          </w:p>
+        </w:tc>
+        <w:tc>
+          <w:tcPr>
+            <w:tcW w:type="dxa" w:w="2409"/>
+            <w:tcBorders>
+              <w:top w:val="single" w:sz="4" w:color="BFBFBF"/>
+              <w:left w:val="single" w:sz="4" w:color="BFBFBF"/>
+              <w:bottom w:val="single" w:sz="4" w:color="BFBFBF"/>
+              <w:right w:val="single" w:sz="4" w:color="BFBFBF"/>
+              <w:insideH w:val="single" w:sz="4" w:color="BFBFBF"/>
+              <w:insideV w:val="single" w:sz="4" w:color="BFBFBF"/>
+            </w:tcBorders>
+          </w:tcPr>
+          <w:p>
+            <w:r/>
+            <w:r>
+              <w:t>84.6%</w:t>
+            </w:r>
+          </w:p>
+        </w:tc>
+        <w:tc>
+          <w:tcPr>
+            <w:tcW w:type="dxa" w:w="2409"/>
+            <w:tcBorders>
+              <w:top w:val="single" w:sz="4" w:color="BFBFBF"/>
+              <w:left w:val="single" w:sz="4" w:color="BFBFBF"/>
+              <w:bottom w:val="single" w:sz="4" w:color="BFBFBF"/>
+              <w:right w:val="single" w:sz="4" w:color="BFBFBF"/>
+              <w:insideH w:val="single" w:sz="4" w:color="BFBFBF"/>
+              <w:insideV w:val="single" w:sz="4" w:color="BFBFBF"/>
+            </w:tcBorders>
+          </w:tcPr>
+          <w:p>
+            <w:r/>
+            <w:r>
+              <w:t>82.9%</w:t>
+            </w:r>
+          </w:p>
+        </w:tc>
+        <w:tc>
+          <w:tcPr>
+            <w:tcW w:type="dxa" w:w="2409"/>
+            <w:tcBorders>
+              <w:top w:val="single" w:sz="4" w:color="BFBFBF"/>
+              <w:left w:val="single" w:sz="4" w:color="BFBFBF"/>
+              <w:bottom w:val="single" w:sz="4" w:color="BFBFBF"/>
+              <w:right w:val="single" w:sz="4" w:color="BFBFBF"/>
+              <w:insideH w:val="single" w:sz="4" w:color="BFBFBF"/>
+              <w:insideV w:val="single" w:sz="4" w:color="BFBFBF"/>
+            </w:tcBorders>
+          </w:tcPr>
+          <w:p>
+            <w:r/>
+            <w:r>
+              <w:t>82.5%</w:t>
+            </w:r>
+          </w:p>
+        </w:tc>
+      </w:tr>
+      <w:tr>
+        <w:tc>
+          <w:tcPr>
+            <w:tcW w:type="dxa" w:w="2409"/>
+            <w:tcBorders>
+              <w:top w:val="single" w:sz="4" w:color="BFBFBF"/>
+              <w:left w:val="single" w:sz="4" w:color="BFBFBF"/>
+              <w:bottom w:val="single" w:sz="4" w:color="BFBFBF"/>
+              <w:right w:val="single" w:sz="4" w:color="BFBFBF"/>
+              <w:insideH w:val="single" w:sz="4" w:color="BFBFBF"/>
+              <w:insideV w:val="single" w:sz="4" w:color="BFBFBF"/>
+            </w:tcBorders>
+          </w:tcPr>
+          <w:p>
+            <w:r/>
+            <w:r>
+              <w:t>removed_islands</w:t>
+            </w:r>
+          </w:p>
+        </w:tc>
+        <w:tc>
+          <w:tcPr>
+            <w:tcW w:type="dxa" w:w="2409"/>
+            <w:tcBorders>
+              <w:top w:val="single" w:sz="4" w:color="BFBFBF"/>
+              <w:left w:val="single" w:sz="4" w:color="BFBFBF"/>
+              <w:bottom w:val="single" w:sz="4" w:color="BFBFBF"/>
+              <w:right w:val="single" w:sz="4" w:color="BFBFBF"/>
+              <w:insideH w:val="single" w:sz="4" w:color="BFBFBF"/>
+              <w:insideV w:val="single" w:sz="4" w:color="BFBFBF"/>
+            </w:tcBorders>
+          </w:tcPr>
+          <w:p>
+            <w:r/>
+            <w:r>
+              <w:t>0</w:t>
+            </w:r>
+          </w:p>
+        </w:tc>
+        <w:tc>
+          <w:tcPr>
+            <w:tcW w:type="dxa" w:w="2409"/>
+            <w:tcBorders>
+              <w:top w:val="single" w:sz="4" w:color="BFBFBF"/>
+              <w:left w:val="single" w:sz="4" w:color="BFBFBF"/>
+              <w:bottom w:val="single" w:sz="4" w:color="BFBFBF"/>
+              <w:right w:val="single" w:sz="4" w:color="BFBFBF"/>
+              <w:insideH w:val="single" w:sz="4" w:color="BFBFBF"/>
+              <w:insideV w:val="single" w:sz="4" w:color="BFBFBF"/>
+            </w:tcBorders>
+          </w:tcPr>
+          <w:p>
+            <w:r/>
+            <w:r>
+              <w:t>1623</w:t>
+            </w:r>
+          </w:p>
+        </w:tc>
+        <w:tc>
+          <w:tcPr>
+            <w:tcW w:type="dxa" w:w="2409"/>
+            <w:tcBorders>
+              <w:top w:val="single" w:sz="4" w:color="BFBFBF"/>
+              <w:left w:val="single" w:sz="4" w:color="BFBFBF"/>
+              <w:bottom w:val="single" w:sz="4" w:color="BFBFBF"/>
+              <w:right w:val="single" w:sz="4" w:color="BFBFBF"/>
+              <w:insideH w:val="single" w:sz="4" w:color="BFBFBF"/>
+              <w:insideV w:val="single" w:sz="4" w:color="BFBFBF"/>
+            </w:tcBorders>
+          </w:tcPr>
+          <w:p>
+            <w:r/>
+            <w:r>
+              <w:t>1829</w:t>
+            </w:r>
+          </w:p>
+        </w:tc>
+      </w:tr>
+    </w:tbl>
+    <w:p>
+      <w:r>
+        <w:rPr>
+          <w:b/>
+        </w:rPr>
+        <w:t>三個關鍵發現</w:t>
+      </w:r>
+    </w:p>
+    <w:p>
+      <w:pPr>
+        <w:pStyle w:val="ListNumber"/>
+        <w:ind w:left="340"/>
+      </w:pPr>
+      <w:r>
+        <w:rPr>
+          <w:b/>
+        </w:rPr>
+        <w:t>主體三組全等保留</w:t>
+      </w:r>
+      <w:r>
+        <w:t xml:space="preserve"> — top 5 island [283, 265, 258, 236, 175] 從 E1→E2→E3 完全相同，證明 cull 不傷主體。</w:t>
+      </w:r>
+    </w:p>
+    <w:p>
+      <w:pPr>
+        <w:pStyle w:val="ListNumber"/>
+        <w:ind w:left="340"/>
+      </w:pPr>
+      <w:r>
+        <w:rPr>
+          <w:b/>
+        </w:rPr>
+        <w:t>意外彩蛋：inverted_normals 從 24 → 0</w:t>
+      </w:r>
+      <w:r>
+        <w:t xml:space="preserve"> — 翻轉法向的 face 剛好都在被 cull 的小碎片裡，順手清掉。</w:t>
+      </w:r>
+    </w:p>
+    <w:p>
+      <w:pPr>
+        <w:pStyle w:val="ListNumber"/>
+        <w:ind w:left="340"/>
+      </w:pPr>
+      <w:r>
+        <w:rPr>
+          <w:b/>
+        </w:rPr>
+        <w:t>min=10→20 多刪的是有效部件</w:t>
+      </w:r>
+      <w:r>
+        <w:t xml:space="preserve"> — 平均每多刪 1 個 island = 12.6 face，這個級別對應 HMI 邊框、感測器頭、小螺絲。視覺驗證 E3 的 HMI 邊框消失、控制盒外殼破洞、機械臂頭粗糙——</w:t>
+      </w:r>
+      <w:r>
+        <w:rPr>
+          <w:b/>
+        </w:rPr>
+        <w:t>min=10 是甜蜜點</w:t>
+      </w:r>
+      <w:r>
+        <w:t>。</w:t>
+      </w:r>
+    </w:p>
+    <w:p>
+      <w:r>
+        <w:rPr>
+          <w:b/>
+        </w:rPr>
+        <w:t>geometric diff 驗證（E1 vs E2）</w:t>
+      </w:r>
+    </w:p>
+    <w:p>
+      <w:pPr>
+        <w:spacing w:before="80" w:after="80"/>
+        <w:ind w:left="283"/>
+        <w:shd w:val="clear" w:color="auto" w:fill="F6F8FA"/>
+      </w:pPr>
+      <w:r>
+        <w:rPr>
+          <w:rFonts w:ascii="Consolas" w:hAnsi="Consolas"/>
+          <w:sz w:val="19"/>
+        </w:rPr>
+        <w:t>hausdorff_max:       0.071234 (3.12% diag)</w:t>
+        <w:br/>
+        <w:t xml:space="preserve">  o-&gt;r:              0.071234       (E1 上孤兒最遠距離)</w:t>
+        <w:br/>
+        <w:t xml:space="preserve">  r-&gt;o:              0.000000  ⭐  (E2 是 E1 的嚴格子集)</w:t>
+        <w:br/>
+        <w:t>chamfer:             0.000915 (0.04% diag)</w:t>
+        <w:br/>
+        <w:t>mean_normal_dev_deg: 9.1225°</w:t>
+      </w:r>
+    </w:p>
+    <w:p>
+      <w:pPr>
+        <w:pStyle w:val="ListBullet"/>
+        <w:ind w:left="340"/>
+      </w:pPr>
+      <w:r>
+        <w:rPr>
+          <w:b/>
+        </w:rPr>
+        <w:t>r→o = 0.000000</w:t>
+      </w:r>
+      <w:r>
+        <w:t xml:space="preserve"> — cull 是純減法，不改 vertex 位置，這是</w:t>
+      </w:r>
+      <w:r>
+        <w:rPr>
+          <w:b/>
+        </w:rPr>
+        <w:t>結構上的數學保證</w:t>
+      </w:r>
+    </w:p>
+    <w:p>
+      <w:pPr>
+        <w:pStyle w:val="ListBullet"/>
+        <w:ind w:left="340"/>
+      </w:pPr>
+      <w:r>
+        <w:rPr>
+          <w:b/>
+        </w:rPr>
+        <w:t>chamfer 0.04%</w:t>
+      </w:r>
+      <w:r>
+        <w:t xml:space="preserve"> — 被刪部分都靠近主體（孤兒本來就是 collapse 切離主體的副產物）</w:t>
+      </w:r>
+    </w:p>
+    <w:p>
+      <w:pPr>
+        <w:pStyle w:val="ListBullet"/>
+        <w:ind w:left="340"/>
+      </w:pPr>
+      <w:r>
+        <w:rPr>
+          <w:b/>
+        </w:rPr>
+        <w:t>mean_normal_dev = 9.12°</w:t>
+      </w:r>
+      <w:r>
+        <w:t xml:space="preserve"> — 比 §6.8.3 tier1 baseline 12.06° </w:t>
+      </w:r>
+      <w:r>
+        <w:rPr>
+          <w:b/>
+        </w:rPr>
+        <w:t>還低</w:t>
+      </w:r>
+      <w:r>
+        <w:t>，因為 inverted_normals 順便清掉</w:t>
+      </w:r>
+    </w:p>
+    <w:p>
+      <w:r>
+        <w:rPr>
+          <w:b/>
+        </w:rPr>
+        <w:t>方法論：post-weld 失敗（§6.8.7）vs post-cull 成功（本節）的對照</w:t>
+      </w:r>
+    </w:p>
+    <w:p>
+      <w:r>
+        <w:t>兩個案例構成完整教育範例：</w:t>
+      </w:r>
+    </w:p>
+    <w:tbl>
+      <w:tblPr>
+        <w:tblStyle w:val="TableGrid"/>
+        <w:tblW w:type="auto" w:w="0"/>
+        <w:jc w:val="left"/>
+        <w:tblLook w:firstColumn="1" w:firstRow="1" w:lastColumn="0" w:lastRow="0" w:noHBand="0" w:noVBand="1" w:val="04A0"/>
+      </w:tblPr>
+      <w:tblGrid>
+        <w:gridCol w:w="3213"/>
+        <w:gridCol w:w="3213"/>
+        <w:gridCol w:w="3213"/>
+      </w:tblGrid>
+      <w:tr>
+        <w:tc>
+          <w:tcPr>
+            <w:tcW w:type="dxa" w:w="3213"/>
+            <w:tcBorders>
+              <w:top w:val="single" w:sz="4" w:color="BFBFBF"/>
+              <w:left w:val="single" w:sz="4" w:color="BFBFBF"/>
+              <w:bottom w:val="single" w:sz="4" w:color="BFBFBF"/>
+              <w:right w:val="single" w:sz="4" w:color="BFBFBF"/>
+              <w:insideH w:val="single" w:sz="4" w:color="BFBFBF"/>
+              <w:insideV w:val="single" w:sz="4" w:color="BFBFBF"/>
+            </w:tcBorders>
+            <w:shd w:val="clear" w:color="auto" w:fill="F6F8FA"/>
+          </w:tcPr>
+          <w:p>
+            <w:r>
+              <w:rPr>
+                <w:b/>
+              </w:rPr>
+            </w:r>
+            <w:r>
+              <w:rPr>
+                <w:b/>
+              </w:rPr>
+              <w:t>維度</w:t>
+            </w:r>
+          </w:p>
+        </w:tc>
+        <w:tc>
+          <w:tcPr>
+            <w:tcW w:type="dxa" w:w="3213"/>
+            <w:tcBorders>
+              <w:top w:val="single" w:sz="4" w:color="BFBFBF"/>
+              <w:left w:val="single" w:sz="4" w:color="BFBFBF"/>
+              <w:bottom w:val="single" w:sz="4" w:color="BFBFBF"/>
+              <w:right w:val="single" w:sz="4" w:color="BFBFBF"/>
+              <w:insideH w:val="single" w:sz="4" w:color="BFBFBF"/>
+              <w:insideV w:val="single" w:sz="4" w:color="BFBFBF"/>
+            </w:tcBorders>
+            <w:shd w:val="clear" w:color="auto" w:fill="F6F8FA"/>
+          </w:tcPr>
+          <w:p>
+            <w:r>
+              <w:rPr>
+                <w:b/>
+              </w:rPr>
+            </w:r>
+            <w:r>
+              <w:rPr>
+                <w:b/>
+              </w:rPr>
+              <w:t>post-weld (Stage 2.4，§6.8.7 失敗)</w:t>
+            </w:r>
+          </w:p>
+        </w:tc>
+        <w:tc>
+          <w:tcPr>
+            <w:tcW w:type="dxa" w:w="3213"/>
+            <w:tcBorders>
+              <w:top w:val="single" w:sz="4" w:color="BFBFBF"/>
+              <w:left w:val="single" w:sz="4" w:color="BFBFBF"/>
+              <w:bottom w:val="single" w:sz="4" w:color="BFBFBF"/>
+              <w:right w:val="single" w:sz="4" w:color="BFBFBF"/>
+              <w:insideH w:val="single" w:sz="4" w:color="BFBFBF"/>
+              <w:insideV w:val="single" w:sz="4" w:color="BFBFBF"/>
+            </w:tcBorders>
+            <w:shd w:val="clear" w:color="auto" w:fill="F6F8FA"/>
+          </w:tcPr>
+          <w:p>
+            <w:r>
+              <w:rPr>
+                <w:b/>
+              </w:rPr>
+            </w:r>
+            <w:r>
+              <w:rPr>
+                <w:b/>
+              </w:rPr>
+              <w:t>post-cull (Stage 2.7，本節成功)</w:t>
+            </w:r>
+          </w:p>
+        </w:tc>
+      </w:tr>
+      <w:tr>
+        <w:tc>
+          <w:tcPr>
+            <w:tcW w:type="dxa" w:w="3213"/>
+            <w:tcBorders>
+              <w:top w:val="single" w:sz="4" w:color="BFBFBF"/>
+              <w:left w:val="single" w:sz="4" w:color="BFBFBF"/>
+              <w:bottom w:val="single" w:sz="4" w:color="BFBFBF"/>
+              <w:right w:val="single" w:sz="4" w:color="BFBFBF"/>
+              <w:insideH w:val="single" w:sz="4" w:color="BFBFBF"/>
+              <w:insideV w:val="single" w:sz="4" w:color="BFBFBF"/>
+            </w:tcBorders>
+          </w:tcPr>
+          <w:p>
+            <w:r/>
+            <w:r>
+              <w:t>機制</w:t>
+            </w:r>
+          </w:p>
+        </w:tc>
+        <w:tc>
+          <w:tcPr>
+            <w:tcW w:type="dxa" w:w="3213"/>
+            <w:tcBorders>
+              <w:top w:val="single" w:sz="4" w:color="BFBFBF"/>
+              <w:left w:val="single" w:sz="4" w:color="BFBFBF"/>
+              <w:bottom w:val="single" w:sz="4" w:color="BFBFBF"/>
+              <w:right w:val="single" w:sz="4" w:color="BFBFBF"/>
+              <w:insideH w:val="single" w:sz="4" w:color="BFBFBF"/>
+              <w:insideV w:val="single" w:sz="4" w:color="BFBFBF"/>
+            </w:tcBorders>
+          </w:tcPr>
+          <w:p>
+            <w:r/>
+            <w:r>
+              <w:t>合 close vertex（</w:t>
+            </w:r>
+            <w:r>
+              <w:rPr>
+                <w:b/>
+              </w:rPr>
+              <w:t>動相連結構</w:t>
+            </w:r>
+            <w:r>
+              <w:t>）</w:t>
+            </w:r>
+          </w:p>
+        </w:tc>
+        <w:tc>
+          <w:tcPr>
+            <w:tcW w:type="dxa" w:w="3213"/>
+            <w:tcBorders>
+              <w:top w:val="single" w:sz="4" w:color="BFBFBF"/>
+              <w:left w:val="single" w:sz="4" w:color="BFBFBF"/>
+              <w:bottom w:val="single" w:sz="4" w:color="BFBFBF"/>
+              <w:right w:val="single" w:sz="4" w:color="BFBFBF"/>
+              <w:insideH w:val="single" w:sz="4" w:color="BFBFBF"/>
+              <w:insideV w:val="single" w:sz="4" w:color="BFBFBF"/>
+            </w:tcBorders>
+          </w:tcPr>
+          <w:p>
+            <w:r/>
+            <w:r>
+              <w:t>刪 small island（</w:t>
+            </w:r>
+            <w:r>
+              <w:rPr>
+                <w:b/>
+              </w:rPr>
+              <w:t>只動斷開部分</w:t>
+            </w:r>
+            <w:r>
+              <w:t>）</w:t>
+            </w:r>
+          </w:p>
+        </w:tc>
+      </w:tr>
+      <w:tr>
+        <w:tc>
+          <w:tcPr>
+            <w:tcW w:type="dxa" w:w="3213"/>
+            <w:tcBorders>
+              <w:top w:val="single" w:sz="4" w:color="BFBFBF"/>
+              <w:left w:val="single" w:sz="4" w:color="BFBFBF"/>
+              <w:bottom w:val="single" w:sz="4" w:color="BFBFBF"/>
+              <w:right w:val="single" w:sz="4" w:color="BFBFBF"/>
+              <w:insideH w:val="single" w:sz="4" w:color="BFBFBF"/>
+              <w:insideV w:val="single" w:sz="4" w:color="BFBFBF"/>
+            </w:tcBorders>
+          </w:tcPr>
+          <w:p>
+            <w:r/>
+            <w:r>
+              <w:t>對主體影響</w:t>
+            </w:r>
+          </w:p>
+        </w:tc>
+        <w:tc>
+          <w:tcPr>
+            <w:tcW w:type="dxa" w:w="3213"/>
+            <w:tcBorders>
+              <w:top w:val="single" w:sz="4" w:color="BFBFBF"/>
+              <w:left w:val="single" w:sz="4" w:color="BFBFBF"/>
+              <w:bottom w:val="single" w:sz="4" w:color="BFBFBF"/>
+              <w:right w:val="single" w:sz="4" w:color="BFBFBF"/>
+              <w:insideH w:val="single" w:sz="4" w:color="BFBFBF"/>
+              <w:insideV w:val="single" w:sz="4" w:color="BFBFBF"/>
+            </w:tcBorders>
+          </w:tcPr>
+          <w:p>
+            <w:r/>
+            <w:r>
+              <w:t>可能合掉細節（multiplier 5.0 過頭時）</w:t>
+            </w:r>
+          </w:p>
+        </w:tc>
+        <w:tc>
+          <w:tcPr>
+            <w:tcW w:type="dxa" w:w="3213"/>
+            <w:tcBorders>
+              <w:top w:val="single" w:sz="4" w:color="BFBFBF"/>
+              <w:left w:val="single" w:sz="4" w:color="BFBFBF"/>
+              <w:bottom w:val="single" w:sz="4" w:color="BFBFBF"/>
+              <w:right w:val="single" w:sz="4" w:color="BFBFBF"/>
+              <w:insideH w:val="single" w:sz="4" w:color="BFBFBF"/>
+              <w:insideV w:val="single" w:sz="4" w:color="BFBFBF"/>
+            </w:tcBorders>
+          </w:tcPr>
+          <w:p>
+            <w:r/>
+            <w:r>
+              <w:t>數學上不可能傷主體（純減法）</w:t>
+            </w:r>
+          </w:p>
+        </w:tc>
+      </w:tr>
+      <w:tr>
+        <w:tc>
+          <w:tcPr>
+            <w:tcW w:type="dxa" w:w="3213"/>
+            <w:tcBorders>
+              <w:top w:val="single" w:sz="4" w:color="BFBFBF"/>
+              <w:left w:val="single" w:sz="4" w:color="BFBFBF"/>
+              <w:bottom w:val="single" w:sz="4" w:color="BFBFBF"/>
+              <w:right w:val="single" w:sz="4" w:color="BFBFBF"/>
+              <w:insideH w:val="single" w:sz="4" w:color="BFBFBF"/>
+              <w:insideV w:val="single" w:sz="4" w:color="BFBFBF"/>
+            </w:tcBorders>
+          </w:tcPr>
+          <w:p>
+            <w:r/>
+            <w:r>
+              <w:t>chamfer</w:t>
+            </w:r>
+          </w:p>
+        </w:tc>
+        <w:tc>
+          <w:tcPr>
+            <w:tcW w:type="dxa" w:w="3213"/>
+            <w:tcBorders>
+              <w:top w:val="single" w:sz="4" w:color="BFBFBF"/>
+              <w:left w:val="single" w:sz="4" w:color="BFBFBF"/>
+              <w:bottom w:val="single" w:sz="4" w:color="BFBFBF"/>
+              <w:right w:val="single" w:sz="4" w:color="BFBFBF"/>
+              <w:insideH w:val="single" w:sz="4" w:color="BFBFBF"/>
+              <w:insideV w:val="single" w:sz="4" w:color="BFBFBF"/>
+            </w:tcBorders>
+          </w:tcPr>
+          <w:p>
+            <w:r/>
+            <w:r>
+              <w:t>+32% 退化</w:t>
+            </w:r>
+          </w:p>
+        </w:tc>
+        <w:tc>
+          <w:tcPr>
+            <w:tcW w:type="dxa" w:w="3213"/>
+            <w:tcBorders>
+              <w:top w:val="single" w:sz="4" w:color="BFBFBF"/>
+              <w:left w:val="single" w:sz="4" w:color="BFBFBF"/>
+              <w:bottom w:val="single" w:sz="4" w:color="BFBFBF"/>
+              <w:right w:val="single" w:sz="4" w:color="BFBFBF"/>
+              <w:insideH w:val="single" w:sz="4" w:color="BFBFBF"/>
+              <w:insideV w:val="single" w:sz="4" w:color="BFBFBF"/>
+            </w:tcBorders>
+          </w:tcPr>
+          <w:p>
+            <w:r/>
+            <w:r>
+              <w:t>E1→E2 0.04% 微小</w:t>
+            </w:r>
+          </w:p>
+        </w:tc>
+      </w:tr>
+      <w:tr>
+        <w:tc>
+          <w:tcPr>
+            <w:tcW w:type="dxa" w:w="3213"/>
+            <w:tcBorders>
+              <w:top w:val="single" w:sz="4" w:color="BFBFBF"/>
+              <w:left w:val="single" w:sz="4" w:color="BFBFBF"/>
+              <w:bottom w:val="single" w:sz="4" w:color="BFBFBF"/>
+              <w:right w:val="single" w:sz="4" w:color="BFBFBF"/>
+              <w:insideH w:val="single" w:sz="4" w:color="BFBFBF"/>
+              <w:insideV w:val="single" w:sz="4" w:color="BFBFBF"/>
+            </w:tcBorders>
+          </w:tcPr>
+          <w:p>
+            <w:r/>
+            <w:r>
+              <w:t>mean_normal_dev</w:t>
+            </w:r>
+          </w:p>
+        </w:tc>
+        <w:tc>
+          <w:tcPr>
+            <w:tcW w:type="dxa" w:w="3213"/>
+            <w:tcBorders>
+              <w:top w:val="single" w:sz="4" w:color="BFBFBF"/>
+              <w:left w:val="single" w:sz="4" w:color="BFBFBF"/>
+              <w:bottom w:val="single" w:sz="4" w:color="BFBFBF"/>
+              <w:right w:val="single" w:sz="4" w:color="BFBFBF"/>
+              <w:insideH w:val="single" w:sz="4" w:color="BFBFBF"/>
+              <w:insideV w:val="single" w:sz="4" w:color="BFBFBF"/>
+            </w:tcBorders>
+          </w:tcPr>
+          <w:p>
+            <w:r/>
+            <w:r>
+              <w:t>+0.74° 退化</w:t>
+            </w:r>
+          </w:p>
+        </w:tc>
+        <w:tc>
+          <w:tcPr>
+            <w:tcW w:type="dxa" w:w="3213"/>
+            <w:tcBorders>
+              <w:top w:val="single" w:sz="4" w:color="BFBFBF"/>
+              <w:left w:val="single" w:sz="4" w:color="BFBFBF"/>
+              <w:bottom w:val="single" w:sz="4" w:color="BFBFBF"/>
+              <w:right w:val="single" w:sz="4" w:color="BFBFBF"/>
+              <w:insideH w:val="single" w:sz="4" w:color="BFBFBF"/>
+              <w:insideV w:val="single" w:sz="4" w:color="BFBFBF"/>
+            </w:tcBorders>
+          </w:tcPr>
+          <w:p>
+            <w:r/>
+            <w:r>
+              <w:rPr>
+                <w:b/>
+              </w:rPr>
+              <w:t>更統一</w:t>
+            </w:r>
+            <w:r>
+              <w:t>（-2.94° vs §6.8.3 tier1）</w:t>
+            </w:r>
+          </w:p>
+        </w:tc>
+      </w:tr>
+      <w:tr>
+        <w:tc>
+          <w:tcPr>
+            <w:tcW w:type="dxa" w:w="3213"/>
+            <w:tcBorders>
+              <w:top w:val="single" w:sz="4" w:color="BFBFBF"/>
+              <w:left w:val="single" w:sz="4" w:color="BFBFBF"/>
+              <w:bottom w:val="single" w:sz="4" w:color="BFBFBF"/>
+              <w:right w:val="single" w:sz="4" w:color="BFBFBF"/>
+              <w:insideH w:val="single" w:sz="4" w:color="BFBFBF"/>
+              <w:insideV w:val="single" w:sz="4" w:color="BFBFBF"/>
+            </w:tcBorders>
+          </w:tcPr>
+          <w:p>
+            <w:r/>
+            <w:r>
+              <w:t>hausdorff r→o</w:t>
+            </w:r>
+          </w:p>
+        </w:tc>
+        <w:tc>
+          <w:tcPr>
+            <w:tcW w:type="dxa" w:w="3213"/>
+            <w:tcBorders>
+              <w:top w:val="single" w:sz="4" w:color="BFBFBF"/>
+              <w:left w:val="single" w:sz="4" w:color="BFBFBF"/>
+              <w:bottom w:val="single" w:sz="4" w:color="BFBFBF"/>
+              <w:right w:val="single" w:sz="4" w:color="BFBFBF"/>
+              <w:insideH w:val="single" w:sz="4" w:color="BFBFBF"/>
+              <w:insideV w:val="single" w:sz="4" w:color="BFBFBF"/>
+            </w:tcBorders>
+          </w:tcPr>
+          <w:p>
+            <w:r/>
+            <w:r>
+              <w:t>+170% 退化</w:t>
+            </w:r>
+          </w:p>
+        </w:tc>
+        <w:tc>
+          <w:tcPr>
+            <w:tcW w:type="dxa" w:w="3213"/>
+            <w:tcBorders>
+              <w:top w:val="single" w:sz="4" w:color="BFBFBF"/>
+              <w:left w:val="single" w:sz="4" w:color="BFBFBF"/>
+              <w:bottom w:val="single" w:sz="4" w:color="BFBFBF"/>
+              <w:right w:val="single" w:sz="4" w:color="BFBFBF"/>
+              <w:insideH w:val="single" w:sz="4" w:color="BFBFBF"/>
+              <w:insideV w:val="single" w:sz="4" w:color="BFBFBF"/>
+            </w:tcBorders>
+          </w:tcPr>
+          <w:p>
+            <w:r/>
+            <w:r>
+              <w:rPr>
+                <w:b/>
+              </w:rPr>
+              <w:t>0.000000</w:t>
+            </w:r>
+          </w:p>
+        </w:tc>
+      </w:tr>
+      <w:tr>
+        <w:tc>
+          <w:tcPr>
+            <w:tcW w:type="dxa" w:w="3213"/>
+            <w:tcBorders>
+              <w:top w:val="single" w:sz="4" w:color="BFBFBF"/>
+              <w:left w:val="single" w:sz="4" w:color="BFBFBF"/>
+              <w:bottom w:val="single" w:sz="4" w:color="BFBFBF"/>
+              <w:right w:val="single" w:sz="4" w:color="BFBFBF"/>
+              <w:insideH w:val="single" w:sz="4" w:color="BFBFBF"/>
+              <w:insideV w:val="single" w:sz="4" w:color="BFBFBF"/>
+            </w:tcBorders>
+          </w:tcPr>
+          <w:p>
+            <w:r/>
+            <w:r>
+              <w:t>結局</w:t>
+            </w:r>
+          </w:p>
+        </w:tc>
+        <w:tc>
+          <w:tcPr>
+            <w:tcW w:type="dxa" w:w="3213"/>
+            <w:tcBorders>
+              <w:top w:val="single" w:sz="4" w:color="BFBFBF"/>
+              <w:left w:val="single" w:sz="4" w:color="BFBFBF"/>
+              <w:bottom w:val="single" w:sz="4" w:color="BFBFBF"/>
+              <w:right w:val="single" w:sz="4" w:color="BFBFBF"/>
+              <w:insideH w:val="single" w:sz="4" w:color="BFBFBF"/>
+              <w:insideV w:val="single" w:sz="4" w:color="BFBFBF"/>
+            </w:tcBorders>
+          </w:tcPr>
+          <w:p>
+            <w:r/>
+            <w:r>
+              <w:t>留 flag、default off</w:t>
+            </w:r>
+          </w:p>
+        </w:tc>
+        <w:tc>
+          <w:tcPr>
+            <w:tcW w:type="dxa" w:w="3213"/>
+            <w:tcBorders>
+              <w:top w:val="single" w:sz="4" w:color="BFBFBF"/>
+              <w:left w:val="single" w:sz="4" w:color="BFBFBF"/>
+              <w:bottom w:val="single" w:sz="4" w:color="BFBFBF"/>
+              <w:right w:val="single" w:sz="4" w:color="BFBFBF"/>
+              <w:insideH w:val="single" w:sz="4" w:color="BFBFBF"/>
+              <w:insideV w:val="single" w:sz="4" w:color="BFBFBF"/>
+            </w:tcBorders>
+          </w:tcPr>
+          <w:p>
+            <w:r/>
+            <w:r>
+              <w:rPr>
+                <w:b/>
+              </w:rPr>
+              <w:t>進 tier1/2/3 preset default</w:t>
+            </w:r>
+            <w:r>
+              <w:t>（min=10）</w:t>
+            </w:r>
+          </w:p>
+        </w:tc>
+      </w:tr>
+    </w:tbl>
+    <w:p>
+      <w:r>
+        <w:rPr>
+          <w:b/>
+        </w:rPr>
+        <w:t>啟示</w:t>
+      </w:r>
+      <w:r>
+        <w:t>：在 production pipeline 末端做改進時，</w:t>
+      </w:r>
+      <w:r>
+        <w:rPr>
+          <w:b/>
+        </w:rPr>
+        <w:t>只刪不加</w:t>
+      </w:r>
+      <w:r>
+        <w:t>的操作風險遠低於</w:t>
+      </w:r>
+      <w:r>
+        <w:rPr>
+          <w:b/>
+        </w:rPr>
+        <w:t>動結構</w:t>
+      </w:r>
+      <w:r>
+        <w:t>的操作。post-weld 想用乘法解問題（合更多 vertex），post-cull 用減法解問題（刪更少有意義的）；後者</w:t>
+      </w:r>
+      <w:r>
+        <w:rPr>
+          <w:b/>
+        </w:rPr>
+        <w:t>結構上</w:t>
+      </w:r>
+      <w:r>
+        <w:t>保證好結果，前者要靠 tuning。下次評估新 stage 時優先想：「這是純減法還是動結構？」</w:t>
+      </w:r>
+    </w:p>
+    <w:p>
+      <w:r>
+        <w:rPr>
+          <w:b/>
+        </w:rPr>
+        <w:t>CLI 用法</w:t>
+      </w:r>
+    </w:p>
+    <w:p>
+      <w:pPr>
+        <w:spacing w:before="80" w:after="80"/>
+        <w:ind w:left="283"/>
+        <w:shd w:val="clear" w:color="auto" w:fill="F6F8FA"/>
+      </w:pPr>
+      <w:r>
+        <w:rPr>
+          <w:rFonts w:ascii="Consolas" w:hAnsi="Consolas"/>
+          <w:sz w:val="19"/>
+        </w:rPr>
+        <w:t>:: 進 tier1/2/3 preset default（min-faces=10）</w:t>
+        <w:br/>
+        <w:t>diamesh reduce input.fbx --preset tier1 -o output.fbx</w:t>
+        <w:br/>
+        <w:br/>
+        <w:t>:: 顯式覆寫 threshold（極保守，只清 1-4 face 微碎片）</w:t>
+        <w:br/>
+        <w:t>diamesh reduce input.fbx --preset tier1 --post-collapse-cull-min-faces 5 -o output.fbx</w:t>
+        <w:br/>
+        <w:br/>
+        <w:t>:: 不用 preset，全手動展開（可選擇不開 cull）</w:t>
+        <w:br/>
+        <w:t>diamesh reduce input.fbx --backend blender --ratio 0.1 ^</w:t>
+        <w:br/>
+        <w:t xml:space="preserve">  --cull-disjoint 0.025 --auto-fill-holes --fill-holes-skip-design ^</w:t>
+        <w:br/>
+        <w:t xml:space="preserve">  --bridge-loops -o output.fbx</w:t>
+        <w:br/>
+        <w:t>:: 注意：preset 的 boolean 只能 ON 不能 OFF；要關必須不用 preset</w:t>
+      </w:r>
+    </w:p>
+    <w:p>
+      <w:r>
+        <w:rPr>
+          <w:b/>
+        </w:rPr>
+        <w:t>何時調 min-faces</w:t>
+      </w:r>
+    </w:p>
+    <w:p>
+      <w:pPr>
+        <w:pStyle w:val="ListBullet"/>
+        <w:ind w:left="340"/>
+      </w:pPr>
+      <w:r>
+        <w:rPr>
+          <w:rFonts w:ascii="Consolas" w:hAnsi="Consolas"/>
+          <w:color w:val="C7254E"/>
+          <w:sz w:val="20"/>
+        </w:rPr>
+        <w:t>5</w:t>
+      </w:r>
+      <w:r>
+        <w:t xml:space="preserve"> — 極保守，只清 1-4 face 微碎片。失去太多小部件時退到這</w:t>
+      </w:r>
+    </w:p>
+    <w:p>
+      <w:pPr>
+        <w:pStyle w:val="ListBullet"/>
+        <w:ind w:left="340"/>
+      </w:pPr>
+      <w:r>
+        <w:rPr>
+          <w:b/>
+        </w:rPr>
+        <w:t>10</w:t>
+      </w:r>
+      <w:r>
+        <w:t xml:space="preserve"> — 推薦預設，10 face 以下幾乎是 collapse 副產物</w:t>
+      </w:r>
+    </w:p>
+    <w:p>
+      <w:pPr>
+        <w:pStyle w:val="ListBullet"/>
+        <w:ind w:left="340"/>
+      </w:pPr>
+      <w:r>
+        <w:rPr>
+          <w:rFonts w:ascii="Consolas" w:hAnsi="Consolas"/>
+          <w:color w:val="C7254E"/>
+          <w:sz w:val="20"/>
+        </w:rPr>
+        <w:t>15-20</w:t>
+      </w:r>
+      <w:r>
+        <w:t xml:space="preserve"> — 激進，會吃 HMI 邊框、感測器頭等；</w:t>
+      </w:r>
+      <w:r>
+        <w:rPr>
+          <w:b/>
+        </w:rPr>
+        <w:t>只有當視覺乾淨優先於零件辨識時才用</w:t>
+      </w:r>
+    </w:p>
+    <w:p>
+      <w:pPr>
+        <w:pStyle w:val="ListBullet"/>
+        <w:ind w:left="340"/>
+      </w:pPr>
+      <w:r>
+        <w:rPr>
+          <w:rFonts w:ascii="Consolas" w:hAnsi="Consolas"/>
+          <w:color w:val="C7254E"/>
+          <w:sz w:val="20"/>
+        </w:rPr>
+        <w:t>20+</w:t>
+      </w:r>
+      <w:r>
+        <w:t xml:space="preserve"> — 已超過甜蜜點，請改用 viewer 端 hide 而非 mesh 端 cull</w:t>
+      </w:r>
+    </w:p>
+    <w:p>
+      <w:pPr>
+        <w:pStyle w:val="Heading3"/>
+      </w:pPr>
+      <w:r>
+        <w:t>6.8.9 跟遊戲業 LOD 的差別</w:t>
       </w:r>
     </w:p>
     <w:p>

</xml_diff>

<commit_message>
docs(user-guide): switch to internal-distribution wording + fix PDF output path
3 USER_GUIDE.md spots had developer-facing GitHub/clone language that
internal users without GitHub access could not act on:
* §2.2 Windows binary section: "git-tracked, clone 即用" -> "向開發
  團隊索取 zip 解壓即可，FBX2glTF.exe 跟 Assimp DLL 已內含於 vendor/"
* §7.2 setup_vendor.py comment: clarify GitHub-Release fallback for
  air-gapped users -> use the team-provided complete vendor zip
* §7.3 vendor.exe rationale: "commit 進 repo (clone 即用)" ->
  "打包進 vendor/ (內網用戶解壓 zip 即用)"

The pyrender MIT attribution at line 3 stays as-is — required by
license terms.

Path fix: scripts/build_user_guide_pdf.py wrote PDF to build/ while
build_user_guide_docx.py writes to docs/, forcing a manual cp every
rebuild. PDF now writes directly to docs/USER_GUIDE.pdf alongside
.md and .docx; HTML stays in build/ as a gitignored intermediate.

* USER_GUIDE.pdf + .docx rebuilt with the new wording
</commit_message>
<xml_diff>
--- a/docs/USER_GUIDE.docx
+++ b/docs/USER_GUIDE.docx
@@ -1120,7 +1120,7 @@
         <w:t>Windows 用戶</w:t>
       </w:r>
       <w:r>
-        <w:t>：FBX2glTF.exe 跟 Assimp DLL 已經 git-tracked，clone 即用。</w:t>
+        <w:t>：向開發團隊索取 DIAMesh zip 後解壓即可，FBX2glTF.exe 跟 Assimp DLL 已內含於 vendor/。</w:t>
       </w:r>
     </w:p>
     <w:p>
@@ -15938,7 +15938,7 @@
         <w:br/>
         <w:t>pip install -e .</w:t>
         <w:br/>
-        <w:t>python scripts/setup_vendor.py    # 自動下載 platform-specific binary（仍需可連 GitHub Release）</w:t>
+        <w:t>python scripts/setup_vendor.py    # 自動下載 platform-specific binary（內網無外網訪問權限的用戶，請改用開發團隊提供的完整 vendor zip）</w:t>
         <w:br/>
         <w:t># 手動下載 Blender Portable 解壓到 vendor/blender/（看 vendor/BLENDER_SETUP.md）</w:t>
         <w:br/>
@@ -15965,7 +15965,7 @@
         <w:t>Windows .exe / .dll</w:t>
       </w:r>
       <w:r>
-        <w:t>：~16 MB 總，commit 進 repo（最常見場景，clone 即用）</w:t>
+        <w:t>：~16 MB 總，跟原始碼一起打包進 vendor/（最常見場景，內網用戶解壓 zip 即用）</w:t>
       </w:r>
     </w:p>
     <w:p>

</xml_diff>